<commit_message>
update kafkaServer url & topic
</commit_message>
<xml_diff>
--- a/2.Document/2.TechDoc/Tài liệu mô tả cấu trúc.docx
+++ b/2.Document/2.TechDoc/Tài liệu mô tả cấu trúc.docx
@@ -1,6 +1,6 @@
 
 <file path=word/document.xml><?xml version="1.0" encoding="utf-8"?>
-<w:document xmlns:wpc="http://schemas.microsoft.com/office/word/2010/wordprocessingCanvas" xmlns:cx="http://schemas.microsoft.com/office/drawing/2014/chartex" xmlns:cx1="http://schemas.microsoft.com/office/drawing/2015/9/8/chartex" xmlns:cx2="http://schemas.microsoft.com/office/drawing/2015/10/21/chartex" xmlns:cx3="http://schemas.microsoft.com/office/drawing/2016/5/9/chartex" xmlns:cx4="http://schemas.microsoft.com/office/drawing/2016/5/10/chartex" xmlns:cx5="http://schemas.microsoft.com/office/drawing/2016/5/11/chartex" xmlns:cx6="http://schemas.microsoft.com/office/drawing/2016/5/12/chartex" xmlns:cx7="http://schemas.microsoft.com/office/drawing/2016/5/13/chartex" xmlns:cx8="http://schemas.microsoft.com/office/drawing/2016/5/14/chartex" xmlns:mc="http://schemas.openxmlformats.org/markup-compatibility/2006" xmlns:aink="http://schemas.microsoft.com/office/drawing/2016/ink" xmlns:am3d="http://schemas.microsoft.com/office/drawing/2017/model3d" xmlns:o="urn:schemas-microsoft-com:office:office" xmlns:r="http://schemas.openxmlformats.org/officeDocument/2006/relationships" xmlns:m="http://schemas.openxmlformats.org/officeDocument/2006/math" xmlns:v="urn:schemas-microsoft-com:vml" xmlns:wp14="http://schemas.microsoft.com/office/word/2010/wordprocessingDrawing" xmlns:wp="http://schemas.openxmlformats.org/drawingml/2006/wordprocessingDrawing" xmlns:w10="urn:schemas-microsoft-com:office:word" xmlns:w="http://schemas.openxmlformats.org/wordprocessingml/2006/main" xmlns:w14="http://schemas.microsoft.com/office/word/2010/wordml" xmlns:w15="http://schemas.microsoft.com/office/word/2012/wordml" xmlns:w16cex="http://schemas.microsoft.com/office/word/2018/wordml/cex" xmlns:w16cid="http://schemas.microsoft.com/office/word/2016/wordml/cid" xmlns:w16="http://schemas.microsoft.com/office/word/2018/wordml" xmlns:w16se="http://schemas.microsoft.com/office/word/2015/wordml/symex" xmlns:wpg="http://schemas.microsoft.com/office/word/2010/wordprocessingGroup" xmlns:wpi="http://schemas.microsoft.com/office/word/2010/wordprocessingInk" xmlns:wne="http://schemas.microsoft.com/office/word/2006/wordml" xmlns:wps="http://schemas.microsoft.com/office/word/2010/wordprocessingShape" mc:Ignorable="w14 w15 w16se w16cid w16 w16cex wp14">
+<w:document xmlns:wpc="http://schemas.microsoft.com/office/word/2010/wordprocessingCanvas" xmlns:cx="http://schemas.microsoft.com/office/drawing/2014/chartex" xmlns:cx1="http://schemas.microsoft.com/office/drawing/2015/9/8/chartex" xmlns:cx2="http://schemas.microsoft.com/office/drawing/2015/10/21/chartex" xmlns:cx3="http://schemas.microsoft.com/office/drawing/2016/5/9/chartex" xmlns:cx4="http://schemas.microsoft.com/office/drawing/2016/5/10/chartex" xmlns:cx5="http://schemas.microsoft.com/office/drawing/2016/5/11/chartex" xmlns:cx6="http://schemas.microsoft.com/office/drawing/2016/5/12/chartex" xmlns:cx7="http://schemas.microsoft.com/office/drawing/2016/5/13/chartex" xmlns:cx8="http://schemas.microsoft.com/office/drawing/2016/5/14/chartex" xmlns:mc="http://schemas.openxmlformats.org/markup-compatibility/2006" xmlns:aink="http://schemas.microsoft.com/office/drawing/2016/ink" xmlns:am3d="http://schemas.microsoft.com/office/drawing/2017/model3d" xmlns:o="urn:schemas-microsoft-com:office:office" xmlns:oel="http://schemas.microsoft.com/office/2019/extlst" xmlns:r="http://schemas.openxmlformats.org/officeDocument/2006/relationships" xmlns:m="http://schemas.openxmlformats.org/officeDocument/2006/math" xmlns:v="urn:schemas-microsoft-com:vml" xmlns:wp14="http://schemas.microsoft.com/office/word/2010/wordprocessingDrawing" xmlns:wp="http://schemas.openxmlformats.org/drawingml/2006/wordprocessingDrawing" xmlns:w10="urn:schemas-microsoft-com:office:word" xmlns:w="http://schemas.openxmlformats.org/wordprocessingml/2006/main" xmlns:w14="http://schemas.microsoft.com/office/word/2010/wordml" xmlns:w15="http://schemas.microsoft.com/office/word/2012/wordml" xmlns:w16cex="http://schemas.microsoft.com/office/word/2018/wordml/cex" xmlns:w16cid="http://schemas.microsoft.com/office/word/2016/wordml/cid" xmlns:w16="http://schemas.microsoft.com/office/word/2018/wordml" xmlns:w16sdtdh="http://schemas.microsoft.com/office/word/2020/wordml/sdtdatahash" xmlns:w16se="http://schemas.microsoft.com/office/word/2015/wordml/symex" xmlns:wpg="http://schemas.microsoft.com/office/word/2010/wordprocessingGroup" xmlns:wpi="http://schemas.microsoft.com/office/word/2010/wordprocessingInk" xmlns:wne="http://schemas.microsoft.com/office/word/2006/wordml" xmlns:wps="http://schemas.microsoft.com/office/word/2010/wordprocessingShape" mc:Ignorable="w14 w15 w16se w16cid w16 w16cex w16sdtdh wp14">
   <w:body>
     <w:p>
       <w:pPr>
@@ -134,7 +134,71 @@
           <w:kern w:val="0"/>
           <w:szCs w:val="28"/>
         </w:rPr>
-        <w:t>kafkaServer = '173.249.14.91:29092';</w:t>
+        <w:t>kafkaServer = '1</w:t>
+      </w:r>
+      <w:r>
+        <w:rPr>
+          <w:rFonts w:eastAsia="Times New Roman"/>
+          <w:kern w:val="0"/>
+          <w:szCs w:val="28"/>
+        </w:rPr>
+        <w:t>94</w:t>
+      </w:r>
+      <w:r>
+        <w:rPr>
+          <w:rFonts w:eastAsia="Times New Roman"/>
+          <w:kern w:val="0"/>
+          <w:szCs w:val="28"/>
+        </w:rPr>
+        <w:t>.2</w:t>
+      </w:r>
+      <w:r>
+        <w:rPr>
+          <w:rFonts w:eastAsia="Times New Roman"/>
+          <w:kern w:val="0"/>
+          <w:szCs w:val="28"/>
+        </w:rPr>
+        <w:t>33</w:t>
+      </w:r>
+      <w:r>
+        <w:rPr>
+          <w:rFonts w:eastAsia="Times New Roman"/>
+          <w:kern w:val="0"/>
+          <w:szCs w:val="28"/>
+        </w:rPr>
+        <w:t>.</w:t>
+      </w:r>
+      <w:r>
+        <w:rPr>
+          <w:rFonts w:eastAsia="Times New Roman"/>
+          <w:kern w:val="0"/>
+          <w:szCs w:val="28"/>
+        </w:rPr>
+        <w:t>92</w:t>
+      </w:r>
+      <w:r>
+        <w:rPr>
+          <w:rFonts w:eastAsia="Times New Roman"/>
+          <w:kern w:val="0"/>
+          <w:szCs w:val="28"/>
+        </w:rPr>
+        <w:t>.1</w:t>
+      </w:r>
+      <w:r>
+        <w:rPr>
+          <w:rFonts w:eastAsia="Times New Roman"/>
+          <w:kern w:val="0"/>
+          <w:szCs w:val="28"/>
+        </w:rPr>
+        <w:t>93</w:t>
+      </w:r>
+      <w:r>
+        <w:rPr>
+          <w:rFonts w:eastAsia="Times New Roman"/>
+          <w:kern w:val="0"/>
+          <w:szCs w:val="28"/>
+        </w:rPr>
+        <w:t>:9092';</w:t>
       </w:r>
       <w:r>
         <w:rPr>
@@ -465,8 +529,180 @@
         <w:rPr>
           <w:b/>
           <w:bCs/>
-        </w:rPr>
-        <w:t>05 05 01 00 00 00 00 00 01 01 00 0F 00 01 00 00 13</w:t>
+          <w:u w:val="single"/>
+        </w:rPr>
+        <w:t>05 05</w:t>
+      </w:r>
+      <w:r>
+        <w:rPr>
+          <w:b/>
+          <w:bCs/>
+        </w:rPr>
+        <w:t xml:space="preserve"> </w:t>
+      </w:r>
+      <w:r>
+        <w:rPr>
+          <w:b/>
+          <w:bCs/>
+          <w:u w:val="single"/>
+        </w:rPr>
+        <w:t>01</w:t>
+      </w:r>
+      <w:r>
+        <w:rPr>
+          <w:b/>
+          <w:bCs/>
+        </w:rPr>
+        <w:t xml:space="preserve"> </w:t>
+      </w:r>
+      <w:r>
+        <w:rPr>
+          <w:b/>
+          <w:bCs/>
+          <w:u w:val="single"/>
+        </w:rPr>
+        <w:t>00 00</w:t>
+      </w:r>
+      <w:r>
+        <w:rPr>
+          <w:b/>
+          <w:bCs/>
+        </w:rPr>
+        <w:t xml:space="preserve"> </w:t>
+      </w:r>
+      <w:r>
+        <w:rPr>
+          <w:b/>
+          <w:bCs/>
+          <w:u w:val="single"/>
+        </w:rPr>
+        <w:t>00 00</w:t>
+      </w:r>
+      <w:r>
+        <w:rPr>
+          <w:b/>
+          <w:bCs/>
+        </w:rPr>
+        <w:t xml:space="preserve"> </w:t>
+      </w:r>
+      <w:r>
+        <w:rPr>
+          <w:b/>
+          <w:bCs/>
+          <w:u w:val="single"/>
+        </w:rPr>
+        <w:t>00 01</w:t>
+      </w:r>
+      <w:r>
+        <w:rPr>
+          <w:b/>
+          <w:bCs/>
+        </w:rPr>
+        <w:t xml:space="preserve"> </w:t>
+      </w:r>
+      <w:r>
+        <w:rPr>
+          <w:b/>
+          <w:bCs/>
+          <w:u w:val="single"/>
+        </w:rPr>
+        <w:t>01</w:t>
+      </w:r>
+      <w:r>
+        <w:rPr>
+          <w:b/>
+          <w:bCs/>
+        </w:rPr>
+        <w:t xml:space="preserve"> </w:t>
+      </w:r>
+      <w:r>
+        <w:rPr>
+          <w:b/>
+          <w:bCs/>
+          <w:u w:val="single"/>
+        </w:rPr>
+        <w:t>00 0F</w:t>
+      </w:r>
+      <w:r>
+        <w:rPr>
+          <w:b/>
+          <w:bCs/>
+        </w:rPr>
+        <w:t xml:space="preserve"> </w:t>
+      </w:r>
+      <w:r>
+        <w:rPr>
+          <w:b/>
+          <w:bCs/>
+          <w:u w:val="single"/>
+        </w:rPr>
+        <w:t>00 01</w:t>
+      </w:r>
+      <w:r>
+        <w:rPr>
+          <w:b/>
+          <w:bCs/>
+        </w:rPr>
+        <w:t xml:space="preserve"> </w:t>
+      </w:r>
+      <w:r>
+        <w:rPr>
+          <w:b/>
+          <w:bCs/>
+          <w:u w:val="single"/>
+        </w:rPr>
+        <w:t>00 00</w:t>
+      </w:r>
+      <w:r>
+        <w:rPr>
+          <w:b/>
+          <w:bCs/>
+        </w:rPr>
+        <w:t xml:space="preserve"> </w:t>
+      </w:r>
+      <w:r>
+        <w:rPr>
+          <w:b/>
+          <w:bCs/>
+          <w:u w:val="single"/>
+        </w:rPr>
+        <w:t>13</w:t>
+      </w:r>
+    </w:p>
+    <w:p>
+      <w:pPr>
+        <w:pStyle w:val="ListParagraph"/>
+        <w:numPr>
+          <w:ilvl w:val="0"/>
+          <w:numId w:val="9"/>
+        </w:numPr>
+        <w:rPr>
+          <w:b/>
+          <w:bCs/>
+        </w:rPr>
+      </w:pPr>
+      <w:r>
+        <w:rPr>
+          <w:b/>
+          <w:bCs/>
+        </w:rPr>
+        <w:t xml:space="preserve">  (2)</w:t>
+      </w:r>
+      <w:proofErr w:type="gramStart"/>
+      <w:r>
+        <w:rPr>
+          <w:b/>
+          <w:bCs/>
+        </w:rPr>
+        <w:t xml:space="preserve">   (</w:t>
+      </w:r>
+      <w:proofErr w:type="gramEnd"/>
+      <w:r>
+        <w:rPr>
+          <w:b/>
+          <w:bCs/>
+        </w:rPr>
+        <w:t>3)     (4)     (5)    (6)   (7)     (8)      (9)  (10)</w:t>
       </w:r>
     </w:p>
     <w:p>
@@ -493,107 +729,153 @@
     <w:p>
       <w:pPr>
         <w:pStyle w:val="ListParagraph"/>
+        <w:numPr>
+          <w:ilvl w:val="0"/>
+          <w:numId w:val="10"/>
+        </w:numPr>
+      </w:pPr>
+      <w:r>
+        <w:t xml:space="preserve">: </w:t>
+      </w:r>
+      <w:r>
+        <w:t>05 05: address (03 03, 04 04)</w:t>
+      </w:r>
+    </w:p>
+    <w:p>
+      <w:pPr>
+        <w:pStyle w:val="ListParagraph"/>
+        <w:numPr>
+          <w:ilvl w:val="0"/>
+          <w:numId w:val="10"/>
+        </w:numPr>
+      </w:pPr>
+      <w:r>
+        <w:t xml:space="preserve">: </w:t>
+      </w:r>
+      <w:r>
+        <w:t>01: islamp (có bo lamp hay không)</w:t>
+      </w:r>
+    </w:p>
+    <w:p>
+      <w:pPr>
+        <w:pStyle w:val="ListParagraph"/>
+        <w:numPr>
+          <w:ilvl w:val="0"/>
+          <w:numId w:val="10"/>
+        </w:numPr>
+      </w:pPr>
+      <w:r>
+        <w:t xml:space="preserve">: </w:t>
+      </w:r>
+      <w:r>
+        <w:t>00 00: red (dừng) // màu đèn</w:t>
+      </w:r>
+    </w:p>
+    <w:p>
+      <w:pPr>
+        <w:pStyle w:val="ListParagraph"/>
+        <w:numPr>
+          <w:ilvl w:val="0"/>
+          <w:numId w:val="10"/>
+        </w:numPr>
+      </w:pPr>
+      <w:r>
+        <w:lastRenderedPageBreak/>
+        <w:t xml:space="preserve">: </w:t>
+      </w:r>
+      <w:r>
+        <w:t>00 00: yellow (nghỉ) // màu đèn</w:t>
+      </w:r>
+    </w:p>
+    <w:p>
+      <w:pPr>
+        <w:pStyle w:val="ListParagraph"/>
+        <w:numPr>
+          <w:ilvl w:val="0"/>
+          <w:numId w:val="10"/>
+        </w:numPr>
+      </w:pPr>
+      <w:r>
+        <w:t xml:space="preserve">: </w:t>
+      </w:r>
+      <w:r>
+        <w:t>00 01: green (chạy) // màu đèn</w:t>
+      </w:r>
+    </w:p>
+    <w:p>
+      <w:pPr>
+        <w:pStyle w:val="ListParagraph"/>
+        <w:numPr>
+          <w:ilvl w:val="0"/>
+          <w:numId w:val="10"/>
+        </w:numPr>
+      </w:pPr>
+      <w:r>
+        <w:t xml:space="preserve">: </w:t>
+      </w:r>
+      <w:r>
+        <w:t>01: iscount (có bo đếm hay không)</w:t>
+      </w:r>
+    </w:p>
+    <w:p>
+      <w:pPr>
+        <w:pStyle w:val="ListParagraph"/>
+        <w:numPr>
+          <w:ilvl w:val="0"/>
+          <w:numId w:val="10"/>
+        </w:numPr>
+      </w:pPr>
+      <w:r>
+        <w:t xml:space="preserve">: </w:t>
+      </w:r>
+      <w:r>
+        <w:t>00 0F: số lượng sản phẩm (hex) (max: 65535) // dãy bit dưới dạng hex</w:t>
+      </w:r>
+    </w:p>
+    <w:p>
+      <w:pPr>
+        <w:pStyle w:val="ListParagraph"/>
+        <w:numPr>
+          <w:ilvl w:val="0"/>
+          <w:numId w:val="10"/>
+        </w:numPr>
+      </w:pPr>
+      <w:r>
+        <w:t xml:space="preserve">: </w:t>
+      </w:r>
+      <w:r>
+        <w:t>00 01: nút start/stop</w:t>
+      </w:r>
+    </w:p>
+    <w:p>
+      <w:pPr>
+        <w:pStyle w:val="ListParagraph"/>
+        <w:numPr>
+          <w:ilvl w:val="0"/>
+          <w:numId w:val="10"/>
+        </w:numPr>
+      </w:pPr>
+      <w:r>
+        <w:t xml:space="preserve">: </w:t>
+      </w:r>
+      <w:r>
+        <w:t>00 00: bỏ</w:t>
+      </w:r>
+    </w:p>
+    <w:p>
+      <w:pPr>
         <w:ind w:left="1440"/>
       </w:pPr>
-      <w:r>
-        <w:t>05 05: address (03 03, 04 04)</w:t>
-      </w:r>
-    </w:p>
-    <w:p>
-      <w:pPr>
-        <w:pStyle w:val="ListParagraph"/>
-        <w:ind w:left="1440"/>
-      </w:pPr>
-      <w:r>
-        <w:t>01: islamp (có bo lamp hay không)</w:t>
-      </w:r>
-    </w:p>
-    <w:p>
-      <w:pPr>
-        <w:pStyle w:val="ListParagraph"/>
-        <w:ind w:left="1440"/>
-      </w:pPr>
-      <w:r>
-        <w:t>00 00: red (dừng)</w:t>
-      </w:r>
-      <w:r>
-        <w:t xml:space="preserve"> // màu đèn</w:t>
-      </w:r>
-    </w:p>
-    <w:p>
-      <w:pPr>
-        <w:pStyle w:val="ListParagraph"/>
-        <w:ind w:left="1440"/>
-      </w:pPr>
-      <w:r>
-        <w:t>00 00: yellow (nghỉ)</w:t>
-      </w:r>
-      <w:r>
-        <w:t xml:space="preserve"> // màu đèn</w:t>
-      </w:r>
-    </w:p>
-    <w:p>
-      <w:pPr>
-        <w:pStyle w:val="ListParagraph"/>
-        <w:ind w:left="1440"/>
-      </w:pPr>
-      <w:r>
-        <w:lastRenderedPageBreak/>
-        <w:t>00 01: green (chạy)</w:t>
-      </w:r>
-      <w:r>
-        <w:t xml:space="preserve"> // màu đèn</w:t>
-      </w:r>
-    </w:p>
-    <w:p>
-      <w:pPr>
-        <w:pStyle w:val="ListParagraph"/>
-        <w:ind w:left="1440"/>
-      </w:pPr>
-      <w:r>
-        <w:t>01: iscount (có bo đếm hay không)</w:t>
-      </w:r>
-    </w:p>
-    <w:p>
-      <w:pPr>
-        <w:pStyle w:val="ListParagraph"/>
-        <w:ind w:left="1440"/>
-      </w:pPr>
-      <w:r>
-        <w:t>00 0F: số lượng sản phẩm (hex) (max: 65535)</w:t>
-      </w:r>
-      <w:r>
-        <w:t xml:space="preserve"> // dãy bit dưới dạng hex</w:t>
-      </w:r>
-    </w:p>
-    <w:p>
-      <w:pPr>
-        <w:pStyle w:val="ListParagraph"/>
-        <w:ind w:left="1440"/>
-      </w:pPr>
-      <w:r>
-        <w:t>00 01: nút start/stop</w:t>
-      </w:r>
-    </w:p>
-    <w:p>
-      <w:pPr>
-        <w:pStyle w:val="ListParagraph"/>
-        <w:ind w:left="1440"/>
-      </w:pPr>
-      <w:r>
-        <w:t>00 00: bỏ</w:t>
-      </w:r>
-    </w:p>
-    <w:p>
-      <w:pPr>
-        <w:pStyle w:val="ListParagraph"/>
-        <w:ind w:left="1440"/>
-      </w:pPr>
-      <w:r>
-        <w:t>13: sum</w:t>
-      </w:r>
-      <w:r>
-        <w:t xml:space="preserve"> // check xem data có phải data rác hay khôn</w:t>
+      <w:proofErr w:type="gramStart"/>
+      <w:r>
+        <w:t>(10) :</w:t>
+      </w:r>
+      <w:proofErr w:type="gramEnd"/>
+      <w:r>
+        <w:t xml:space="preserve"> </w:t>
+      </w:r>
+      <w:r>
+        <w:t>13: sum // check xem data có phải data rác hay khôn</w:t>
       </w:r>
       <w:r>
         <w:t>g</w:t>
@@ -636,16 +918,16 @@
         <mc:AlternateContent>
           <mc:Choice Requires="wps">
             <w:drawing>
-              <wp:anchor distT="0" distB="0" distL="114300" distR="114300" simplePos="0" relativeHeight="251659264" behindDoc="0" locked="0" layoutInCell="1" allowOverlap="1" wp14:anchorId="4211C31C" wp14:editId="7D8EA434">
+              <wp:anchor distT="0" distB="0" distL="114300" distR="114300" simplePos="0" relativeHeight="251659264" behindDoc="0" locked="0" layoutInCell="1" allowOverlap="1" wp14:anchorId="4211C31C" wp14:editId="0F3736C6">
                 <wp:simplePos x="0" y="0"/>
                 <wp:positionH relativeFrom="column">
-                  <wp:posOffset>371475</wp:posOffset>
+                  <wp:posOffset>370936</wp:posOffset>
                 </wp:positionH>
                 <wp:positionV relativeFrom="paragraph">
-                  <wp:posOffset>569595</wp:posOffset>
+                  <wp:posOffset>569451</wp:posOffset>
                 </wp:positionV>
-                <wp:extent cx="4257675" cy="4219575"/>
-                <wp:effectExtent l="0" t="0" r="28575" b="28575"/>
+                <wp:extent cx="4257675" cy="4873925"/>
+                <wp:effectExtent l="0" t="0" r="28575" b="22225"/>
                 <wp:wrapNone/>
                 <wp:docPr id="1" name="Rectangle 1"/>
                 <wp:cNvGraphicFramePr/>
@@ -656,7 +938,7 @@
                       <wps:spPr>
                         <a:xfrm>
                           <a:off x="0" y="0"/>
-                          <a:ext cx="4257675" cy="4219575"/>
+                          <a:ext cx="4257675" cy="4873925"/>
                         </a:xfrm>
                         <a:prstGeom prst="rect">
                           <a:avLst/>
@@ -701,7 +983,7 @@
           </mc:Choice>
           <mc:Fallback>
             <w:pict>
-              <v:rect w14:anchorId="4BFFAD2C" id="Rectangle 1" o:spid="_x0000_s1026" style="position:absolute;margin-left:29.25pt;margin-top:44.85pt;width:335.25pt;height:332.25pt;z-index:251659264;visibility:visible;mso-wrap-style:square;mso-height-percent:0;mso-wrap-distance-left:9pt;mso-wrap-distance-top:0;mso-wrap-distance-right:9pt;mso-wrap-distance-bottom:0;mso-position-horizontal:absolute;mso-position-horizontal-relative:text;mso-position-vertical:absolute;mso-position-vertical-relative:text;mso-height-percent:0;mso-height-relative:margin;v-text-anchor:middle" o:gfxdata="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" filled="f" strokecolor="black [3213]" strokeweight="1pt"/>
+              <v:rect w14:anchorId="7B811B7D" id="Rectangle 1" o:spid="_x0000_s1026" style="position:absolute;margin-left:29.2pt;margin-top:44.85pt;width:335.25pt;height:383.75pt;z-index:251659264;visibility:visible;mso-wrap-style:square;mso-height-percent:0;mso-wrap-distance-left:9pt;mso-wrap-distance-top:0;mso-wrap-distance-right:9pt;mso-wrap-distance-bottom:0;mso-position-horizontal:absolute;mso-position-horizontal-relative:text;mso-position-vertical:absolute;mso-position-vertical-relative:text;mso-height-percent:0;mso-height-relative:margin;v-text-anchor:middle" o:gfxdata="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" filled="f" strokecolor="black [3213]" strokeweight="1pt"/>
             </w:pict>
           </mc:Fallback>
         </mc:AlternateContent>
@@ -1194,27 +1476,7 @@
           <w:kern w:val="0"/>
           <w:szCs w:val="28"/>
         </w:rPr>
-        <w:t>dữ liệu được gửi đi thông qua kafka (</w:t>
-      </w:r>
-      <w:r>
-        <w:rPr>
-          <w:rFonts w:eastAsia="Times New Roman"/>
-          <w:i/>
-          <w:iCs/>
-          <w:kern w:val="0"/>
-          <w:szCs w:val="28"/>
-        </w:rPr>
-        <w:t>count</w:t>
-      </w:r>
-      <w:r>
-        <w:rPr>
-          <w:rFonts w:eastAsia="Times New Roman"/>
-          <w:i/>
-          <w:iCs/>
-          <w:kern w:val="0"/>
-          <w:szCs w:val="28"/>
-        </w:rPr>
-        <w:t>)</w:t>
+        <w:t>dữ liệu được gửi đi thông qua kafka (count)</w:t>
       </w:r>
     </w:p>
     <w:p>
@@ -1278,7 +1540,7 @@
     <w:p>
       <w:pPr>
         <w:spacing w:line="285" w:lineRule="atLeast"/>
-        <w:ind w:left="720"/>
+        <w:ind w:left="720" w:firstLine="360"/>
         <w:jc w:val="left"/>
         <w:rPr>
           <w:rFonts w:eastAsia="Times New Roman"/>
@@ -1292,7 +1554,58 @@
           <w:kern w:val="0"/>
           <w:szCs w:val="28"/>
         </w:rPr>
-        <w:t>  },</w:t>
+        <w:t>setpreIndexs: true</w:t>
+      </w:r>
+    </w:p>
+    <w:p>
+      <w:pPr>
+        <w:spacing w:line="285" w:lineRule="atLeast"/>
+        <w:ind w:left="720" w:firstLine="360"/>
+        <w:jc w:val="left"/>
+        <w:rPr>
+          <w:rFonts w:eastAsia="Times New Roman"/>
+          <w:kern w:val="0"/>
+          <w:szCs w:val="28"/>
+        </w:rPr>
+      </w:pPr>
+      <w:r>
+        <w:rPr>
+          <w:rFonts w:eastAsia="Times New Roman"/>
+          <w:kern w:val="0"/>
+          <w:szCs w:val="28"/>
+        </w:rPr>
+        <w:tab/>
+        <w:t xml:space="preserve">// </w:t>
+      </w:r>
+      <w:r>
+        <w:rPr>
+          <w:rFonts w:eastAsia="Times New Roman"/>
+          <w:i/>
+          <w:iCs/>
+          <w:kern w:val="0"/>
+          <w:szCs w:val="28"/>
+        </w:rPr>
+        <w:t>có cần thiết phải thiết lập preIndexs không</w:t>
+      </w:r>
+    </w:p>
+    <w:p>
+      <w:pPr>
+        <w:spacing w:line="285" w:lineRule="atLeast"/>
+        <w:ind w:left="720" w:firstLine="270"/>
+        <w:jc w:val="left"/>
+        <w:rPr>
+          <w:rFonts w:eastAsia="Times New Roman"/>
+          <w:kern w:val="0"/>
+          <w:szCs w:val="28"/>
+        </w:rPr>
+      </w:pPr>
+      <w:r>
+        <w:rPr>
+          <w:rFonts w:eastAsia="Times New Roman"/>
+          <w:kern w:val="0"/>
+          <w:szCs w:val="28"/>
+        </w:rPr>
+        <w:t>},</w:t>
       </w:r>
     </w:p>
     <w:p>
@@ -1338,30 +1651,6 @@
           <w:szCs w:val="28"/>
         </w:rPr>
       </w:pPr>
-      <w:r>
-        <w:rPr>
-          <w:rFonts w:eastAsia="Times New Roman"/>
-          <w:kern w:val="0"/>
-          <w:szCs w:val="28"/>
-        </w:rPr>
-        <w:t>Lưu ý: Các thông số trong mảng sẽ được cập nhật sau 5s/thiết bị (mỗi thiết bị được cập nhật cách nhau 5s</w:t>
-      </w:r>
-      <w:r>
-        <w:rPr>
-          <w:rFonts w:eastAsia="Times New Roman"/>
-          <w:kern w:val="0"/>
-          <w:szCs w:val="28"/>
-        </w:rPr>
-        <w:t>, hết 1 vòng sẽ quay lại</w:t>
-      </w:r>
-      <w:r>
-        <w:rPr>
-          <w:rFonts w:eastAsia="Times New Roman"/>
-          <w:kern w:val="0"/>
-          <w:szCs w:val="28"/>
-        </w:rPr>
-        <w:t>)</w:t>
-      </w:r>
     </w:p>
     <w:p>
       <w:pPr>
@@ -1380,7 +1669,86 @@
           <w:kern w:val="0"/>
           <w:szCs w:val="28"/>
         </w:rPr>
-        <w:t xml:space="preserve">Biến alive tồn tại với mục đích nếu có thiết bị chết sẽ không gửi data rác đến kafka server </w:t>
+        <w:t>Lưu ý: Các thông số trong mảng sẽ được cập nhật sau 5s/thiết bị (mỗi thiết bị được cập nhật cách nhau 5s</w:t>
+      </w:r>
+      <w:r>
+        <w:rPr>
+          <w:rFonts w:eastAsia="Times New Roman"/>
+          <w:kern w:val="0"/>
+          <w:szCs w:val="28"/>
+        </w:rPr>
+        <w:t>, hết 1 vòng sẽ quay lại</w:t>
+      </w:r>
+      <w:r>
+        <w:rPr>
+          <w:rFonts w:eastAsia="Times New Roman"/>
+          <w:kern w:val="0"/>
+          <w:szCs w:val="28"/>
+        </w:rPr>
+        <w:t>)</w:t>
+      </w:r>
+    </w:p>
+    <w:p>
+      <w:pPr>
+        <w:spacing w:line="285" w:lineRule="atLeast"/>
+        <w:ind w:left="720"/>
+        <w:jc w:val="left"/>
+        <w:rPr>
+          <w:rFonts w:eastAsia="Times New Roman"/>
+          <w:kern w:val="0"/>
+          <w:szCs w:val="28"/>
+        </w:rPr>
+      </w:pPr>
+      <w:r>
+        <w:rPr>
+          <w:rFonts w:eastAsia="Times New Roman"/>
+          <w:kern w:val="0"/>
+          <w:szCs w:val="28"/>
+        </w:rPr>
+        <w:t>Biến alive tồn tại với mục đích nếu có thiết bị chết sẽ không gửi data rác đến kafka server</w:t>
+      </w:r>
+    </w:p>
+    <w:p>
+      <w:pPr>
+        <w:spacing w:line="285" w:lineRule="atLeast"/>
+        <w:ind w:left="720"/>
+        <w:jc w:val="left"/>
+        <w:rPr>
+          <w:rFonts w:eastAsia="Times New Roman"/>
+          <w:kern w:val="0"/>
+          <w:szCs w:val="28"/>
+        </w:rPr>
+      </w:pPr>
+    </w:p>
+    <w:p>
+      <w:pPr>
+        <w:spacing w:line="285" w:lineRule="atLeast"/>
+        <w:ind w:left="720"/>
+        <w:jc w:val="left"/>
+        <w:rPr>
+          <w:rFonts w:eastAsia="Times New Roman"/>
+          <w:kern w:val="0"/>
+          <w:szCs w:val="28"/>
+        </w:rPr>
+      </w:pPr>
+      <w:r>
+        <w:rPr>
+          <w:rFonts w:eastAsia="Times New Roman"/>
+          <w:kern w:val="0"/>
+          <w:szCs w:val="28"/>
+        </w:rPr>
+        <w:t xml:space="preserve">topic: </w:t>
+      </w:r>
+      <w:r>
+        <w:t>usm_IOTRequest</w:t>
+      </w:r>
+      <w:r>
+        <w:rPr>
+          <w:rFonts w:eastAsia="Times New Roman"/>
+          <w:kern w:val="0"/>
+          <w:szCs w:val="28"/>
+        </w:rPr>
+        <w:t xml:space="preserve"> </w:t>
       </w:r>
     </w:p>
     <w:p>
@@ -1418,14 +1786,16 @@
           <w:szCs w:val="28"/>
           <w:u w:val="single"/>
         </w:rPr>
-        <w:lastRenderedPageBreak/>
-        <w:t xml:space="preserve">Bản tin Start (topic: </w:t>
-      </w:r>
-      <w:r>
-        <w:rPr>
+        <w:t>Bản tin Start (</w:t>
+      </w:r>
+      <w:r>
+        <w:rPr>
+          <w:rFonts w:eastAsia="Times New Roman"/>
+          <w:kern w:val="0"/>
+          <w:szCs w:val="28"/>
           <w:u w:val="single"/>
         </w:rPr>
-        <w:t>mes_StartIOTRequest</w:t>
+        <w:t>type: 1</w:t>
       </w:r>
       <w:r>
         <w:rPr>
@@ -1451,7 +1821,19 @@
         <w:ind w:left="1080"/>
       </w:pPr>
       <w:r>
-        <w:t>Bản tin được gửi đi mỗi khi gateway trạng thái của btn thay đổi từ off sang on (00 00 to 00 01)</w:t>
+        <w:t xml:space="preserve">Bản tin được gửi đi mỗi khi gateway trạng thái của </w:t>
+      </w:r>
+      <w:r>
+        <w:t>nút</w:t>
+      </w:r>
+      <w:r>
+        <w:t xml:space="preserve"> (8)</w:t>
+      </w:r>
+      <w:r>
+        <w:t xml:space="preserve"> thay đổi từ off sang on (00 00 to 00 01)</w:t>
+      </w:r>
+      <w:r>
+        <w:t xml:space="preserve"> </w:t>
       </w:r>
     </w:p>
     <w:p>
@@ -1495,33 +1877,24 @@
           <w:szCs w:val="28"/>
           <w:u w:val="single"/>
         </w:rPr>
-        <w:t xml:space="preserve"> (topic: </w:t>
-      </w:r>
-      <w:r>
-        <w:rPr>
+        <w:t xml:space="preserve"> (</w:t>
+      </w:r>
+      <w:r>
+        <w:rPr>
+          <w:rFonts w:eastAsia="Times New Roman"/>
+          <w:kern w:val="0"/>
+          <w:szCs w:val="28"/>
           <w:u w:val="single"/>
         </w:rPr>
-        <w:t>mes_S</w:t>
-      </w:r>
-      <w:r>
-        <w:rPr>
+        <w:t>type: 2</w:t>
+      </w:r>
+      <w:r>
+        <w:rPr>
+          <w:rFonts w:eastAsia="Times New Roman"/>
+          <w:kern w:val="0"/>
+          <w:szCs w:val="28"/>
           <w:u w:val="single"/>
         </w:rPr>
-        <w:t>top</w:t>
-      </w:r>
-      <w:r>
-        <w:rPr>
-          <w:u w:val="single"/>
-        </w:rPr>
-        <w:t>IOTRequest</w:t>
-      </w:r>
-      <w:r>
-        <w:rPr>
-          <w:rFonts w:eastAsia="Times New Roman"/>
-          <w:kern w:val="0"/>
-          <w:szCs w:val="28"/>
-          <w:u w:val="single"/>
-        </w:rPr>
         <w:t>):</w:t>
       </w:r>
     </w:p>
@@ -1530,19 +1903,16 @@
         <w:ind w:left="1080"/>
       </w:pPr>
       <w:r>
-        <w:t>Bản tin được gửi đi mỗi khi gateway trạng thái của btn thay đổi từ off sang on (00 0</w:t>
-      </w:r>
-      <w:r>
-        <w:t>1</w:t>
-      </w:r>
-      <w:r>
-        <w:t xml:space="preserve"> to 00 0</w:t>
-      </w:r>
-      <w:r>
-        <w:t>0</w:t>
-      </w:r>
-      <w:r>
-        <w:t>)</w:t>
+        <w:t xml:space="preserve">Bản tin được gửi đi mỗi khi gateway trạng thái của </w:t>
+      </w:r>
+      <w:r>
+        <w:t>nút</w:t>
+      </w:r>
+      <w:r>
+        <w:t xml:space="preserve"> (8)</w:t>
+      </w:r>
+      <w:r>
+        <w:t xml:space="preserve"> thay đổi từ off sang on (00 01 to 00 00)</w:t>
       </w:r>
     </w:p>
     <w:p>
@@ -1560,19 +1930,22 @@
         <w:rPr>
           <w:u w:val="single"/>
         </w:rPr>
-        <w:t xml:space="preserve">Bản tin đếm (topic: </w:t>
-      </w:r>
-      <w:r>
-        <w:rPr>
+        <w:t>Bản tin đếm (</w:t>
+      </w:r>
+      <w:r>
+        <w:rPr>
+          <w:rFonts w:eastAsia="Times New Roman"/>
+          <w:kern w:val="0"/>
+          <w:szCs w:val="28"/>
           <w:u w:val="single"/>
         </w:rPr>
-        <w:t>mes_StopIOTReques</w:t>
+        <w:t>type: 3</w:t>
       </w:r>
       <w:r>
         <w:rPr>
           <w:u w:val="single"/>
         </w:rPr>
-        <w:t>t):</w:t>
+        <w:t>):</w:t>
       </w:r>
     </w:p>
     <w:p>
@@ -1581,7 +1954,10 @@
         <w:ind w:left="1080"/>
       </w:pPr>
       <w:r>
-        <w:t>Bản tin được gửi sau mỗi 60s.</w:t>
+        <w:t>Bản tin được gửi sau mỗi 60s</w:t>
+      </w:r>
+      <w:r>
+        <w:t xml:space="preserve"> trong điều kiện biến alive = true (thiết bị còn sống)</w:t>
       </w:r>
     </w:p>
     <w:p>
@@ -1638,27 +2014,7 @@
           <w:kern w:val="0"/>
           <w:szCs w:val="28"/>
         </w:rPr>
-        <w:t>        currentDevice.indexs += combinedValue + 65535</w:t>
-      </w:r>
-      <w:r>
-        <w:rPr>
-          <w:rFonts w:eastAsia="Times New Roman"/>
-          <w:i/>
-          <w:iCs/>
-          <w:kern w:val="0"/>
-          <w:szCs w:val="28"/>
-        </w:rPr>
-        <w:t xml:space="preserve"> - </w:t>
-      </w:r>
-      <w:r>
-        <w:rPr>
-          <w:rFonts w:eastAsia="Times New Roman"/>
-          <w:i/>
-          <w:iCs/>
-          <w:kern w:val="0"/>
-          <w:szCs w:val="28"/>
-        </w:rPr>
-        <w:t>currentDevice.preIndexs + 1;</w:t>
+        <w:t>        currentDevice.indexs += combinedValue + 65535 - currentDevice.preIndexs + 1;</w:t>
       </w:r>
     </w:p>
     <w:p>
@@ -1862,6 +2218,11 @@
       <w:pPr>
         <w:pStyle w:val="ListParagraph"/>
         <w:ind w:left="1080"/>
+        <w:rPr>
+          <w:rFonts w:eastAsia="Times New Roman"/>
+          <w:kern w:val="0"/>
+          <w:szCs w:val="28"/>
+        </w:rPr>
       </w:pPr>
       <w:r>
         <w:rPr>
@@ -1882,12 +2243,43 @@
     </w:p>
     <w:p>
       <w:pPr>
+        <w:pStyle w:val="ListParagraph"/>
+        <w:ind w:left="1080"/>
+      </w:pPr>
+      <w:r>
+        <w:rPr>
+          <w:rFonts w:eastAsia="Times New Roman"/>
+          <w:kern w:val="0"/>
+          <w:szCs w:val="28"/>
+        </w:rPr>
+        <w:t xml:space="preserve">Nếu là lần chạy đầu tiên của máy (setpreIndexs: true) thì phải set giá trị của preIndexs = </w:t>
+      </w:r>
+      <w:r>
+        <w:rPr>
+          <w:rFonts w:eastAsia="Times New Roman"/>
+          <w:kern w:val="0"/>
+          <w:szCs w:val="28"/>
+        </w:rPr>
+        <w:t>combinedValue</w:t>
+      </w:r>
+      <w:r>
+        <w:rPr>
+          <w:rFonts w:eastAsia="Times New Roman"/>
+          <w:kern w:val="0"/>
+          <w:szCs w:val="28"/>
+        </w:rPr>
+        <w:t>.</w:t>
+      </w:r>
+    </w:p>
+    <w:p>
+      <w:pPr>
         <w:ind w:left="720" w:firstLine="360"/>
       </w:pPr>
       <w:r>
         <w:rPr>
           <w:u w:val="single"/>
         </w:rPr>
+        <w:lastRenderedPageBreak/>
         <w:t xml:space="preserve">Giải thích: </w:t>
       </w:r>
       <w:r>
@@ -1910,21 +2302,12 @@
       </w:r>
       <w:r>
         <w:rPr>
+          <w:rFonts w:eastAsia="Times New Roman"/>
+          <w:kern w:val="0"/>
+          <w:szCs w:val="28"/>
           <w:u w:val="single"/>
         </w:rPr>
-        <w:t>topic: mes_</w:t>
-      </w:r>
-      <w:r>
-        <w:rPr>
-          <w:u w:val="single"/>
-        </w:rPr>
-        <w:t>Alive</w:t>
-      </w:r>
-      <w:r>
-        <w:rPr>
-          <w:u w:val="single"/>
-        </w:rPr>
-        <w:t>IOTRequest</w:t>
+        <w:t>type: 4</w:t>
       </w:r>
       <w:r>
         <w:rPr>
@@ -1941,14 +2324,3081 @@
       <w:r>
         <w:t>Bản tin này cũng được gửi sau mỗi 60s</w:t>
       </w:r>
-      <w:bookmarkStart w:id="0" w:name="_GoBack"/>
-      <w:bookmarkEnd w:id="0"/>
-    </w:p>
-    <w:p>
-      <w:pPr>
-        <w:ind w:left="720"/>
-      </w:pPr>
-    </w:p>
+      <w:r>
+        <w:t xml:space="preserve"> trong điều kiện biến alive = true (thiết bị còn sống)</w:t>
+      </w:r>
+    </w:p>
+    <w:p>
+      <w:pPr>
+        <w:pStyle w:val="ListParagraph"/>
+        <w:ind w:left="1080"/>
+      </w:pPr>
+      <w:r>
+        <w:rPr>
+          <w:noProof/>
+        </w:rPr>
+        <mc:AlternateContent>
+          <mc:Choice Requires="wps">
+            <w:drawing>
+              <wp:anchor distT="45720" distB="45720" distL="114300" distR="114300" simplePos="0" relativeHeight="251701248" behindDoc="0" locked="0" layoutInCell="1" allowOverlap="1" wp14:anchorId="166C7E57" wp14:editId="76E165C9">
+                <wp:simplePos x="0" y="0"/>
+                <wp:positionH relativeFrom="margin">
+                  <wp:posOffset>1997710</wp:posOffset>
+                </wp:positionH>
+                <wp:positionV relativeFrom="paragraph">
+                  <wp:posOffset>3175</wp:posOffset>
+                </wp:positionV>
+                <wp:extent cx="3187700" cy="327660"/>
+                <wp:effectExtent l="0" t="0" r="0" b="0"/>
+                <wp:wrapSquare wrapText="bothSides"/>
+                <wp:docPr id="660812090" name="Text Box 2"/>
+                <wp:cNvGraphicFramePr>
+                  <a:graphicFrameLocks xmlns:a="http://schemas.openxmlformats.org/drawingml/2006/main"/>
+                </wp:cNvGraphicFramePr>
+                <a:graphic xmlns:a="http://schemas.openxmlformats.org/drawingml/2006/main">
+                  <a:graphicData uri="http://schemas.microsoft.com/office/word/2010/wordprocessingShape">
+                    <wps:wsp>
+                      <wps:cNvSpPr txBox="1">
+                        <a:spLocks noChangeArrowheads="1"/>
+                      </wps:cNvSpPr>
+                      <wps:spPr bwMode="auto">
+                        <a:xfrm>
+                          <a:off x="0" y="0"/>
+                          <a:ext cx="3187700" cy="327660"/>
+                        </a:xfrm>
+                        <a:prstGeom prst="rect">
+                          <a:avLst/>
+                        </a:prstGeom>
+                        <a:solidFill>
+                          <a:srgbClr val="FFFFFF"/>
+                        </a:solidFill>
+                        <a:ln w="9525">
+                          <a:noFill/>
+                          <a:miter lim="800000"/>
+                          <a:headEnd/>
+                          <a:tailEnd/>
+                        </a:ln>
+                      </wps:spPr>
+                      <wps:txbx>
+                        <w:txbxContent>
+                          <w:p>
+                            <w:pPr>
+                              <w:jc w:val="left"/>
+                              <w:rPr>
+                                <w:i/>
+                                <w:iCs/>
+                              </w:rPr>
+                            </w:pPr>
+                            <w:r>
+                              <w:rPr>
+                                <w:i/>
+                                <w:iCs/>
+                              </w:rPr>
+                              <w:t>Quy trình vận hành thiết bị IOT</w:t>
+                            </w:r>
+                          </w:p>
+                        </w:txbxContent>
+                      </wps:txbx>
+                      <wps:bodyPr rot="0" vert="horz" wrap="square" lIns="91440" tIns="45720" rIns="91440" bIns="45720" anchor="t" anchorCtr="0">
+                        <a:noAutofit/>
+                      </wps:bodyPr>
+                    </wps:wsp>
+                  </a:graphicData>
+                </a:graphic>
+                <wp14:sizeRelH relativeFrom="margin">
+                  <wp14:pctWidth>0</wp14:pctWidth>
+                </wp14:sizeRelH>
+                <wp14:sizeRelV relativeFrom="margin">
+                  <wp14:pctHeight>0</wp14:pctHeight>
+                </wp14:sizeRelV>
+              </wp:anchor>
+            </w:drawing>
+          </mc:Choice>
+          <mc:Fallback>
+            <w:pict>
+              <v:shapetype w14:anchorId="166C7E57" id="_x0000_t202" coordsize="21600,21600" o:spt="202" path="m,l,21600r21600,l21600,xe">
+                <v:stroke joinstyle="miter"/>
+                <v:path gradientshapeok="t" o:connecttype="rect"/>
+              </v:shapetype>
+              <v:shape id="Text Box 2" o:spid="_x0000_s1026" type="#_x0000_t202" style="position:absolute;left:0;text-align:left;margin-left:157.3pt;margin-top:.25pt;width:251pt;height:25.8pt;z-index:251701248;visibility:visible;mso-wrap-style:square;mso-width-percent:0;mso-height-percent:0;mso-wrap-distance-left:9pt;mso-wrap-distance-top:3.6pt;mso-wrap-distance-right:9pt;mso-wrap-distance-bottom:3.6pt;mso-position-horizontal:absolute;mso-position-horizontal-relative:margin;mso-position-vertical:absolute;mso-position-vertical-relative:text;mso-width-percent:0;mso-height-percent:0;mso-width-relative:margin;mso-height-relative:margin;v-text-anchor:top" o:gfxdata="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" stroked="f">
+                <v:textbox>
+                  <w:txbxContent>
+                    <w:p>
+                      <w:pPr>
+                        <w:jc w:val="left"/>
+                        <w:rPr>
+                          <w:i/>
+                          <w:iCs/>
+                        </w:rPr>
+                      </w:pPr>
+                      <w:r>
+                        <w:rPr>
+                          <w:i/>
+                          <w:iCs/>
+                        </w:rPr>
+                        <w:t>Quy trình vận hành thiết bị IOT</w:t>
+                      </w:r>
+                    </w:p>
+                  </w:txbxContent>
+                </v:textbox>
+                <w10:wrap type="square" anchorx="margin"/>
+              </v:shape>
+            </w:pict>
+          </mc:Fallback>
+        </mc:AlternateContent>
+      </w:r>
+    </w:p>
+    <w:p>
+      <w:pPr>
+        <w:pStyle w:val="ListParagraph"/>
+        <w:ind w:left="1080"/>
+      </w:pPr>
+      <w:r>
+        <w:rPr>
+          <w:noProof/>
+        </w:rPr>
+        <mc:AlternateContent>
+          <mc:Choice Requires="wps">
+            <w:drawing>
+              <wp:anchor distT="0" distB="0" distL="114300" distR="114300" simplePos="0" relativeHeight="251703296" behindDoc="0" locked="0" layoutInCell="1" allowOverlap="1" wp14:anchorId="739AF37F" wp14:editId="1FF290D4">
+                <wp:simplePos x="0" y="0"/>
+                <wp:positionH relativeFrom="column">
+                  <wp:posOffset>237490</wp:posOffset>
+                </wp:positionH>
+                <wp:positionV relativeFrom="paragraph">
+                  <wp:posOffset>260350</wp:posOffset>
+                </wp:positionV>
+                <wp:extent cx="1552575" cy="353060"/>
+                <wp:effectExtent l="0" t="0" r="9525" b="8890"/>
+                <wp:wrapNone/>
+                <wp:docPr id="1077378681" name="Rectangle: Rounded Corners 2"/>
+                <wp:cNvGraphicFramePr/>
+                <a:graphic xmlns:a="http://schemas.openxmlformats.org/drawingml/2006/main">
+                  <a:graphicData uri="http://schemas.microsoft.com/office/word/2010/wordprocessingShape">
+                    <wps:wsp>
+                      <wps:cNvSpPr/>
+                      <wps:spPr>
+                        <a:xfrm>
+                          <a:off x="0" y="0"/>
+                          <a:ext cx="1552575" cy="353060"/>
+                        </a:xfrm>
+                        <a:prstGeom prst="roundRect">
+                          <a:avLst/>
+                        </a:prstGeom>
+                        <a:solidFill>
+                          <a:schemeClr val="accent1"/>
+                        </a:solidFill>
+                        <a:ln>
+                          <a:noFill/>
+                        </a:ln>
+                      </wps:spPr>
+                      <wps:style>
+                        <a:lnRef idx="0">
+                          <a:scrgbClr r="0" g="0" b="0"/>
+                        </a:lnRef>
+                        <a:fillRef idx="0">
+                          <a:scrgbClr r="0" g="0" b="0"/>
+                        </a:fillRef>
+                        <a:effectRef idx="0">
+                          <a:scrgbClr r="0" g="0" b="0"/>
+                        </a:effectRef>
+                        <a:fontRef idx="minor">
+                          <a:schemeClr val="lt1"/>
+                        </a:fontRef>
+                      </wps:style>
+                      <wps:txbx>
+                        <w:txbxContent>
+                          <w:p>
+                            <w:pPr>
+                              <w:jc w:val="center"/>
+                            </w:pPr>
+                            <w:r>
+                              <w:t>Bắt đầu BO</w:t>
+                            </w:r>
+                          </w:p>
+                        </w:txbxContent>
+                      </wps:txbx>
+                      <wps:bodyPr rot="0" spcFirstLastPara="0" vertOverflow="overflow" horzOverflow="overflow" vert="horz" wrap="square" lIns="91440" tIns="45720" rIns="91440" bIns="45720" numCol="1" spcCol="0" rtlCol="0" fromWordArt="0" anchor="ctr" anchorCtr="0" forceAA="0" compatLnSpc="1">
+                        <a:prstTxWarp prst="textNoShape">
+                          <a:avLst/>
+                        </a:prstTxWarp>
+                        <a:noAutofit/>
+                      </wps:bodyPr>
+                    </wps:wsp>
+                  </a:graphicData>
+                </a:graphic>
+                <wp14:sizeRelH relativeFrom="margin">
+                  <wp14:pctWidth>0</wp14:pctWidth>
+                </wp14:sizeRelH>
+              </wp:anchor>
+            </w:drawing>
+          </mc:Choice>
+          <mc:Fallback>
+            <w:pict>
+              <v:roundrect w14:anchorId="739AF37F" id="Rectangle: Rounded Corners 2" o:spid="_x0000_s1027" style="position:absolute;left:0;text-align:left;margin-left:18.7pt;margin-top:20.5pt;width:122.25pt;height:27.8pt;z-index:251703296;visibility:visible;mso-wrap-style:square;mso-width-percent:0;mso-wrap-distance-left:9pt;mso-wrap-distance-top:0;mso-wrap-distance-right:9pt;mso-wrap-distance-bottom:0;mso-position-horizontal:absolute;mso-position-horizontal-relative:text;mso-position-vertical:absolute;mso-position-vertical-relative:text;mso-width-percent:0;mso-width-relative:margin;v-text-anchor:middle" arcsize="10923f" o:gfxdata="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" fillcolor="#4472c4 [3204]" stroked="f">
+                <v:textbox>
+                  <w:txbxContent>
+                    <w:p>
+                      <w:pPr>
+                        <w:jc w:val="center"/>
+                      </w:pPr>
+                      <w:r>
+                        <w:t>Bắt đầu BO</w:t>
+                      </w:r>
+                    </w:p>
+                  </w:txbxContent>
+                </v:textbox>
+              </v:roundrect>
+            </w:pict>
+          </mc:Fallback>
+        </mc:AlternateContent>
+      </w:r>
+      <w:r>
+        <w:rPr>
+          <w:noProof/>
+        </w:rPr>
+        <mc:AlternateContent>
+          <mc:Choice Requires="wps">
+            <w:drawing>
+              <wp:anchor distT="45720" distB="45720" distL="114300" distR="114300" simplePos="0" relativeHeight="251708416" behindDoc="0" locked="0" layoutInCell="1" allowOverlap="1" wp14:anchorId="19A2B0F4" wp14:editId="02023E3D">
+                <wp:simplePos x="0" y="0"/>
+                <wp:positionH relativeFrom="margin">
+                  <wp:posOffset>2082800</wp:posOffset>
+                </wp:positionH>
+                <wp:positionV relativeFrom="paragraph">
+                  <wp:posOffset>90170</wp:posOffset>
+                </wp:positionV>
+                <wp:extent cx="1129665" cy="327660"/>
+                <wp:effectExtent l="0" t="0" r="0" b="0"/>
+                <wp:wrapSquare wrapText="bothSides"/>
+                <wp:docPr id="172979353" name="Text Box 2"/>
+                <wp:cNvGraphicFramePr>
+                  <a:graphicFrameLocks xmlns:a="http://schemas.openxmlformats.org/drawingml/2006/main"/>
+                </wp:cNvGraphicFramePr>
+                <a:graphic xmlns:a="http://schemas.openxmlformats.org/drawingml/2006/main">
+                  <a:graphicData uri="http://schemas.microsoft.com/office/word/2010/wordprocessingShape">
+                    <wps:wsp>
+                      <wps:cNvSpPr txBox="1">
+                        <a:spLocks noChangeArrowheads="1"/>
+                      </wps:cNvSpPr>
+                      <wps:spPr bwMode="auto">
+                        <a:xfrm>
+                          <a:off x="0" y="0"/>
+                          <a:ext cx="1129665" cy="327660"/>
+                        </a:xfrm>
+                        <a:prstGeom prst="rect">
+                          <a:avLst/>
+                        </a:prstGeom>
+                        <a:solidFill>
+                          <a:srgbClr val="FFFFFF"/>
+                        </a:solidFill>
+                        <a:ln w="9525">
+                          <a:noFill/>
+                          <a:miter lim="800000"/>
+                          <a:headEnd/>
+                          <a:tailEnd/>
+                        </a:ln>
+                      </wps:spPr>
+                      <wps:txbx>
+                        <w:txbxContent>
+                          <w:p>
+                            <w:r>
+                              <w:t>Bấm nút start</w:t>
+                            </w:r>
+                          </w:p>
+                        </w:txbxContent>
+                      </wps:txbx>
+                      <wps:bodyPr rot="0" vert="horz" wrap="square" lIns="91440" tIns="45720" rIns="91440" bIns="45720" anchor="t" anchorCtr="0">
+                        <a:noAutofit/>
+                      </wps:bodyPr>
+                    </wps:wsp>
+                  </a:graphicData>
+                </a:graphic>
+                <wp14:sizeRelH relativeFrom="margin">
+                  <wp14:pctWidth>0</wp14:pctWidth>
+                </wp14:sizeRelH>
+                <wp14:sizeRelV relativeFrom="margin">
+                  <wp14:pctHeight>0</wp14:pctHeight>
+                </wp14:sizeRelV>
+              </wp:anchor>
+            </w:drawing>
+          </mc:Choice>
+          <mc:Fallback>
+            <w:pict>
+              <v:shape w14:anchorId="19A2B0F4" id="_x0000_s1028" type="#_x0000_t202" style="position:absolute;left:0;text-align:left;margin-left:164pt;margin-top:7.1pt;width:88.95pt;height:25.8pt;z-index:251708416;visibility:visible;mso-wrap-style:square;mso-width-percent:0;mso-height-percent:0;mso-wrap-distance-left:9pt;mso-wrap-distance-top:3.6pt;mso-wrap-distance-right:9pt;mso-wrap-distance-bottom:3.6pt;mso-position-horizontal:absolute;mso-position-horizontal-relative:margin;mso-position-vertical:absolute;mso-position-vertical-relative:text;mso-width-percent:0;mso-height-percent:0;mso-width-relative:margin;mso-height-relative:margin;v-text-anchor:top" o:gfxdata="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" stroked="f">
+                <v:textbox>
+                  <w:txbxContent>
+                    <w:p>
+                      <w:r>
+                        <w:t>Bấm nút start</w:t>
+                      </w:r>
+                    </w:p>
+                  </w:txbxContent>
+                </v:textbox>
+                <w10:wrap type="square" anchorx="margin"/>
+              </v:shape>
+            </w:pict>
+          </mc:Fallback>
+        </mc:AlternateContent>
+      </w:r>
+      <w:r>
+        <w:rPr>
+          <w:noProof/>
+        </w:rPr>
+        <mc:AlternateContent>
+          <mc:Choice Requires="wps">
+            <w:drawing>
+              <wp:anchor distT="45720" distB="45720" distL="114300" distR="114300" simplePos="0" relativeHeight="251721728" behindDoc="0" locked="0" layoutInCell="1" allowOverlap="1" wp14:anchorId="2F1EB8FF" wp14:editId="17A52225">
+                <wp:simplePos x="0" y="0"/>
+                <wp:positionH relativeFrom="margin">
+                  <wp:posOffset>2082800</wp:posOffset>
+                </wp:positionH>
+                <wp:positionV relativeFrom="paragraph">
+                  <wp:posOffset>1309370</wp:posOffset>
+                </wp:positionV>
+                <wp:extent cx="1129665" cy="327660"/>
+                <wp:effectExtent l="0" t="0" r="0" b="0"/>
+                <wp:wrapSquare wrapText="bothSides"/>
+                <wp:docPr id="882152896" name="Text Box 2"/>
+                <wp:cNvGraphicFramePr>
+                  <a:graphicFrameLocks xmlns:a="http://schemas.openxmlformats.org/drawingml/2006/main"/>
+                </wp:cNvGraphicFramePr>
+                <a:graphic xmlns:a="http://schemas.openxmlformats.org/drawingml/2006/main">
+                  <a:graphicData uri="http://schemas.microsoft.com/office/word/2010/wordprocessingShape">
+                    <wps:wsp>
+                      <wps:cNvSpPr txBox="1">
+                        <a:spLocks noChangeArrowheads="1"/>
+                      </wps:cNvSpPr>
+                      <wps:spPr bwMode="auto">
+                        <a:xfrm>
+                          <a:off x="0" y="0"/>
+                          <a:ext cx="1129665" cy="327660"/>
+                        </a:xfrm>
+                        <a:prstGeom prst="rect">
+                          <a:avLst/>
+                        </a:prstGeom>
+                        <a:solidFill>
+                          <a:srgbClr val="FFFFFF"/>
+                        </a:solidFill>
+                        <a:ln w="9525">
+                          <a:noFill/>
+                          <a:miter lim="800000"/>
+                          <a:headEnd/>
+                          <a:tailEnd/>
+                        </a:ln>
+                      </wps:spPr>
+                      <wps:txbx>
+                        <w:txbxContent>
+                          <w:p>
+                            <w:r>
+                              <w:t>Bấm nút stop</w:t>
+                            </w:r>
+                          </w:p>
+                        </w:txbxContent>
+                      </wps:txbx>
+                      <wps:bodyPr rot="0" vert="horz" wrap="square" lIns="91440" tIns="45720" rIns="91440" bIns="45720" anchor="t" anchorCtr="0">
+                        <a:noAutofit/>
+                      </wps:bodyPr>
+                    </wps:wsp>
+                  </a:graphicData>
+                </a:graphic>
+                <wp14:sizeRelH relativeFrom="margin">
+                  <wp14:pctWidth>0</wp14:pctWidth>
+                </wp14:sizeRelH>
+                <wp14:sizeRelV relativeFrom="margin">
+                  <wp14:pctHeight>0</wp14:pctHeight>
+                </wp14:sizeRelV>
+              </wp:anchor>
+            </w:drawing>
+          </mc:Choice>
+          <mc:Fallback>
+            <w:pict>
+              <v:shape w14:anchorId="2F1EB8FF" id="_x0000_s1029" type="#_x0000_t202" style="position:absolute;left:0;text-align:left;margin-left:164pt;margin-top:103.1pt;width:88.95pt;height:25.8pt;z-index:251721728;visibility:visible;mso-wrap-style:square;mso-width-percent:0;mso-height-percent:0;mso-wrap-distance-left:9pt;mso-wrap-distance-top:3.6pt;mso-wrap-distance-right:9pt;mso-wrap-distance-bottom:3.6pt;mso-position-horizontal:absolute;mso-position-horizontal-relative:margin;mso-position-vertical:absolute;mso-position-vertical-relative:text;mso-width-percent:0;mso-height-percent:0;mso-width-relative:margin;mso-height-relative:margin;v-text-anchor:top" o:gfxdata="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" stroked="f">
+                <v:textbox>
+                  <w:txbxContent>
+                    <w:p>
+                      <w:r>
+                        <w:t>Bấm nút stop</w:t>
+                      </w:r>
+                    </w:p>
+                  </w:txbxContent>
+                </v:textbox>
+                <w10:wrap type="square" anchorx="margin"/>
+              </v:shape>
+            </w:pict>
+          </mc:Fallback>
+        </mc:AlternateContent>
+      </w:r>
+      <w:r>
+        <w:rPr>
+          <w:noProof/>
+        </w:rPr>
+        <mc:AlternateContent>
+          <mc:Choice Requires="wps">
+            <w:drawing>
+              <wp:anchor distT="0" distB="0" distL="114300" distR="114300" simplePos="0" relativeHeight="251706368" behindDoc="0" locked="0" layoutInCell="1" allowOverlap="1" wp14:anchorId="1EE174D6" wp14:editId="351B9339">
+                <wp:simplePos x="0" y="0"/>
+                <wp:positionH relativeFrom="margin">
+                  <wp:posOffset>3390900</wp:posOffset>
+                </wp:positionH>
+                <wp:positionV relativeFrom="paragraph">
+                  <wp:posOffset>108585</wp:posOffset>
+                </wp:positionV>
+                <wp:extent cx="2219325" cy="629285"/>
+                <wp:effectExtent l="0" t="0" r="9525" b="0"/>
+                <wp:wrapNone/>
+                <wp:docPr id="2108029401" name="Rectangle: Rounded Corners 2"/>
+                <wp:cNvGraphicFramePr/>
+                <a:graphic xmlns:a="http://schemas.openxmlformats.org/drawingml/2006/main">
+                  <a:graphicData uri="http://schemas.microsoft.com/office/word/2010/wordprocessingShape">
+                    <wps:wsp>
+                      <wps:cNvSpPr/>
+                      <wps:spPr>
+                        <a:xfrm>
+                          <a:off x="0" y="0"/>
+                          <a:ext cx="2219325" cy="629285"/>
+                        </a:xfrm>
+                        <a:prstGeom prst="roundRect">
+                          <a:avLst/>
+                        </a:prstGeom>
+                        <a:solidFill>
+                          <a:schemeClr val="accent1"/>
+                        </a:solidFill>
+                        <a:ln>
+                          <a:noFill/>
+                        </a:ln>
+                      </wps:spPr>
+                      <wps:style>
+                        <a:lnRef idx="0">
+                          <a:scrgbClr r="0" g="0" b="0"/>
+                        </a:lnRef>
+                        <a:fillRef idx="0">
+                          <a:scrgbClr r="0" g="0" b="0"/>
+                        </a:fillRef>
+                        <a:effectRef idx="0">
+                          <a:scrgbClr r="0" g="0" b="0"/>
+                        </a:effectRef>
+                        <a:fontRef idx="minor">
+                          <a:schemeClr val="lt1"/>
+                        </a:fontRef>
+                      </wps:style>
+                      <wps:txbx>
+                        <w:txbxContent>
+                          <w:p>
+                            <w:pPr>
+                              <w:jc w:val="center"/>
+                            </w:pPr>
+                            <w:r>
+                              <w:t>Reset index về 0</w:t>
+                            </w:r>
+                            <w:r>
+                              <w:t xml:space="preserve"> và gửi đi bản tin start </w:t>
+                            </w:r>
+                          </w:p>
+                        </w:txbxContent>
+                      </wps:txbx>
+                      <wps:bodyPr rot="0" spcFirstLastPara="0" vertOverflow="overflow" horzOverflow="overflow" vert="horz" wrap="square" lIns="91440" tIns="45720" rIns="91440" bIns="45720" numCol="1" spcCol="0" rtlCol="0" fromWordArt="0" anchor="ctr" anchorCtr="0" forceAA="0" compatLnSpc="1">
+                        <a:prstTxWarp prst="textNoShape">
+                          <a:avLst/>
+                        </a:prstTxWarp>
+                        <a:noAutofit/>
+                      </wps:bodyPr>
+                    </wps:wsp>
+                  </a:graphicData>
+                </a:graphic>
+                <wp14:sizeRelH relativeFrom="margin">
+                  <wp14:pctWidth>0</wp14:pctWidth>
+                </wp14:sizeRelH>
+                <wp14:sizeRelV relativeFrom="margin">
+                  <wp14:pctHeight>0</wp14:pctHeight>
+                </wp14:sizeRelV>
+              </wp:anchor>
+            </w:drawing>
+          </mc:Choice>
+          <mc:Fallback>
+            <w:pict>
+              <v:roundrect w14:anchorId="1EE174D6" id="_x0000_s1030" style="position:absolute;left:0;text-align:left;margin-left:267pt;margin-top:8.55pt;width:174.75pt;height:49.55pt;z-index:251706368;visibility:visible;mso-wrap-style:square;mso-width-percent:0;mso-height-percent:0;mso-wrap-distance-left:9pt;mso-wrap-distance-top:0;mso-wrap-distance-right:9pt;mso-wrap-distance-bottom:0;mso-position-horizontal:absolute;mso-position-horizontal-relative:margin;mso-position-vertical:absolute;mso-position-vertical-relative:text;mso-width-percent:0;mso-height-percent:0;mso-width-relative:margin;mso-height-relative:margin;v-text-anchor:middle" arcsize="10923f" o:gfxdata="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" fillcolor="#4472c4 [3204]" stroked="f">
+                <v:textbox>
+                  <w:txbxContent>
+                    <w:p>
+                      <w:pPr>
+                        <w:jc w:val="center"/>
+                      </w:pPr>
+                      <w:r>
+                        <w:t>Reset index về 0</w:t>
+                      </w:r>
+                      <w:r>
+                        <w:t xml:space="preserve"> và gửi đi bản tin start </w:t>
+                      </w:r>
+                    </w:p>
+                  </w:txbxContent>
+                </v:textbox>
+                <w10:wrap anchorx="margin"/>
+              </v:roundrect>
+            </w:pict>
+          </mc:Fallback>
+        </mc:AlternateContent>
+      </w:r>
+      <w:r>
+        <w:rPr>
+          <w:noProof/>
+        </w:rPr>
+        <mc:AlternateContent>
+          <mc:Choice Requires="wps">
+            <w:drawing>
+              <wp:anchor distT="0" distB="0" distL="114300" distR="114300" simplePos="0" relativeHeight="251723776" behindDoc="0" locked="0" layoutInCell="1" allowOverlap="1" wp14:anchorId="51FFB298" wp14:editId="7DEBCADE">
+                <wp:simplePos x="0" y="0"/>
+                <wp:positionH relativeFrom="column">
+                  <wp:posOffset>4143375</wp:posOffset>
+                </wp:positionH>
+                <wp:positionV relativeFrom="paragraph">
+                  <wp:posOffset>737870</wp:posOffset>
+                </wp:positionV>
+                <wp:extent cx="0" cy="751840"/>
+                <wp:effectExtent l="76200" t="0" r="57150" b="48260"/>
+                <wp:wrapNone/>
+                <wp:docPr id="1947845497" name="Straight Arrow Connector 10"/>
+                <wp:cNvGraphicFramePr/>
+                <a:graphic xmlns:a="http://schemas.openxmlformats.org/drawingml/2006/main">
+                  <a:graphicData uri="http://schemas.microsoft.com/office/word/2010/wordprocessingShape">
+                    <wps:wsp>
+                      <wps:cNvCnPr/>
+                      <wps:spPr>
+                        <a:xfrm>
+                          <a:off x="0" y="0"/>
+                          <a:ext cx="0" cy="751840"/>
+                        </a:xfrm>
+                        <a:prstGeom prst="straightConnector1">
+                          <a:avLst/>
+                        </a:prstGeom>
+                        <a:ln>
+                          <a:tailEnd type="triangle"/>
+                        </a:ln>
+                      </wps:spPr>
+                      <wps:style>
+                        <a:lnRef idx="1">
+                          <a:schemeClr val="accent1"/>
+                        </a:lnRef>
+                        <a:fillRef idx="0">
+                          <a:schemeClr val="accent1"/>
+                        </a:fillRef>
+                        <a:effectRef idx="0">
+                          <a:schemeClr val="accent1"/>
+                        </a:effectRef>
+                        <a:fontRef idx="minor">
+                          <a:schemeClr val="tx1"/>
+                        </a:fontRef>
+                      </wps:style>
+                      <wps:bodyPr/>
+                    </wps:wsp>
+                  </a:graphicData>
+                </a:graphic>
+              </wp:anchor>
+            </w:drawing>
+          </mc:Choice>
+          <mc:Fallback>
+            <w:pict>
+              <v:shapetype w14:anchorId="0A9C7BBD" id="_x0000_t32" coordsize="21600,21600" o:spt="32" o:oned="t" path="m,l21600,21600e" filled="f">
+                <v:path arrowok="t" fillok="f" o:connecttype="none"/>
+                <o:lock v:ext="edit" shapetype="t"/>
+              </v:shapetype>
+              <v:shape id="Straight Arrow Connector 10" o:spid="_x0000_s1026" type="#_x0000_t32" style="position:absolute;margin-left:326.25pt;margin-top:58.1pt;width:0;height:59.2pt;z-index:251723776;visibility:visible;mso-wrap-style:square;mso-wrap-distance-left:9pt;mso-wrap-distance-top:0;mso-wrap-distance-right:9pt;mso-wrap-distance-bottom:0;mso-position-horizontal:absolute;mso-position-horizontal-relative:text;mso-position-vertical:absolute;mso-position-vertical-relative:text" o:gfxdata="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" strokecolor="#4472c4 [3204]" strokeweight=".5pt">
+                <v:stroke endarrow="block" joinstyle="miter"/>
+              </v:shape>
+            </w:pict>
+          </mc:Fallback>
+        </mc:AlternateContent>
+      </w:r>
+      <w:r>
+        <w:rPr>
+          <w:noProof/>
+        </w:rPr>
+        <mc:AlternateContent>
+          <mc:Choice Requires="wps">
+            <w:drawing>
+              <wp:anchor distT="45720" distB="45720" distL="114300" distR="114300" simplePos="0" relativeHeight="251714560" behindDoc="0" locked="0" layoutInCell="1" allowOverlap="1" wp14:anchorId="17D7A6D9" wp14:editId="59D2ACB2">
+                <wp:simplePos x="0" y="0"/>
+                <wp:positionH relativeFrom="column">
+                  <wp:posOffset>4267200</wp:posOffset>
+                </wp:positionH>
+                <wp:positionV relativeFrom="paragraph">
+                  <wp:posOffset>794385</wp:posOffset>
+                </wp:positionV>
+                <wp:extent cx="2200275" cy="647700"/>
+                <wp:effectExtent l="0" t="0" r="9525" b="0"/>
+                <wp:wrapSquare wrapText="bothSides"/>
+                <wp:docPr id="1560182630" name="Text Box 2"/>
+                <wp:cNvGraphicFramePr>
+                  <a:graphicFrameLocks xmlns:a="http://schemas.openxmlformats.org/drawingml/2006/main"/>
+                </wp:cNvGraphicFramePr>
+                <a:graphic xmlns:a="http://schemas.openxmlformats.org/drawingml/2006/main">
+                  <a:graphicData uri="http://schemas.microsoft.com/office/word/2010/wordprocessingShape">
+                    <wps:wsp>
+                      <wps:cNvSpPr txBox="1">
+                        <a:spLocks noChangeArrowheads="1"/>
+                      </wps:cNvSpPr>
+                      <wps:spPr bwMode="auto">
+                        <a:xfrm>
+                          <a:off x="0" y="0"/>
+                          <a:ext cx="2200275" cy="647700"/>
+                        </a:xfrm>
+                        <a:prstGeom prst="rect">
+                          <a:avLst/>
+                        </a:prstGeom>
+                        <a:solidFill>
+                          <a:srgbClr val="FFFFFF"/>
+                        </a:solidFill>
+                        <a:ln w="9525">
+                          <a:noFill/>
+                          <a:miter lim="800000"/>
+                          <a:headEnd/>
+                          <a:tailEnd/>
+                        </a:ln>
+                      </wps:spPr>
+                      <wps:txbx>
+                        <w:txbxContent>
+                          <w:p>
+                            <w:r>
+                              <w:t>Thiết bị</w:t>
+                            </w:r>
+                            <w:r>
+                              <w:t xml:space="preserve"> vận hành và </w:t>
+                            </w:r>
+                            <w:r>
+                              <w:t>gửi đi</w:t>
+                            </w:r>
+                            <w:r>
+                              <w:t xml:space="preserve"> </w:t>
+                            </w:r>
+                            <w:r>
+                              <w:t xml:space="preserve">bản tin count, alive </w:t>
+                            </w:r>
+                          </w:p>
+                        </w:txbxContent>
+                      </wps:txbx>
+                      <wps:bodyPr rot="0" vert="horz" wrap="square" lIns="91440" tIns="45720" rIns="91440" bIns="45720" anchor="t" anchorCtr="0">
+                        <a:noAutofit/>
+                      </wps:bodyPr>
+                    </wps:wsp>
+                  </a:graphicData>
+                </a:graphic>
+                <wp14:sizeRelH relativeFrom="margin">
+                  <wp14:pctWidth>0</wp14:pctWidth>
+                </wp14:sizeRelH>
+                <wp14:sizeRelV relativeFrom="margin">
+                  <wp14:pctHeight>0</wp14:pctHeight>
+                </wp14:sizeRelV>
+              </wp:anchor>
+            </w:drawing>
+          </mc:Choice>
+          <mc:Fallback>
+            <w:pict>
+              <v:shape w14:anchorId="17D7A6D9" id="_x0000_s1031" type="#_x0000_t202" style="position:absolute;left:0;text-align:left;margin-left:336pt;margin-top:62.55pt;width:173.25pt;height:51pt;z-index:251714560;visibility:visible;mso-wrap-style:square;mso-width-percent:0;mso-height-percent:0;mso-wrap-distance-left:9pt;mso-wrap-distance-top:3.6pt;mso-wrap-distance-right:9pt;mso-wrap-distance-bottom:3.6pt;mso-position-horizontal:absolute;mso-position-horizontal-relative:text;mso-position-vertical:absolute;mso-position-vertical-relative:text;mso-width-percent:0;mso-height-percent:0;mso-width-relative:margin;mso-height-relative:margin;v-text-anchor:top" o:gfxdata="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" stroked="f">
+                <v:textbox>
+                  <w:txbxContent>
+                    <w:p>
+                      <w:r>
+                        <w:t>Thiết bị</w:t>
+                      </w:r>
+                      <w:r>
+                        <w:t xml:space="preserve"> vận hành và </w:t>
+                      </w:r>
+                      <w:r>
+                        <w:t>gửi đi</w:t>
+                      </w:r>
+                      <w:r>
+                        <w:t xml:space="preserve"> </w:t>
+                      </w:r>
+                      <w:r>
+                        <w:t xml:space="preserve">bản tin count, alive </w:t>
+                      </w:r>
+                    </w:p>
+                  </w:txbxContent>
+                </v:textbox>
+                <w10:wrap type="square"/>
+              </v:shape>
+            </w:pict>
+          </mc:Fallback>
+        </mc:AlternateContent>
+      </w:r>
+      <w:r>
+        <w:rPr>
+          <w:noProof/>
+        </w:rPr>
+        <mc:AlternateContent>
+          <mc:Choice Requires="wps">
+            <w:drawing>
+              <wp:anchor distT="0" distB="0" distL="114300" distR="114300" simplePos="0" relativeHeight="251711488" behindDoc="0" locked="0" layoutInCell="1" allowOverlap="1" wp14:anchorId="712A46FC" wp14:editId="023800DC">
+                <wp:simplePos x="0" y="0"/>
+                <wp:positionH relativeFrom="column">
+                  <wp:posOffset>3418840</wp:posOffset>
+                </wp:positionH>
+                <wp:positionV relativeFrom="paragraph">
+                  <wp:posOffset>1480185</wp:posOffset>
+                </wp:positionV>
+                <wp:extent cx="1552575" cy="353060"/>
+                <wp:effectExtent l="0" t="0" r="9525" b="8890"/>
+                <wp:wrapNone/>
+                <wp:docPr id="523610790" name="Rectangle: Rounded Corners 2"/>
+                <wp:cNvGraphicFramePr/>
+                <a:graphic xmlns:a="http://schemas.openxmlformats.org/drawingml/2006/main">
+                  <a:graphicData uri="http://schemas.microsoft.com/office/word/2010/wordprocessingShape">
+                    <wps:wsp>
+                      <wps:cNvSpPr/>
+                      <wps:spPr>
+                        <a:xfrm>
+                          <a:off x="0" y="0"/>
+                          <a:ext cx="1552575" cy="353060"/>
+                        </a:xfrm>
+                        <a:prstGeom prst="roundRect">
+                          <a:avLst/>
+                        </a:prstGeom>
+                        <a:solidFill>
+                          <a:schemeClr val="accent1"/>
+                        </a:solidFill>
+                        <a:ln>
+                          <a:noFill/>
+                        </a:ln>
+                      </wps:spPr>
+                      <wps:style>
+                        <a:lnRef idx="0">
+                          <a:scrgbClr r="0" g="0" b="0"/>
+                        </a:lnRef>
+                        <a:fillRef idx="0">
+                          <a:scrgbClr r="0" g="0" b="0"/>
+                        </a:fillRef>
+                        <a:effectRef idx="0">
+                          <a:scrgbClr r="0" g="0" b="0"/>
+                        </a:effectRef>
+                        <a:fontRef idx="minor">
+                          <a:schemeClr val="lt1"/>
+                        </a:fontRef>
+                      </wps:style>
+                      <wps:txbx>
+                        <w:txbxContent>
+                          <w:p>
+                            <w:pPr>
+                              <w:jc w:val="center"/>
+                            </w:pPr>
+                            <w:r>
+                              <w:t>Kết thúc BO</w:t>
+                            </w:r>
+                          </w:p>
+                        </w:txbxContent>
+                      </wps:txbx>
+                      <wps:bodyPr rot="0" spcFirstLastPara="0" vertOverflow="overflow" horzOverflow="overflow" vert="horz" wrap="square" lIns="91440" tIns="45720" rIns="91440" bIns="45720" numCol="1" spcCol="0" rtlCol="0" fromWordArt="0" anchor="ctr" anchorCtr="0" forceAA="0" compatLnSpc="1">
+                        <a:prstTxWarp prst="textNoShape">
+                          <a:avLst/>
+                        </a:prstTxWarp>
+                        <a:noAutofit/>
+                      </wps:bodyPr>
+                    </wps:wsp>
+                  </a:graphicData>
+                </a:graphic>
+                <wp14:sizeRelH relativeFrom="margin">
+                  <wp14:pctWidth>0</wp14:pctWidth>
+                </wp14:sizeRelH>
+              </wp:anchor>
+            </w:drawing>
+          </mc:Choice>
+          <mc:Fallback>
+            <w:pict>
+              <v:roundrect w14:anchorId="712A46FC" id="_x0000_s1032" style="position:absolute;left:0;text-align:left;margin-left:269.2pt;margin-top:116.55pt;width:122.25pt;height:27.8pt;z-index:251711488;visibility:visible;mso-wrap-style:square;mso-width-percent:0;mso-wrap-distance-left:9pt;mso-wrap-distance-top:0;mso-wrap-distance-right:9pt;mso-wrap-distance-bottom:0;mso-position-horizontal:absolute;mso-position-horizontal-relative:text;mso-position-vertical:absolute;mso-position-vertical-relative:text;mso-width-percent:0;mso-width-relative:margin;v-text-anchor:middle" arcsize="10923f" o:gfxdata="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" fillcolor="#4472c4 [3204]" stroked="f">
+                <v:textbox>
+                  <w:txbxContent>
+                    <w:p>
+                      <w:pPr>
+                        <w:jc w:val="center"/>
+                      </w:pPr>
+                      <w:r>
+                        <w:t>Kết thúc BO</w:t>
+                      </w:r>
+                    </w:p>
+                  </w:txbxContent>
+                </v:textbox>
+              </v:roundrect>
+            </w:pict>
+          </mc:Fallback>
+        </mc:AlternateContent>
+      </w:r>
+    </w:p>
+    <w:p>
+      <w:pPr>
+        <w:pStyle w:val="ListParagraph"/>
+        <w:ind w:left="1080"/>
+      </w:pPr>
+      <w:r>
+        <w:rPr>
+          <w:noProof/>
+        </w:rPr>
+        <mc:AlternateContent>
+          <mc:Choice Requires="wps">
+            <w:drawing>
+              <wp:anchor distT="0" distB="0" distL="114300" distR="114300" simplePos="0" relativeHeight="251724800" behindDoc="0" locked="0" layoutInCell="1" allowOverlap="1" wp14:anchorId="130EFFBF" wp14:editId="0AF7A1F8">
+                <wp:simplePos x="0" y="0"/>
+                <wp:positionH relativeFrom="column">
+                  <wp:posOffset>1090930</wp:posOffset>
+                </wp:positionH>
+                <wp:positionV relativeFrom="paragraph">
+                  <wp:posOffset>308610</wp:posOffset>
+                </wp:positionV>
+                <wp:extent cx="73152" cy="859536"/>
+                <wp:effectExtent l="19050" t="38100" r="22225" b="17145"/>
+                <wp:wrapNone/>
+                <wp:docPr id="818721219" name="Straight Arrow Connector 11"/>
+                <wp:cNvGraphicFramePr/>
+                <a:graphic xmlns:a="http://schemas.openxmlformats.org/drawingml/2006/main">
+                  <a:graphicData uri="http://schemas.microsoft.com/office/word/2010/wordprocessingShape">
+                    <wps:wsp>
+                      <wps:cNvCnPr/>
+                      <wps:spPr>
+                        <a:xfrm rot="21300000" flipV="1">
+                          <a:off x="0" y="0"/>
+                          <a:ext cx="73152" cy="859536"/>
+                        </a:xfrm>
+                        <a:prstGeom prst="straightConnector1">
+                          <a:avLst/>
+                        </a:prstGeom>
+                        <a:ln>
+                          <a:tailEnd type="triangle"/>
+                        </a:ln>
+                      </wps:spPr>
+                      <wps:style>
+                        <a:lnRef idx="1">
+                          <a:schemeClr val="accent1"/>
+                        </a:lnRef>
+                        <a:fillRef idx="0">
+                          <a:schemeClr val="accent1"/>
+                        </a:fillRef>
+                        <a:effectRef idx="0">
+                          <a:schemeClr val="accent1"/>
+                        </a:effectRef>
+                        <a:fontRef idx="minor">
+                          <a:schemeClr val="tx1"/>
+                        </a:fontRef>
+                      </wps:style>
+                      <wps:bodyPr/>
+                    </wps:wsp>
+                  </a:graphicData>
+                </a:graphic>
+                <wp14:sizeRelH relativeFrom="margin">
+                  <wp14:pctWidth>0</wp14:pctWidth>
+                </wp14:sizeRelH>
+                <wp14:sizeRelV relativeFrom="margin">
+                  <wp14:pctHeight>0</wp14:pctHeight>
+                </wp14:sizeRelV>
+              </wp:anchor>
+            </w:drawing>
+          </mc:Choice>
+          <mc:Fallback>
+            <w:pict>
+              <v:shape w14:anchorId="42C69BC3" id="Straight Arrow Connector 11" o:spid="_x0000_s1026" type="#_x0000_t32" style="position:absolute;margin-left:85.9pt;margin-top:24.3pt;width:5.75pt;height:67.7pt;rotation:5;flip:y;z-index:251724800;visibility:visible;mso-wrap-style:square;mso-width-percent:0;mso-height-percent:0;mso-wrap-distance-left:9pt;mso-wrap-distance-top:0;mso-wrap-distance-right:9pt;mso-wrap-distance-bottom:0;mso-position-horizontal:absolute;mso-position-horizontal-relative:text;mso-position-vertical:absolute;mso-position-vertical-relative:text;mso-width-percent:0;mso-height-percent:0;mso-width-relative:margin;mso-height-relative:margin" o:gfxdata="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" strokecolor="#4472c4 [3204]" strokeweight=".5pt">
+                <v:stroke endarrow="block" joinstyle="miter"/>
+              </v:shape>
+            </w:pict>
+          </mc:Fallback>
+        </mc:AlternateContent>
+      </w:r>
+      <w:r>
+        <w:rPr>
+          <w:noProof/>
+        </w:rPr>
+        <mc:AlternateContent>
+          <mc:Choice Requires="wps">
+            <w:drawing>
+              <wp:anchor distT="0" distB="0" distL="114300" distR="114300" simplePos="0" relativeHeight="251716608" behindDoc="0" locked="0" layoutInCell="1" allowOverlap="1" wp14:anchorId="25193FD1" wp14:editId="07623EED">
+                <wp:simplePos x="0" y="0"/>
+                <wp:positionH relativeFrom="column">
+                  <wp:posOffset>1743075</wp:posOffset>
+                </wp:positionH>
+                <wp:positionV relativeFrom="paragraph">
+                  <wp:posOffset>97155</wp:posOffset>
+                </wp:positionV>
+                <wp:extent cx="1657350" cy="9525"/>
+                <wp:effectExtent l="0" t="76200" r="19050" b="85725"/>
+                <wp:wrapNone/>
+                <wp:docPr id="1212250098" name="Straight Arrow Connector 6"/>
+                <wp:cNvGraphicFramePr/>
+                <a:graphic xmlns:a="http://schemas.openxmlformats.org/drawingml/2006/main">
+                  <a:graphicData uri="http://schemas.microsoft.com/office/word/2010/wordprocessingShape">
+                    <wps:wsp>
+                      <wps:cNvCnPr/>
+                      <wps:spPr>
+                        <a:xfrm flipV="1">
+                          <a:off x="0" y="0"/>
+                          <a:ext cx="1657350" cy="9525"/>
+                        </a:xfrm>
+                        <a:prstGeom prst="straightConnector1">
+                          <a:avLst/>
+                        </a:prstGeom>
+                        <a:ln>
+                          <a:tailEnd type="triangle"/>
+                        </a:ln>
+                      </wps:spPr>
+                      <wps:style>
+                        <a:lnRef idx="1">
+                          <a:schemeClr val="accent1"/>
+                        </a:lnRef>
+                        <a:fillRef idx="0">
+                          <a:schemeClr val="accent1"/>
+                        </a:fillRef>
+                        <a:effectRef idx="0">
+                          <a:schemeClr val="accent1"/>
+                        </a:effectRef>
+                        <a:fontRef idx="minor">
+                          <a:schemeClr val="tx1"/>
+                        </a:fontRef>
+                      </wps:style>
+                      <wps:bodyPr/>
+                    </wps:wsp>
+                  </a:graphicData>
+                </a:graphic>
+              </wp:anchor>
+            </w:drawing>
+          </mc:Choice>
+          <mc:Fallback>
+            <w:pict>
+              <v:shape w14:anchorId="11CE0E9F" id="Straight Arrow Connector 6" o:spid="_x0000_s1026" type="#_x0000_t32" style="position:absolute;margin-left:137.25pt;margin-top:7.65pt;width:130.5pt;height:.75pt;flip:y;z-index:251716608;visibility:visible;mso-wrap-style:square;mso-wrap-distance-left:9pt;mso-wrap-distance-top:0;mso-wrap-distance-right:9pt;mso-wrap-distance-bottom:0;mso-position-horizontal:absolute;mso-position-horizontal-relative:text;mso-position-vertical:absolute;mso-position-vertical-relative:text" o:gfxdata="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" strokecolor="#4472c4 [3204]" strokeweight=".5pt">
+                <v:stroke endarrow="block" joinstyle="miter"/>
+              </v:shape>
+            </w:pict>
+          </mc:Fallback>
+        </mc:AlternateContent>
+      </w:r>
+    </w:p>
+    <w:p>
+      <w:pPr>
+        <w:pStyle w:val="ListParagraph"/>
+        <w:ind w:left="1080"/>
+      </w:pPr>
+    </w:p>
+    <w:p>
+      <w:pPr>
+        <w:pStyle w:val="ListParagraph"/>
+        <w:ind w:left="1080"/>
+      </w:pPr>
+    </w:p>
+    <w:p>
+      <w:pPr>
+        <w:pStyle w:val="ListParagraph"/>
+        <w:ind w:left="1080"/>
+      </w:pPr>
+      <w:r>
+        <w:rPr>
+          <w:noProof/>
+        </w:rPr>
+        <mc:AlternateContent>
+          <mc:Choice Requires="wps">
+            <w:drawing>
+              <wp:anchor distT="0" distB="0" distL="114300" distR="114300" simplePos="0" relativeHeight="251718656" behindDoc="0" locked="0" layoutInCell="1" allowOverlap="1" wp14:anchorId="5E44AB22" wp14:editId="0665392D">
+                <wp:simplePos x="0" y="0"/>
+                <wp:positionH relativeFrom="column">
+                  <wp:posOffset>332740</wp:posOffset>
+                </wp:positionH>
+                <wp:positionV relativeFrom="paragraph">
+                  <wp:posOffset>253365</wp:posOffset>
+                </wp:positionV>
+                <wp:extent cx="1552575" cy="353060"/>
+                <wp:effectExtent l="0" t="0" r="9525" b="8890"/>
+                <wp:wrapNone/>
+                <wp:docPr id="1771429076" name="Rectangle: Rounded Corners 2"/>
+                <wp:cNvGraphicFramePr/>
+                <a:graphic xmlns:a="http://schemas.openxmlformats.org/drawingml/2006/main">
+                  <a:graphicData uri="http://schemas.microsoft.com/office/word/2010/wordprocessingShape">
+                    <wps:wsp>
+                      <wps:cNvSpPr/>
+                      <wps:spPr>
+                        <a:xfrm>
+                          <a:off x="0" y="0"/>
+                          <a:ext cx="1552575" cy="353060"/>
+                        </a:xfrm>
+                        <a:prstGeom prst="roundRect">
+                          <a:avLst/>
+                        </a:prstGeom>
+                        <a:solidFill>
+                          <a:schemeClr val="accent1"/>
+                        </a:solidFill>
+                        <a:ln>
+                          <a:noFill/>
+                        </a:ln>
+                      </wps:spPr>
+                      <wps:style>
+                        <a:lnRef idx="0">
+                          <a:scrgbClr r="0" g="0" b="0"/>
+                        </a:lnRef>
+                        <a:fillRef idx="0">
+                          <a:scrgbClr r="0" g="0" b="0"/>
+                        </a:fillRef>
+                        <a:effectRef idx="0">
+                          <a:scrgbClr r="0" g="0" b="0"/>
+                        </a:effectRef>
+                        <a:fontRef idx="minor">
+                          <a:schemeClr val="lt1"/>
+                        </a:fontRef>
+                      </wps:style>
+                      <wps:txbx>
+                        <w:txbxContent>
+                          <w:p>
+                            <w:pPr>
+                              <w:jc w:val="center"/>
+                            </w:pPr>
+                            <w:r>
+                              <w:t>Gửi đi bản tin stop</w:t>
+                            </w:r>
+                          </w:p>
+                        </w:txbxContent>
+                      </wps:txbx>
+                      <wps:bodyPr rot="0" spcFirstLastPara="0" vertOverflow="overflow" horzOverflow="overflow" vert="horz" wrap="square" lIns="91440" tIns="45720" rIns="91440" bIns="45720" numCol="1" spcCol="0" rtlCol="0" fromWordArt="0" anchor="ctr" anchorCtr="0" forceAA="0" compatLnSpc="1">
+                        <a:prstTxWarp prst="textNoShape">
+                          <a:avLst/>
+                        </a:prstTxWarp>
+                        <a:noAutofit/>
+                      </wps:bodyPr>
+                    </wps:wsp>
+                  </a:graphicData>
+                </a:graphic>
+                <wp14:sizeRelH relativeFrom="margin">
+                  <wp14:pctWidth>0</wp14:pctWidth>
+                </wp14:sizeRelH>
+              </wp:anchor>
+            </w:drawing>
+          </mc:Choice>
+          <mc:Fallback>
+            <w:pict>
+              <v:roundrect w14:anchorId="5E44AB22" id="_x0000_s1033" style="position:absolute;left:0;text-align:left;margin-left:26.2pt;margin-top:19.95pt;width:122.25pt;height:27.8pt;z-index:251718656;visibility:visible;mso-wrap-style:square;mso-width-percent:0;mso-wrap-distance-left:9pt;mso-wrap-distance-top:0;mso-wrap-distance-right:9pt;mso-wrap-distance-bottom:0;mso-position-horizontal:absolute;mso-position-horizontal-relative:text;mso-position-vertical:absolute;mso-position-vertical-relative:text;mso-width-percent:0;mso-width-relative:margin;v-text-anchor:middle" arcsize="10923f" o:gfxdata="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" fillcolor="#4472c4 [3204]" stroked="f">
+                <v:textbox>
+                  <w:txbxContent>
+                    <w:p>
+                      <w:pPr>
+                        <w:jc w:val="center"/>
+                      </w:pPr>
+                      <w:r>
+                        <w:t>Gửi đi bản tin stop</w:t>
+                      </w:r>
+                    </w:p>
+                  </w:txbxContent>
+                </v:textbox>
+              </v:roundrect>
+            </w:pict>
+          </mc:Fallback>
+        </mc:AlternateContent>
+      </w:r>
+    </w:p>
+    <w:p>
+      <w:pPr>
+        <w:pStyle w:val="ListParagraph"/>
+        <w:ind w:left="1080"/>
+      </w:pPr>
+      <w:r>
+        <w:rPr>
+          <w:noProof/>
+        </w:rPr>
+        <mc:AlternateContent>
+          <mc:Choice Requires="wps">
+            <w:drawing>
+              <wp:anchor distT="0" distB="0" distL="114300" distR="114300" simplePos="0" relativeHeight="251722752" behindDoc="0" locked="0" layoutInCell="1" allowOverlap="1" wp14:anchorId="52545814" wp14:editId="1CDEAF53">
+                <wp:simplePos x="0" y="0"/>
+                <wp:positionH relativeFrom="column">
+                  <wp:posOffset>1895475</wp:posOffset>
+                </wp:positionH>
+                <wp:positionV relativeFrom="paragraph">
+                  <wp:posOffset>137795</wp:posOffset>
+                </wp:positionV>
+                <wp:extent cx="1533525" cy="0"/>
+                <wp:effectExtent l="38100" t="76200" r="0" b="95250"/>
+                <wp:wrapNone/>
+                <wp:docPr id="988043308" name="Straight Arrow Connector 8"/>
+                <wp:cNvGraphicFramePr/>
+                <a:graphic xmlns:a="http://schemas.openxmlformats.org/drawingml/2006/main">
+                  <a:graphicData uri="http://schemas.microsoft.com/office/word/2010/wordprocessingShape">
+                    <wps:wsp>
+                      <wps:cNvCnPr/>
+                      <wps:spPr>
+                        <a:xfrm flipH="1">
+                          <a:off x="0" y="0"/>
+                          <a:ext cx="1533525" cy="0"/>
+                        </a:xfrm>
+                        <a:prstGeom prst="straightConnector1">
+                          <a:avLst/>
+                        </a:prstGeom>
+                        <a:ln>
+                          <a:tailEnd type="triangle"/>
+                        </a:ln>
+                      </wps:spPr>
+                      <wps:style>
+                        <a:lnRef idx="1">
+                          <a:schemeClr val="accent1"/>
+                        </a:lnRef>
+                        <a:fillRef idx="0">
+                          <a:schemeClr val="accent1"/>
+                        </a:fillRef>
+                        <a:effectRef idx="0">
+                          <a:schemeClr val="accent1"/>
+                        </a:effectRef>
+                        <a:fontRef idx="minor">
+                          <a:schemeClr val="tx1"/>
+                        </a:fontRef>
+                      </wps:style>
+                      <wps:bodyPr/>
+                    </wps:wsp>
+                  </a:graphicData>
+                </a:graphic>
+              </wp:anchor>
+            </w:drawing>
+          </mc:Choice>
+          <mc:Fallback>
+            <w:pict>
+              <v:shape w14:anchorId="39C0A80D" id="Straight Arrow Connector 8" o:spid="_x0000_s1026" type="#_x0000_t32" style="position:absolute;margin-left:149.25pt;margin-top:10.85pt;width:120.75pt;height:0;flip:x;z-index:251722752;visibility:visible;mso-wrap-style:square;mso-wrap-distance-left:9pt;mso-wrap-distance-top:0;mso-wrap-distance-right:9pt;mso-wrap-distance-bottom:0;mso-position-horizontal:absolute;mso-position-horizontal-relative:text;mso-position-vertical:absolute;mso-position-vertical-relative:text" o:gfxdata="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" strokecolor="#4472c4 [3204]" strokeweight=".5pt">
+                <v:stroke endarrow="block" joinstyle="miter"/>
+              </v:shape>
+            </w:pict>
+          </mc:Fallback>
+        </mc:AlternateContent>
+      </w:r>
+    </w:p>
+    <w:p>
+      <w:r>
+        <w:t xml:space="preserve">  </w:t>
+      </w:r>
+    </w:p>
+    <w:p>
+      <w:r>
+        <w:rPr>
+          <w:noProof/>
+        </w:rPr>
+        <mc:AlternateContent>
+          <mc:Choice Requires="wps">
+            <w:drawing>
+              <wp:anchor distT="45720" distB="45720" distL="114300" distR="114300" simplePos="0" relativeHeight="251699200" behindDoc="0" locked="0" layoutInCell="1" allowOverlap="1" wp14:anchorId="38BB7AC0" wp14:editId="458A59A7">
+                <wp:simplePos x="0" y="0"/>
+                <wp:positionH relativeFrom="margin">
+                  <wp:posOffset>1807210</wp:posOffset>
+                </wp:positionH>
+                <wp:positionV relativeFrom="paragraph">
+                  <wp:posOffset>283845</wp:posOffset>
+                </wp:positionV>
+                <wp:extent cx="3187700" cy="327660"/>
+                <wp:effectExtent l="0" t="0" r="0" b="0"/>
+                <wp:wrapSquare wrapText="bothSides"/>
+                <wp:docPr id="1485679417" name="Text Box 2"/>
+                <wp:cNvGraphicFramePr>
+                  <a:graphicFrameLocks xmlns:a="http://schemas.openxmlformats.org/drawingml/2006/main"/>
+                </wp:cNvGraphicFramePr>
+                <a:graphic xmlns:a="http://schemas.openxmlformats.org/drawingml/2006/main">
+                  <a:graphicData uri="http://schemas.microsoft.com/office/word/2010/wordprocessingShape">
+                    <wps:wsp>
+                      <wps:cNvSpPr txBox="1">
+                        <a:spLocks noChangeArrowheads="1"/>
+                      </wps:cNvSpPr>
+                      <wps:spPr bwMode="auto">
+                        <a:xfrm>
+                          <a:off x="0" y="0"/>
+                          <a:ext cx="3187700" cy="327660"/>
+                        </a:xfrm>
+                        <a:prstGeom prst="rect">
+                          <a:avLst/>
+                        </a:prstGeom>
+                        <a:solidFill>
+                          <a:srgbClr val="FFFFFF"/>
+                        </a:solidFill>
+                        <a:ln w="9525">
+                          <a:noFill/>
+                          <a:miter lim="800000"/>
+                          <a:headEnd/>
+                          <a:tailEnd/>
+                        </a:ln>
+                      </wps:spPr>
+                      <wps:txbx>
+                        <w:txbxContent>
+                          <w:p>
+                            <w:pPr>
+                              <w:jc w:val="left"/>
+                              <w:rPr>
+                                <w:i/>
+                                <w:iCs/>
+                              </w:rPr>
+                            </w:pPr>
+                            <w:r>
+                              <w:rPr>
+                                <w:i/>
+                                <w:iCs/>
+                              </w:rPr>
+                              <w:t>Mô hình hoạt động của hệ thống</w:t>
+                            </w:r>
+                          </w:p>
+                        </w:txbxContent>
+                      </wps:txbx>
+                      <wps:bodyPr rot="0" vert="horz" wrap="square" lIns="91440" tIns="45720" rIns="91440" bIns="45720" anchor="t" anchorCtr="0">
+                        <a:noAutofit/>
+                      </wps:bodyPr>
+                    </wps:wsp>
+                  </a:graphicData>
+                </a:graphic>
+                <wp14:sizeRelH relativeFrom="margin">
+                  <wp14:pctWidth>0</wp14:pctWidth>
+                </wp14:sizeRelH>
+                <wp14:sizeRelV relativeFrom="margin">
+                  <wp14:pctHeight>0</wp14:pctHeight>
+                </wp14:sizeRelV>
+              </wp:anchor>
+            </w:drawing>
+          </mc:Choice>
+          <mc:Fallback>
+            <w:pict>
+              <v:shape w14:anchorId="38BB7AC0" id="_x0000_s1034" type="#_x0000_t202" style="position:absolute;left:0;text-align:left;margin-left:142.3pt;margin-top:22.35pt;width:251pt;height:25.8pt;z-index:251699200;visibility:visible;mso-wrap-style:square;mso-width-percent:0;mso-height-percent:0;mso-wrap-distance-left:9pt;mso-wrap-distance-top:3.6pt;mso-wrap-distance-right:9pt;mso-wrap-distance-bottom:3.6pt;mso-position-horizontal:absolute;mso-position-horizontal-relative:margin;mso-position-vertical:absolute;mso-position-vertical-relative:text;mso-width-percent:0;mso-height-percent:0;mso-width-relative:margin;mso-height-relative:margin;v-text-anchor:top" o:gfxdata="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" stroked="f">
+                <v:textbox>
+                  <w:txbxContent>
+                    <w:p>
+                      <w:pPr>
+                        <w:jc w:val="left"/>
+                        <w:rPr>
+                          <w:i/>
+                          <w:iCs/>
+                        </w:rPr>
+                      </w:pPr>
+                      <w:r>
+                        <w:rPr>
+                          <w:i/>
+                          <w:iCs/>
+                        </w:rPr>
+                        <w:t>Mô hình hoạt động của hệ thống</w:t>
+                      </w:r>
+                    </w:p>
+                  </w:txbxContent>
+                </v:textbox>
+                <w10:wrap type="square" anchorx="margin"/>
+              </v:shape>
+            </w:pict>
+          </mc:Fallback>
+        </mc:AlternateContent>
+      </w:r>
+    </w:p>
+    <w:p>
+      <w:r>
+        <w:rPr>
+          <w:noProof/>
+        </w:rPr>
+        <mc:AlternateContent>
+          <mc:Choice Requires="wps">
+            <w:drawing>
+              <wp:anchor distT="0" distB="0" distL="114300" distR="114300" simplePos="0" relativeHeight="251660288" behindDoc="0" locked="0" layoutInCell="1" allowOverlap="1" wp14:anchorId="77B69DAF" wp14:editId="73B46516">
+                <wp:simplePos x="0" y="0"/>
+                <wp:positionH relativeFrom="column">
+                  <wp:posOffset>-42545</wp:posOffset>
+                </wp:positionH>
+                <wp:positionV relativeFrom="paragraph">
+                  <wp:posOffset>588010</wp:posOffset>
+                </wp:positionV>
+                <wp:extent cx="1095375" cy="560705"/>
+                <wp:effectExtent l="0" t="0" r="9525" b="0"/>
+                <wp:wrapNone/>
+                <wp:docPr id="1431323994" name="Rectangle 1"/>
+                <wp:cNvGraphicFramePr/>
+                <a:graphic xmlns:a="http://schemas.openxmlformats.org/drawingml/2006/main">
+                  <a:graphicData uri="http://schemas.microsoft.com/office/word/2010/wordprocessingShape">
+                    <wps:wsp>
+                      <wps:cNvSpPr/>
+                      <wps:spPr>
+                        <a:xfrm>
+                          <a:off x="0" y="0"/>
+                          <a:ext cx="1095375" cy="560705"/>
+                        </a:xfrm>
+                        <a:prstGeom prst="rect">
+                          <a:avLst/>
+                        </a:prstGeom>
+                        <a:solidFill>
+                          <a:schemeClr val="accent2"/>
+                        </a:solidFill>
+                        <a:ln>
+                          <a:noFill/>
+                        </a:ln>
+                      </wps:spPr>
+                      <wps:style>
+                        <a:lnRef idx="0">
+                          <a:scrgbClr r="0" g="0" b="0"/>
+                        </a:lnRef>
+                        <a:fillRef idx="0">
+                          <a:scrgbClr r="0" g="0" b="0"/>
+                        </a:fillRef>
+                        <a:effectRef idx="0">
+                          <a:scrgbClr r="0" g="0" b="0"/>
+                        </a:effectRef>
+                        <a:fontRef idx="minor">
+                          <a:schemeClr val="lt1"/>
+                        </a:fontRef>
+                      </wps:style>
+                      <wps:txbx>
+                        <w:txbxContent>
+                          <w:p>
+                            <w:pPr>
+                              <w:jc w:val="center"/>
+                            </w:pPr>
+                            <w:r>
+                              <w:t>0303</w:t>
+                            </w:r>
+                          </w:p>
+                        </w:txbxContent>
+                      </wps:txbx>
+                      <wps:bodyPr rot="0" spcFirstLastPara="0" vertOverflow="overflow" horzOverflow="overflow" vert="horz" wrap="square" lIns="91440" tIns="45720" rIns="91440" bIns="45720" numCol="1" spcCol="0" rtlCol="0" fromWordArt="0" anchor="ctr" anchorCtr="0" forceAA="0" compatLnSpc="1">
+                        <a:prstTxWarp prst="textNoShape">
+                          <a:avLst/>
+                        </a:prstTxWarp>
+                        <a:noAutofit/>
+                      </wps:bodyPr>
+                    </wps:wsp>
+                  </a:graphicData>
+                </a:graphic>
+              </wp:anchor>
+            </w:drawing>
+          </mc:Choice>
+          <mc:Fallback>
+            <w:pict>
+              <v:rect w14:anchorId="77B69DAF" id="Rectangle 1" o:spid="_x0000_s1035" style="position:absolute;left:0;text-align:left;margin-left:-3.35pt;margin-top:46.3pt;width:86.25pt;height:44.15pt;z-index:251660288;visibility:visible;mso-wrap-style:square;mso-wrap-distance-left:9pt;mso-wrap-distance-top:0;mso-wrap-distance-right:9pt;mso-wrap-distance-bottom:0;mso-position-horizontal:absolute;mso-position-horizontal-relative:text;mso-position-vertical:absolute;mso-position-vertical-relative:text;v-text-anchor:middle" o:gfxdata="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" fillcolor="#ed7d31 [3205]" stroked="f">
+                <v:textbox>
+                  <w:txbxContent>
+                    <w:p>
+                      <w:pPr>
+                        <w:jc w:val="center"/>
+                      </w:pPr>
+                      <w:r>
+                        <w:t>0303</w:t>
+                      </w:r>
+                    </w:p>
+                  </w:txbxContent>
+                </v:textbox>
+              </v:rect>
+            </w:pict>
+          </mc:Fallback>
+        </mc:AlternateContent>
+      </w:r>
+      <w:r>
+        <w:rPr>
+          <w:noProof/>
+        </w:rPr>
+        <mc:AlternateContent>
+          <mc:Choice Requires="wps">
+            <w:drawing>
+              <wp:anchor distT="0" distB="0" distL="114300" distR="114300" simplePos="0" relativeHeight="251662336" behindDoc="0" locked="0" layoutInCell="1" allowOverlap="1" wp14:anchorId="3D2D14AC" wp14:editId="0F9F7767">
+                <wp:simplePos x="0" y="0"/>
+                <wp:positionH relativeFrom="column">
+                  <wp:posOffset>-50165</wp:posOffset>
+                </wp:positionH>
+                <wp:positionV relativeFrom="paragraph">
+                  <wp:posOffset>1466215</wp:posOffset>
+                </wp:positionV>
+                <wp:extent cx="1095375" cy="560705"/>
+                <wp:effectExtent l="0" t="0" r="9525" b="0"/>
+                <wp:wrapNone/>
+                <wp:docPr id="745686099" name="Rectangle 1"/>
+                <wp:cNvGraphicFramePr/>
+                <a:graphic xmlns:a="http://schemas.openxmlformats.org/drawingml/2006/main">
+                  <a:graphicData uri="http://schemas.microsoft.com/office/word/2010/wordprocessingShape">
+                    <wps:wsp>
+                      <wps:cNvSpPr/>
+                      <wps:spPr>
+                        <a:xfrm>
+                          <a:off x="0" y="0"/>
+                          <a:ext cx="1095375" cy="560705"/>
+                        </a:xfrm>
+                        <a:prstGeom prst="rect">
+                          <a:avLst/>
+                        </a:prstGeom>
+                        <a:solidFill>
+                          <a:schemeClr val="accent2"/>
+                        </a:solidFill>
+                        <a:ln>
+                          <a:noFill/>
+                        </a:ln>
+                      </wps:spPr>
+                      <wps:style>
+                        <a:lnRef idx="0">
+                          <a:scrgbClr r="0" g="0" b="0"/>
+                        </a:lnRef>
+                        <a:fillRef idx="0">
+                          <a:scrgbClr r="0" g="0" b="0"/>
+                        </a:fillRef>
+                        <a:effectRef idx="0">
+                          <a:scrgbClr r="0" g="0" b="0"/>
+                        </a:effectRef>
+                        <a:fontRef idx="minor">
+                          <a:schemeClr val="lt1"/>
+                        </a:fontRef>
+                      </wps:style>
+                      <wps:txbx>
+                        <w:txbxContent>
+                          <w:p>
+                            <w:pPr>
+                              <w:jc w:val="center"/>
+                            </w:pPr>
+                            <w:r>
+                              <w:t>0404</w:t>
+                            </w:r>
+                          </w:p>
+                        </w:txbxContent>
+                      </wps:txbx>
+                      <wps:bodyPr rot="0" spcFirstLastPara="0" vertOverflow="overflow" horzOverflow="overflow" vert="horz" wrap="square" lIns="91440" tIns="45720" rIns="91440" bIns="45720" numCol="1" spcCol="0" rtlCol="0" fromWordArt="0" anchor="ctr" anchorCtr="0" forceAA="0" compatLnSpc="1">
+                        <a:prstTxWarp prst="textNoShape">
+                          <a:avLst/>
+                        </a:prstTxWarp>
+                        <a:noAutofit/>
+                      </wps:bodyPr>
+                    </wps:wsp>
+                  </a:graphicData>
+                </a:graphic>
+              </wp:anchor>
+            </w:drawing>
+          </mc:Choice>
+          <mc:Fallback>
+            <w:pict>
+              <v:rect w14:anchorId="3D2D14AC" id="_x0000_s1036" style="position:absolute;left:0;text-align:left;margin-left:-3.95pt;margin-top:115.45pt;width:86.25pt;height:44.15pt;z-index:251662336;visibility:visible;mso-wrap-style:square;mso-wrap-distance-left:9pt;mso-wrap-distance-top:0;mso-wrap-distance-right:9pt;mso-wrap-distance-bottom:0;mso-position-horizontal:absolute;mso-position-horizontal-relative:text;mso-position-vertical:absolute;mso-position-vertical-relative:text;v-text-anchor:middle" o:gfxdata="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" fillcolor="#ed7d31 [3205]" stroked="f">
+                <v:textbox>
+                  <w:txbxContent>
+                    <w:p>
+                      <w:pPr>
+                        <w:jc w:val="center"/>
+                      </w:pPr>
+                      <w:r>
+                        <w:t>0404</w:t>
+                      </w:r>
+                    </w:p>
+                  </w:txbxContent>
+                </v:textbox>
+              </v:rect>
+            </w:pict>
+          </mc:Fallback>
+        </mc:AlternateContent>
+      </w:r>
+      <w:r>
+        <w:rPr>
+          <w:noProof/>
+        </w:rPr>
+        <mc:AlternateContent>
+          <mc:Choice Requires="wps">
+            <w:drawing>
+              <wp:anchor distT="0" distB="0" distL="114300" distR="114300" simplePos="0" relativeHeight="251664384" behindDoc="0" locked="0" layoutInCell="1" allowOverlap="1" wp14:anchorId="7A92DE87" wp14:editId="229A2C3A">
+                <wp:simplePos x="0" y="0"/>
+                <wp:positionH relativeFrom="column">
+                  <wp:posOffset>-50165</wp:posOffset>
+                </wp:positionH>
+                <wp:positionV relativeFrom="paragraph">
+                  <wp:posOffset>2406015</wp:posOffset>
+                </wp:positionV>
+                <wp:extent cx="1095375" cy="560705"/>
+                <wp:effectExtent l="0" t="0" r="9525" b="0"/>
+                <wp:wrapNone/>
+                <wp:docPr id="1397713402" name="Rectangle 1"/>
+                <wp:cNvGraphicFramePr/>
+                <a:graphic xmlns:a="http://schemas.openxmlformats.org/drawingml/2006/main">
+                  <a:graphicData uri="http://schemas.microsoft.com/office/word/2010/wordprocessingShape">
+                    <wps:wsp>
+                      <wps:cNvSpPr/>
+                      <wps:spPr>
+                        <a:xfrm>
+                          <a:off x="0" y="0"/>
+                          <a:ext cx="1095375" cy="560705"/>
+                        </a:xfrm>
+                        <a:prstGeom prst="rect">
+                          <a:avLst/>
+                        </a:prstGeom>
+                        <a:solidFill>
+                          <a:schemeClr val="accent2"/>
+                        </a:solidFill>
+                        <a:ln>
+                          <a:noFill/>
+                        </a:ln>
+                      </wps:spPr>
+                      <wps:style>
+                        <a:lnRef idx="0">
+                          <a:scrgbClr r="0" g="0" b="0"/>
+                        </a:lnRef>
+                        <a:fillRef idx="0">
+                          <a:scrgbClr r="0" g="0" b="0"/>
+                        </a:fillRef>
+                        <a:effectRef idx="0">
+                          <a:scrgbClr r="0" g="0" b="0"/>
+                        </a:effectRef>
+                        <a:fontRef idx="minor">
+                          <a:schemeClr val="lt1"/>
+                        </a:fontRef>
+                      </wps:style>
+                      <wps:txbx>
+                        <w:txbxContent>
+                          <w:p>
+                            <w:pPr>
+                              <w:jc w:val="center"/>
+                            </w:pPr>
+                            <w:r>
+                              <w:t>0505</w:t>
+                            </w:r>
+                          </w:p>
+                        </w:txbxContent>
+                      </wps:txbx>
+                      <wps:bodyPr rot="0" spcFirstLastPara="0" vertOverflow="overflow" horzOverflow="overflow" vert="horz" wrap="square" lIns="91440" tIns="45720" rIns="91440" bIns="45720" numCol="1" spcCol="0" rtlCol="0" fromWordArt="0" anchor="ctr" anchorCtr="0" forceAA="0" compatLnSpc="1">
+                        <a:prstTxWarp prst="textNoShape">
+                          <a:avLst/>
+                        </a:prstTxWarp>
+                        <a:noAutofit/>
+                      </wps:bodyPr>
+                    </wps:wsp>
+                  </a:graphicData>
+                </a:graphic>
+              </wp:anchor>
+            </w:drawing>
+          </mc:Choice>
+          <mc:Fallback>
+            <w:pict>
+              <v:rect w14:anchorId="7A92DE87" id="_x0000_s1037" style="position:absolute;left:0;text-align:left;margin-left:-3.95pt;margin-top:189.45pt;width:86.25pt;height:44.15pt;z-index:251664384;visibility:visible;mso-wrap-style:square;mso-wrap-distance-left:9pt;mso-wrap-distance-top:0;mso-wrap-distance-right:9pt;mso-wrap-distance-bottom:0;mso-position-horizontal:absolute;mso-position-horizontal-relative:text;mso-position-vertical:absolute;mso-position-vertical-relative:text;v-text-anchor:middle" o:gfxdata="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" fillcolor="#ed7d31 [3205]" stroked="f">
+                <v:textbox>
+                  <w:txbxContent>
+                    <w:p>
+                      <w:pPr>
+                        <w:jc w:val="center"/>
+                      </w:pPr>
+                      <w:r>
+                        <w:t>0505</w:t>
+                      </w:r>
+                    </w:p>
+                  </w:txbxContent>
+                </v:textbox>
+              </v:rect>
+            </w:pict>
+          </mc:Fallback>
+        </mc:AlternateContent>
+      </w:r>
+      <w:r>
+        <w:rPr>
+          <w:noProof/>
+        </w:rPr>
+        <mc:AlternateContent>
+          <mc:Choice Requires="wps">
+            <w:drawing>
+              <wp:anchor distT="45720" distB="45720" distL="114300" distR="114300" simplePos="0" relativeHeight="251666432" behindDoc="0" locked="0" layoutInCell="1" allowOverlap="1" wp14:anchorId="61226390" wp14:editId="46541443">
+                <wp:simplePos x="0" y="0"/>
+                <wp:positionH relativeFrom="column">
+                  <wp:posOffset>-52070</wp:posOffset>
+                </wp:positionH>
+                <wp:positionV relativeFrom="paragraph">
+                  <wp:posOffset>260350</wp:posOffset>
+                </wp:positionV>
+                <wp:extent cx="1129665" cy="327660"/>
+                <wp:effectExtent l="0" t="0" r="0" b="0"/>
+                <wp:wrapSquare wrapText="bothSides"/>
+                <wp:docPr id="217" name="Text Box 2"/>
+                <wp:cNvGraphicFramePr>
+                  <a:graphicFrameLocks xmlns:a="http://schemas.openxmlformats.org/drawingml/2006/main"/>
+                </wp:cNvGraphicFramePr>
+                <a:graphic xmlns:a="http://schemas.openxmlformats.org/drawingml/2006/main">
+                  <a:graphicData uri="http://schemas.microsoft.com/office/word/2010/wordprocessingShape">
+                    <wps:wsp>
+                      <wps:cNvSpPr txBox="1">
+                        <a:spLocks noChangeArrowheads="1"/>
+                      </wps:cNvSpPr>
+                      <wps:spPr bwMode="auto">
+                        <a:xfrm>
+                          <a:off x="0" y="0"/>
+                          <a:ext cx="1129665" cy="327660"/>
+                        </a:xfrm>
+                        <a:prstGeom prst="rect">
+                          <a:avLst/>
+                        </a:prstGeom>
+                        <a:solidFill>
+                          <a:srgbClr val="FFFFFF"/>
+                        </a:solidFill>
+                        <a:ln w="9525">
+                          <a:noFill/>
+                          <a:miter lim="800000"/>
+                          <a:headEnd/>
+                          <a:tailEnd/>
+                        </a:ln>
+                      </wps:spPr>
+                      <wps:txbx>
+                        <w:txbxContent>
+                          <w:p>
+                            <w:r>
+                              <w:t>Máy ép nhựa</w:t>
+                            </w:r>
+                          </w:p>
+                        </w:txbxContent>
+                      </wps:txbx>
+                      <wps:bodyPr rot="0" vert="horz" wrap="square" lIns="91440" tIns="45720" rIns="91440" bIns="45720" anchor="t" anchorCtr="0">
+                        <a:noAutofit/>
+                      </wps:bodyPr>
+                    </wps:wsp>
+                  </a:graphicData>
+                </a:graphic>
+                <wp14:sizeRelH relativeFrom="margin">
+                  <wp14:pctWidth>0</wp14:pctWidth>
+                </wp14:sizeRelH>
+                <wp14:sizeRelV relativeFrom="margin">
+                  <wp14:pctHeight>0</wp14:pctHeight>
+                </wp14:sizeRelV>
+              </wp:anchor>
+            </w:drawing>
+          </mc:Choice>
+          <mc:Fallback>
+            <w:pict>
+              <v:shape w14:anchorId="61226390" id="_x0000_s1038" type="#_x0000_t202" style="position:absolute;left:0;text-align:left;margin-left:-4.1pt;margin-top:20.5pt;width:88.95pt;height:25.8pt;z-index:251666432;visibility:visible;mso-wrap-style:square;mso-width-percent:0;mso-height-percent:0;mso-wrap-distance-left:9pt;mso-wrap-distance-top:3.6pt;mso-wrap-distance-right:9pt;mso-wrap-distance-bottom:3.6pt;mso-position-horizontal:absolute;mso-position-horizontal-relative:text;mso-position-vertical:absolute;mso-position-vertical-relative:text;mso-width-percent:0;mso-height-percent:0;mso-width-relative:margin;mso-height-relative:margin;v-text-anchor:top" o:gfxdata="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" stroked="f">
+                <v:textbox>
+                  <w:txbxContent>
+                    <w:p>
+                      <w:r>
+                        <w:t>Máy ép nhựa</w:t>
+                      </w:r>
+                    </w:p>
+                  </w:txbxContent>
+                </v:textbox>
+                <w10:wrap type="square"/>
+              </v:shape>
+            </w:pict>
+          </mc:Fallback>
+        </mc:AlternateContent>
+      </w:r>
+      <w:r>
+        <w:rPr>
+          <w:noProof/>
+        </w:rPr>
+        <mc:AlternateContent>
+          <mc:Choice Requires="wps">
+            <w:drawing>
+              <wp:anchor distT="0" distB="0" distL="114300" distR="114300" simplePos="0" relativeHeight="251667456" behindDoc="0" locked="0" layoutInCell="1" allowOverlap="1" wp14:anchorId="198CD829" wp14:editId="293A8D86">
+                <wp:simplePos x="0" y="0"/>
+                <wp:positionH relativeFrom="column">
+                  <wp:posOffset>1370965</wp:posOffset>
+                </wp:positionH>
+                <wp:positionV relativeFrom="paragraph">
+                  <wp:posOffset>682625</wp:posOffset>
+                </wp:positionV>
+                <wp:extent cx="1121410" cy="353060"/>
+                <wp:effectExtent l="0" t="0" r="2540" b="8890"/>
+                <wp:wrapNone/>
+                <wp:docPr id="279546146" name="Rectangle: Rounded Corners 2"/>
+                <wp:cNvGraphicFramePr/>
+                <a:graphic xmlns:a="http://schemas.openxmlformats.org/drawingml/2006/main">
+                  <a:graphicData uri="http://schemas.microsoft.com/office/word/2010/wordprocessingShape">
+                    <wps:wsp>
+                      <wps:cNvSpPr/>
+                      <wps:spPr>
+                        <a:xfrm>
+                          <a:off x="0" y="0"/>
+                          <a:ext cx="1121410" cy="353060"/>
+                        </a:xfrm>
+                        <a:prstGeom prst="roundRect">
+                          <a:avLst/>
+                        </a:prstGeom>
+                        <a:solidFill>
+                          <a:schemeClr val="accent1"/>
+                        </a:solidFill>
+                        <a:ln>
+                          <a:noFill/>
+                        </a:ln>
+                      </wps:spPr>
+                      <wps:style>
+                        <a:lnRef idx="0">
+                          <a:scrgbClr r="0" g="0" b="0"/>
+                        </a:lnRef>
+                        <a:fillRef idx="0">
+                          <a:scrgbClr r="0" g="0" b="0"/>
+                        </a:fillRef>
+                        <a:effectRef idx="0">
+                          <a:scrgbClr r="0" g="0" b="0"/>
+                        </a:effectRef>
+                        <a:fontRef idx="minor">
+                          <a:schemeClr val="lt1"/>
+                        </a:fontRef>
+                      </wps:style>
+                      <wps:txbx>
+                        <w:txbxContent>
+                          <w:p>
+                            <w:pPr>
+                              <w:jc w:val="center"/>
+                            </w:pPr>
+                            <w:r>
+                              <w:t>IOT device</w:t>
+                            </w:r>
+                          </w:p>
+                        </w:txbxContent>
+                      </wps:txbx>
+                      <wps:bodyPr rot="0" spcFirstLastPara="0" vertOverflow="overflow" horzOverflow="overflow" vert="horz" wrap="square" lIns="91440" tIns="45720" rIns="91440" bIns="45720" numCol="1" spcCol="0" rtlCol="0" fromWordArt="0" anchor="ctr" anchorCtr="0" forceAA="0" compatLnSpc="1">
+                        <a:prstTxWarp prst="textNoShape">
+                          <a:avLst/>
+                        </a:prstTxWarp>
+                        <a:noAutofit/>
+                      </wps:bodyPr>
+                    </wps:wsp>
+                  </a:graphicData>
+                </a:graphic>
+                <wp14:sizeRelH relativeFrom="margin">
+                  <wp14:pctWidth>0</wp14:pctWidth>
+                </wp14:sizeRelH>
+              </wp:anchor>
+            </w:drawing>
+          </mc:Choice>
+          <mc:Fallback>
+            <w:pict>
+              <v:roundrect w14:anchorId="198CD829" id="_x0000_s1039" style="position:absolute;left:0;text-align:left;margin-left:107.95pt;margin-top:53.75pt;width:88.3pt;height:27.8pt;z-index:251667456;visibility:visible;mso-wrap-style:square;mso-width-percent:0;mso-wrap-distance-left:9pt;mso-wrap-distance-top:0;mso-wrap-distance-right:9pt;mso-wrap-distance-bottom:0;mso-position-horizontal:absolute;mso-position-horizontal-relative:text;mso-position-vertical:absolute;mso-position-vertical-relative:text;mso-width-percent:0;mso-width-relative:margin;v-text-anchor:middle" arcsize="10923f" o:gfxdata="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" fillcolor="#4472c4 [3204]" stroked="f">
+                <v:textbox>
+                  <w:txbxContent>
+                    <w:p>
+                      <w:pPr>
+                        <w:jc w:val="center"/>
+                      </w:pPr>
+                      <w:r>
+                        <w:t>IOT device</w:t>
+                      </w:r>
+                    </w:p>
+                  </w:txbxContent>
+                </v:textbox>
+              </v:roundrect>
+            </w:pict>
+          </mc:Fallback>
+        </mc:AlternateContent>
+      </w:r>
+      <w:r>
+        <w:rPr>
+          <w:noProof/>
+        </w:rPr>
+        <mc:AlternateContent>
+          <mc:Choice Requires="wps">
+            <w:drawing>
+              <wp:anchor distT="0" distB="0" distL="114300" distR="114300" simplePos="0" relativeHeight="251669504" behindDoc="0" locked="0" layoutInCell="1" allowOverlap="1" wp14:anchorId="68CD5099" wp14:editId="5B6ABF52">
+                <wp:simplePos x="0" y="0"/>
+                <wp:positionH relativeFrom="column">
+                  <wp:posOffset>1370965</wp:posOffset>
+                </wp:positionH>
+                <wp:positionV relativeFrom="paragraph">
+                  <wp:posOffset>1570355</wp:posOffset>
+                </wp:positionV>
+                <wp:extent cx="1121410" cy="353060"/>
+                <wp:effectExtent l="0" t="0" r="2540" b="8890"/>
+                <wp:wrapNone/>
+                <wp:docPr id="1311995449" name="Rectangle: Rounded Corners 2"/>
+                <wp:cNvGraphicFramePr/>
+                <a:graphic xmlns:a="http://schemas.openxmlformats.org/drawingml/2006/main">
+                  <a:graphicData uri="http://schemas.microsoft.com/office/word/2010/wordprocessingShape">
+                    <wps:wsp>
+                      <wps:cNvSpPr/>
+                      <wps:spPr>
+                        <a:xfrm>
+                          <a:off x="0" y="0"/>
+                          <a:ext cx="1121410" cy="353060"/>
+                        </a:xfrm>
+                        <a:prstGeom prst="roundRect">
+                          <a:avLst/>
+                        </a:prstGeom>
+                        <a:solidFill>
+                          <a:schemeClr val="accent1"/>
+                        </a:solidFill>
+                        <a:ln>
+                          <a:noFill/>
+                        </a:ln>
+                      </wps:spPr>
+                      <wps:style>
+                        <a:lnRef idx="0">
+                          <a:scrgbClr r="0" g="0" b="0"/>
+                        </a:lnRef>
+                        <a:fillRef idx="0">
+                          <a:scrgbClr r="0" g="0" b="0"/>
+                        </a:fillRef>
+                        <a:effectRef idx="0">
+                          <a:scrgbClr r="0" g="0" b="0"/>
+                        </a:effectRef>
+                        <a:fontRef idx="minor">
+                          <a:schemeClr val="lt1"/>
+                        </a:fontRef>
+                      </wps:style>
+                      <wps:txbx>
+                        <w:txbxContent>
+                          <w:p>
+                            <w:pPr>
+                              <w:jc w:val="center"/>
+                            </w:pPr>
+                            <w:r>
+                              <w:t>IOT device</w:t>
+                            </w:r>
+                          </w:p>
+                        </w:txbxContent>
+                      </wps:txbx>
+                      <wps:bodyPr rot="0" spcFirstLastPara="0" vertOverflow="overflow" horzOverflow="overflow" vert="horz" wrap="square" lIns="91440" tIns="45720" rIns="91440" bIns="45720" numCol="1" spcCol="0" rtlCol="0" fromWordArt="0" anchor="ctr" anchorCtr="0" forceAA="0" compatLnSpc="1">
+                        <a:prstTxWarp prst="textNoShape">
+                          <a:avLst/>
+                        </a:prstTxWarp>
+                        <a:noAutofit/>
+                      </wps:bodyPr>
+                    </wps:wsp>
+                  </a:graphicData>
+                </a:graphic>
+                <wp14:sizeRelH relativeFrom="margin">
+                  <wp14:pctWidth>0</wp14:pctWidth>
+                </wp14:sizeRelH>
+              </wp:anchor>
+            </w:drawing>
+          </mc:Choice>
+          <mc:Fallback>
+            <w:pict>
+              <v:roundrect w14:anchorId="68CD5099" id="_x0000_s1040" style="position:absolute;left:0;text-align:left;margin-left:107.95pt;margin-top:123.65pt;width:88.3pt;height:27.8pt;z-index:251669504;visibility:visible;mso-wrap-style:square;mso-width-percent:0;mso-wrap-distance-left:9pt;mso-wrap-distance-top:0;mso-wrap-distance-right:9pt;mso-wrap-distance-bottom:0;mso-position-horizontal:absolute;mso-position-horizontal-relative:text;mso-position-vertical:absolute;mso-position-vertical-relative:text;mso-width-percent:0;mso-width-relative:margin;v-text-anchor:middle" arcsize="10923f" o:gfxdata="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" fillcolor="#4472c4 [3204]" stroked="f">
+                <v:textbox>
+                  <w:txbxContent>
+                    <w:p>
+                      <w:pPr>
+                        <w:jc w:val="center"/>
+                      </w:pPr>
+                      <w:r>
+                        <w:t>IOT device</w:t>
+                      </w:r>
+                    </w:p>
+                  </w:txbxContent>
+                </v:textbox>
+              </v:roundrect>
+            </w:pict>
+          </mc:Fallback>
+        </mc:AlternateContent>
+      </w:r>
+      <w:r>
+        <w:rPr>
+          <w:noProof/>
+        </w:rPr>
+        <mc:AlternateContent>
+          <mc:Choice Requires="wps">
+            <w:drawing>
+              <wp:anchor distT="0" distB="0" distL="114300" distR="114300" simplePos="0" relativeHeight="251671552" behindDoc="0" locked="0" layoutInCell="1" allowOverlap="1" wp14:anchorId="573B9EC7" wp14:editId="5700F959">
+                <wp:simplePos x="0" y="0"/>
+                <wp:positionH relativeFrom="column">
+                  <wp:posOffset>1362075</wp:posOffset>
+                </wp:positionH>
+                <wp:positionV relativeFrom="paragraph">
+                  <wp:posOffset>2519045</wp:posOffset>
+                </wp:positionV>
+                <wp:extent cx="1121410" cy="353060"/>
+                <wp:effectExtent l="0" t="0" r="2540" b="8890"/>
+                <wp:wrapNone/>
+                <wp:docPr id="102054852" name="Rectangle: Rounded Corners 2"/>
+                <wp:cNvGraphicFramePr/>
+                <a:graphic xmlns:a="http://schemas.openxmlformats.org/drawingml/2006/main">
+                  <a:graphicData uri="http://schemas.microsoft.com/office/word/2010/wordprocessingShape">
+                    <wps:wsp>
+                      <wps:cNvSpPr/>
+                      <wps:spPr>
+                        <a:xfrm>
+                          <a:off x="0" y="0"/>
+                          <a:ext cx="1121410" cy="353060"/>
+                        </a:xfrm>
+                        <a:prstGeom prst="roundRect">
+                          <a:avLst/>
+                        </a:prstGeom>
+                        <a:solidFill>
+                          <a:schemeClr val="accent1"/>
+                        </a:solidFill>
+                        <a:ln>
+                          <a:noFill/>
+                        </a:ln>
+                      </wps:spPr>
+                      <wps:style>
+                        <a:lnRef idx="0">
+                          <a:scrgbClr r="0" g="0" b="0"/>
+                        </a:lnRef>
+                        <a:fillRef idx="0">
+                          <a:scrgbClr r="0" g="0" b="0"/>
+                        </a:fillRef>
+                        <a:effectRef idx="0">
+                          <a:scrgbClr r="0" g="0" b="0"/>
+                        </a:effectRef>
+                        <a:fontRef idx="minor">
+                          <a:schemeClr val="lt1"/>
+                        </a:fontRef>
+                      </wps:style>
+                      <wps:txbx>
+                        <w:txbxContent>
+                          <w:p>
+                            <w:pPr>
+                              <w:jc w:val="center"/>
+                            </w:pPr>
+                            <w:r>
+                              <w:t>IOT device</w:t>
+                            </w:r>
+                          </w:p>
+                        </w:txbxContent>
+                      </wps:txbx>
+                      <wps:bodyPr rot="0" spcFirstLastPara="0" vertOverflow="overflow" horzOverflow="overflow" vert="horz" wrap="square" lIns="91440" tIns="45720" rIns="91440" bIns="45720" numCol="1" spcCol="0" rtlCol="0" fromWordArt="0" anchor="ctr" anchorCtr="0" forceAA="0" compatLnSpc="1">
+                        <a:prstTxWarp prst="textNoShape">
+                          <a:avLst/>
+                        </a:prstTxWarp>
+                        <a:noAutofit/>
+                      </wps:bodyPr>
+                    </wps:wsp>
+                  </a:graphicData>
+                </a:graphic>
+                <wp14:sizeRelH relativeFrom="margin">
+                  <wp14:pctWidth>0</wp14:pctWidth>
+                </wp14:sizeRelH>
+              </wp:anchor>
+            </w:drawing>
+          </mc:Choice>
+          <mc:Fallback>
+            <w:pict>
+              <v:roundrect w14:anchorId="573B9EC7" id="_x0000_s1041" style="position:absolute;left:0;text-align:left;margin-left:107.25pt;margin-top:198.35pt;width:88.3pt;height:27.8pt;z-index:251671552;visibility:visible;mso-wrap-style:square;mso-width-percent:0;mso-wrap-distance-left:9pt;mso-wrap-distance-top:0;mso-wrap-distance-right:9pt;mso-wrap-distance-bottom:0;mso-position-horizontal:absolute;mso-position-horizontal-relative:text;mso-position-vertical:absolute;mso-position-vertical-relative:text;mso-width-percent:0;mso-width-relative:margin;v-text-anchor:middle" arcsize="10923f" o:gfxdata="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" fillcolor="#4472c4 [3204]" stroked="f">
+                <v:textbox>
+                  <w:txbxContent>
+                    <w:p>
+                      <w:pPr>
+                        <w:jc w:val="center"/>
+                      </w:pPr>
+                      <w:r>
+                        <w:t>IOT device</w:t>
+                      </w:r>
+                    </w:p>
+                  </w:txbxContent>
+                </v:textbox>
+              </v:roundrect>
+            </w:pict>
+          </mc:Fallback>
+        </mc:AlternateContent>
+      </w:r>
+      <w:r>
+        <w:rPr>
+          <w:noProof/>
+        </w:rPr>
+        <mc:AlternateContent>
+          <mc:Choice Requires="wps">
+            <w:drawing>
+              <wp:anchor distT="0" distB="0" distL="114300" distR="114300" simplePos="0" relativeHeight="251672576" behindDoc="0" locked="0" layoutInCell="1" allowOverlap="1" wp14:anchorId="40926916" wp14:editId="60206CF6">
+                <wp:simplePos x="0" y="0"/>
+                <wp:positionH relativeFrom="column">
+                  <wp:posOffset>2845435</wp:posOffset>
+                </wp:positionH>
+                <wp:positionV relativeFrom="paragraph">
+                  <wp:posOffset>1458595</wp:posOffset>
+                </wp:positionV>
+                <wp:extent cx="1379855" cy="603250"/>
+                <wp:effectExtent l="0" t="0" r="10795" b="25400"/>
+                <wp:wrapNone/>
+                <wp:docPr id="619599660" name="Oval 3"/>
+                <wp:cNvGraphicFramePr/>
+                <a:graphic xmlns:a="http://schemas.openxmlformats.org/drawingml/2006/main">
+                  <a:graphicData uri="http://schemas.microsoft.com/office/word/2010/wordprocessingShape">
+                    <wps:wsp>
+                      <wps:cNvSpPr/>
+                      <wps:spPr>
+                        <a:xfrm>
+                          <a:off x="0" y="0"/>
+                          <a:ext cx="1379855" cy="603250"/>
+                        </a:xfrm>
+                        <a:prstGeom prst="ellipse">
+                          <a:avLst/>
+                        </a:prstGeom>
+                      </wps:spPr>
+                      <wps:style>
+                        <a:lnRef idx="2">
+                          <a:schemeClr val="accent6">
+                            <a:shade val="15000"/>
+                          </a:schemeClr>
+                        </a:lnRef>
+                        <a:fillRef idx="1">
+                          <a:schemeClr val="accent6"/>
+                        </a:fillRef>
+                        <a:effectRef idx="0">
+                          <a:schemeClr val="accent6"/>
+                        </a:effectRef>
+                        <a:fontRef idx="minor">
+                          <a:schemeClr val="lt1"/>
+                        </a:fontRef>
+                      </wps:style>
+                      <wps:txbx>
+                        <w:txbxContent>
+                          <w:p>
+                            <w:pPr>
+                              <w:jc w:val="center"/>
+                            </w:pPr>
+                            <w:r>
+                              <w:t>Gateway</w:t>
+                            </w:r>
+                          </w:p>
+                        </w:txbxContent>
+                      </wps:txbx>
+                      <wps:bodyPr rot="0" spcFirstLastPara="0" vertOverflow="overflow" horzOverflow="overflow" vert="horz" wrap="square" lIns="91440" tIns="45720" rIns="91440" bIns="45720" numCol="1" spcCol="0" rtlCol="0" fromWordArt="0" anchor="ctr" anchorCtr="0" forceAA="0" compatLnSpc="1">
+                        <a:prstTxWarp prst="textNoShape">
+                          <a:avLst/>
+                        </a:prstTxWarp>
+                        <a:noAutofit/>
+                      </wps:bodyPr>
+                    </wps:wsp>
+                  </a:graphicData>
+                </a:graphic>
+              </wp:anchor>
+            </w:drawing>
+          </mc:Choice>
+          <mc:Fallback>
+            <w:pict>
+              <v:oval w14:anchorId="40926916" id="Oval 3" o:spid="_x0000_s1042" style="position:absolute;left:0;text-align:left;margin-left:224.05pt;margin-top:114.85pt;width:108.65pt;height:47.5pt;z-index:251672576;visibility:visible;mso-wrap-style:square;mso-wrap-distance-left:9pt;mso-wrap-distance-top:0;mso-wrap-distance-right:9pt;mso-wrap-distance-bottom:0;mso-position-horizontal:absolute;mso-position-horizontal-relative:text;mso-position-vertical:absolute;mso-position-vertical-relative:text;v-text-anchor:middle" o:gfxdata="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" fillcolor="#70ad47 [3209]" strokecolor="#10190a [489]" strokeweight="1pt">
+                <v:stroke joinstyle="miter"/>
+                <v:textbox>
+                  <w:txbxContent>
+                    <w:p>
+                      <w:pPr>
+                        <w:jc w:val="center"/>
+                      </w:pPr>
+                      <w:r>
+                        <w:t>Gateway</w:t>
+                      </w:r>
+                    </w:p>
+                  </w:txbxContent>
+                </v:textbox>
+              </v:oval>
+            </w:pict>
+          </mc:Fallback>
+        </mc:AlternateContent>
+      </w:r>
+      <w:r>
+        <w:rPr>
+          <w:noProof/>
+        </w:rPr>
+        <mc:AlternateContent>
+          <mc:Choice Requires="wps">
+            <w:drawing>
+              <wp:anchor distT="0" distB="0" distL="114300" distR="114300" simplePos="0" relativeHeight="251674624" behindDoc="0" locked="0" layoutInCell="1" allowOverlap="1" wp14:anchorId="7E60BA83" wp14:editId="761D6108">
+                <wp:simplePos x="0" y="0"/>
+                <wp:positionH relativeFrom="column">
+                  <wp:posOffset>1033780</wp:posOffset>
+                </wp:positionH>
+                <wp:positionV relativeFrom="paragraph">
+                  <wp:posOffset>873125</wp:posOffset>
+                </wp:positionV>
+                <wp:extent cx="336550" cy="0"/>
+                <wp:effectExtent l="0" t="76200" r="25400" b="95250"/>
+                <wp:wrapNone/>
+                <wp:docPr id="444530930" name="Straight Arrow Connector 6"/>
+                <wp:cNvGraphicFramePr/>
+                <a:graphic xmlns:a="http://schemas.openxmlformats.org/drawingml/2006/main">
+                  <a:graphicData uri="http://schemas.microsoft.com/office/word/2010/wordprocessingShape">
+                    <wps:wsp>
+                      <wps:cNvCnPr/>
+                      <wps:spPr>
+                        <a:xfrm>
+                          <a:off x="0" y="0"/>
+                          <a:ext cx="336550" cy="0"/>
+                        </a:xfrm>
+                        <a:prstGeom prst="straightConnector1">
+                          <a:avLst/>
+                        </a:prstGeom>
+                        <a:ln>
+                          <a:tailEnd type="triangle"/>
+                        </a:ln>
+                      </wps:spPr>
+                      <wps:style>
+                        <a:lnRef idx="1">
+                          <a:schemeClr val="accent1"/>
+                        </a:lnRef>
+                        <a:fillRef idx="0">
+                          <a:schemeClr val="accent1"/>
+                        </a:fillRef>
+                        <a:effectRef idx="0">
+                          <a:schemeClr val="accent1"/>
+                        </a:effectRef>
+                        <a:fontRef idx="minor">
+                          <a:schemeClr val="tx1"/>
+                        </a:fontRef>
+                      </wps:style>
+                      <wps:bodyPr/>
+                    </wps:wsp>
+                  </a:graphicData>
+                </a:graphic>
+              </wp:anchor>
+            </w:drawing>
+          </mc:Choice>
+          <mc:Fallback>
+            <w:pict>
+              <v:shape w14:anchorId="4FFC42EF" id="Straight Arrow Connector 6" o:spid="_x0000_s1026" type="#_x0000_t32" style="position:absolute;margin-left:81.4pt;margin-top:68.75pt;width:26.5pt;height:0;z-index:251674624;visibility:visible;mso-wrap-style:square;mso-wrap-distance-left:9pt;mso-wrap-distance-top:0;mso-wrap-distance-right:9pt;mso-wrap-distance-bottom:0;mso-position-horizontal:absolute;mso-position-horizontal-relative:text;mso-position-vertical:absolute;mso-position-vertical-relative:text" o:gfxdata="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" strokecolor="#4472c4 [3204]" strokeweight=".5pt">
+                <v:stroke endarrow="block" joinstyle="miter"/>
+              </v:shape>
+            </w:pict>
+          </mc:Fallback>
+        </mc:AlternateContent>
+      </w:r>
+      <w:r>
+        <w:rPr>
+          <w:noProof/>
+        </w:rPr>
+        <mc:AlternateContent>
+          <mc:Choice Requires="wps">
+            <w:drawing>
+              <wp:anchor distT="0" distB="0" distL="114300" distR="114300" simplePos="0" relativeHeight="251676672" behindDoc="0" locked="0" layoutInCell="1" allowOverlap="1" wp14:anchorId="456F6D83" wp14:editId="28739B66">
+                <wp:simplePos x="0" y="0"/>
+                <wp:positionH relativeFrom="column">
+                  <wp:posOffset>1033780</wp:posOffset>
+                </wp:positionH>
+                <wp:positionV relativeFrom="paragraph">
+                  <wp:posOffset>1743710</wp:posOffset>
+                </wp:positionV>
+                <wp:extent cx="336550" cy="0"/>
+                <wp:effectExtent l="0" t="76200" r="25400" b="95250"/>
+                <wp:wrapNone/>
+                <wp:docPr id="717246897" name="Straight Arrow Connector 6"/>
+                <wp:cNvGraphicFramePr/>
+                <a:graphic xmlns:a="http://schemas.openxmlformats.org/drawingml/2006/main">
+                  <a:graphicData uri="http://schemas.microsoft.com/office/word/2010/wordprocessingShape">
+                    <wps:wsp>
+                      <wps:cNvCnPr/>
+                      <wps:spPr>
+                        <a:xfrm>
+                          <a:off x="0" y="0"/>
+                          <a:ext cx="336550" cy="0"/>
+                        </a:xfrm>
+                        <a:prstGeom prst="straightConnector1">
+                          <a:avLst/>
+                        </a:prstGeom>
+                        <a:ln>
+                          <a:tailEnd type="triangle"/>
+                        </a:ln>
+                      </wps:spPr>
+                      <wps:style>
+                        <a:lnRef idx="1">
+                          <a:schemeClr val="accent1"/>
+                        </a:lnRef>
+                        <a:fillRef idx="0">
+                          <a:schemeClr val="accent1"/>
+                        </a:fillRef>
+                        <a:effectRef idx="0">
+                          <a:schemeClr val="accent1"/>
+                        </a:effectRef>
+                        <a:fontRef idx="minor">
+                          <a:schemeClr val="tx1"/>
+                        </a:fontRef>
+                      </wps:style>
+                      <wps:bodyPr/>
+                    </wps:wsp>
+                  </a:graphicData>
+                </a:graphic>
+              </wp:anchor>
+            </w:drawing>
+          </mc:Choice>
+          <mc:Fallback>
+            <w:pict>
+              <v:shape w14:anchorId="24466332" id="Straight Arrow Connector 6" o:spid="_x0000_s1026" type="#_x0000_t32" style="position:absolute;margin-left:81.4pt;margin-top:137.3pt;width:26.5pt;height:0;z-index:251676672;visibility:visible;mso-wrap-style:square;mso-wrap-distance-left:9pt;mso-wrap-distance-top:0;mso-wrap-distance-right:9pt;mso-wrap-distance-bottom:0;mso-position-horizontal:absolute;mso-position-horizontal-relative:text;mso-position-vertical:absolute;mso-position-vertical-relative:text" o:gfxdata="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" strokecolor="#4472c4 [3204]" strokeweight=".5pt">
+                <v:stroke endarrow="block" joinstyle="miter"/>
+              </v:shape>
+            </w:pict>
+          </mc:Fallback>
+        </mc:AlternateContent>
+      </w:r>
+      <w:r>
+        <w:rPr>
+          <w:noProof/>
+        </w:rPr>
+        <mc:AlternateContent>
+          <mc:Choice Requires="wps">
+            <w:drawing>
+              <wp:anchor distT="0" distB="0" distL="114300" distR="114300" simplePos="0" relativeHeight="251678720" behindDoc="0" locked="0" layoutInCell="1" allowOverlap="1" wp14:anchorId="78CE9E47" wp14:editId="151D8492">
+                <wp:simplePos x="0" y="0"/>
+                <wp:positionH relativeFrom="column">
+                  <wp:posOffset>1033780</wp:posOffset>
+                </wp:positionH>
+                <wp:positionV relativeFrom="paragraph">
+                  <wp:posOffset>2683510</wp:posOffset>
+                </wp:positionV>
+                <wp:extent cx="336550" cy="0"/>
+                <wp:effectExtent l="0" t="76200" r="25400" b="95250"/>
+                <wp:wrapNone/>
+                <wp:docPr id="623513494" name="Straight Arrow Connector 6"/>
+                <wp:cNvGraphicFramePr/>
+                <a:graphic xmlns:a="http://schemas.openxmlformats.org/drawingml/2006/main">
+                  <a:graphicData uri="http://schemas.microsoft.com/office/word/2010/wordprocessingShape">
+                    <wps:wsp>
+                      <wps:cNvCnPr/>
+                      <wps:spPr>
+                        <a:xfrm>
+                          <a:off x="0" y="0"/>
+                          <a:ext cx="336550" cy="0"/>
+                        </a:xfrm>
+                        <a:prstGeom prst="straightConnector1">
+                          <a:avLst/>
+                        </a:prstGeom>
+                        <a:ln>
+                          <a:tailEnd type="triangle"/>
+                        </a:ln>
+                      </wps:spPr>
+                      <wps:style>
+                        <a:lnRef idx="1">
+                          <a:schemeClr val="accent1"/>
+                        </a:lnRef>
+                        <a:fillRef idx="0">
+                          <a:schemeClr val="accent1"/>
+                        </a:fillRef>
+                        <a:effectRef idx="0">
+                          <a:schemeClr val="accent1"/>
+                        </a:effectRef>
+                        <a:fontRef idx="minor">
+                          <a:schemeClr val="tx1"/>
+                        </a:fontRef>
+                      </wps:style>
+                      <wps:bodyPr/>
+                    </wps:wsp>
+                  </a:graphicData>
+                </a:graphic>
+              </wp:anchor>
+            </w:drawing>
+          </mc:Choice>
+          <mc:Fallback>
+            <w:pict>
+              <v:shape w14:anchorId="7C3E9294" id="Straight Arrow Connector 6" o:spid="_x0000_s1026" type="#_x0000_t32" style="position:absolute;margin-left:81.4pt;margin-top:211.3pt;width:26.5pt;height:0;z-index:251678720;visibility:visible;mso-wrap-style:square;mso-wrap-distance-left:9pt;mso-wrap-distance-top:0;mso-wrap-distance-right:9pt;mso-wrap-distance-bottom:0;mso-position-horizontal:absolute;mso-position-horizontal-relative:text;mso-position-vertical:absolute;mso-position-vertical-relative:text" o:gfxdata="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" strokecolor="#4472c4 [3204]" strokeweight=".5pt">
+                <v:stroke endarrow="block" joinstyle="miter"/>
+              </v:shape>
+            </w:pict>
+          </mc:Fallback>
+        </mc:AlternateContent>
+      </w:r>
+      <w:r>
+        <w:rPr>
+          <w:noProof/>
+        </w:rPr>
+        <mc:AlternateContent>
+          <mc:Choice Requires="wps">
+            <w:drawing>
+              <wp:anchor distT="0" distB="0" distL="114300" distR="114300" simplePos="0" relativeHeight="251682816" behindDoc="0" locked="0" layoutInCell="1" allowOverlap="1" wp14:anchorId="3DE51D0F" wp14:editId="26F4B702">
+                <wp:simplePos x="0" y="0"/>
+                <wp:positionH relativeFrom="column">
+                  <wp:posOffset>2475230</wp:posOffset>
+                </wp:positionH>
+                <wp:positionV relativeFrom="paragraph">
+                  <wp:posOffset>1951355</wp:posOffset>
+                </wp:positionV>
+                <wp:extent cx="482600" cy="718820"/>
+                <wp:effectExtent l="0" t="38100" r="50800" b="24130"/>
+                <wp:wrapNone/>
+                <wp:docPr id="1629595451" name="Straight Arrow Connector 6"/>
+                <wp:cNvGraphicFramePr/>
+                <a:graphic xmlns:a="http://schemas.openxmlformats.org/drawingml/2006/main">
+                  <a:graphicData uri="http://schemas.microsoft.com/office/word/2010/wordprocessingShape">
+                    <wps:wsp>
+                      <wps:cNvCnPr/>
+                      <wps:spPr>
+                        <a:xfrm flipV="1">
+                          <a:off x="0" y="0"/>
+                          <a:ext cx="482600" cy="718820"/>
+                        </a:xfrm>
+                        <a:prstGeom prst="straightConnector1">
+                          <a:avLst/>
+                        </a:prstGeom>
+                        <a:ln>
+                          <a:tailEnd type="triangle"/>
+                        </a:ln>
+                      </wps:spPr>
+                      <wps:style>
+                        <a:lnRef idx="1">
+                          <a:schemeClr val="accent1"/>
+                        </a:lnRef>
+                        <a:fillRef idx="0">
+                          <a:schemeClr val="accent1"/>
+                        </a:fillRef>
+                        <a:effectRef idx="0">
+                          <a:schemeClr val="accent1"/>
+                        </a:effectRef>
+                        <a:fontRef idx="minor">
+                          <a:schemeClr val="tx1"/>
+                        </a:fontRef>
+                      </wps:style>
+                      <wps:bodyPr/>
+                    </wps:wsp>
+                  </a:graphicData>
+                </a:graphic>
+                <wp14:sizeRelH relativeFrom="margin">
+                  <wp14:pctWidth>0</wp14:pctWidth>
+                </wp14:sizeRelH>
+                <wp14:sizeRelV relativeFrom="margin">
+                  <wp14:pctHeight>0</wp14:pctHeight>
+                </wp14:sizeRelV>
+              </wp:anchor>
+            </w:drawing>
+          </mc:Choice>
+          <mc:Fallback>
+            <w:pict>
+              <v:shape w14:anchorId="7E116C83" id="Straight Arrow Connector 6" o:spid="_x0000_s1026" type="#_x0000_t32" style="position:absolute;margin-left:194.9pt;margin-top:153.65pt;width:38pt;height:56.6pt;flip:y;z-index:251682816;visibility:visible;mso-wrap-style:square;mso-width-percent:0;mso-height-percent:0;mso-wrap-distance-left:9pt;mso-wrap-distance-top:0;mso-wrap-distance-right:9pt;mso-wrap-distance-bottom:0;mso-position-horizontal:absolute;mso-position-horizontal-relative:text;mso-position-vertical:absolute;mso-position-vertical-relative:text;mso-width-percent:0;mso-height-percent:0;mso-width-relative:margin;mso-height-relative:margin" o:gfxdata="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" strokecolor="#4472c4 [3204]" strokeweight=".5pt">
+                <v:stroke endarrow="block" joinstyle="miter"/>
+              </v:shape>
+            </w:pict>
+          </mc:Fallback>
+        </mc:AlternateContent>
+      </w:r>
+      <w:r>
+        <w:rPr>
+          <w:noProof/>
+        </w:rPr>
+        <mc:AlternateContent>
+          <mc:Choice Requires="wps">
+            <w:drawing>
+              <wp:anchor distT="0" distB="0" distL="114300" distR="114300" simplePos="0" relativeHeight="251680768" behindDoc="0" locked="0" layoutInCell="1" allowOverlap="1" wp14:anchorId="37375C7F" wp14:editId="331425A3">
+                <wp:simplePos x="0" y="0"/>
+                <wp:positionH relativeFrom="column">
+                  <wp:posOffset>2501265</wp:posOffset>
+                </wp:positionH>
+                <wp:positionV relativeFrom="paragraph">
+                  <wp:posOffset>873125</wp:posOffset>
+                </wp:positionV>
+                <wp:extent cx="456565" cy="724535"/>
+                <wp:effectExtent l="0" t="0" r="57785" b="56515"/>
+                <wp:wrapNone/>
+                <wp:docPr id="56905123" name="Straight Arrow Connector 6"/>
+                <wp:cNvGraphicFramePr/>
+                <a:graphic xmlns:a="http://schemas.openxmlformats.org/drawingml/2006/main">
+                  <a:graphicData uri="http://schemas.microsoft.com/office/word/2010/wordprocessingShape">
+                    <wps:wsp>
+                      <wps:cNvCnPr/>
+                      <wps:spPr>
+                        <a:xfrm>
+                          <a:off x="0" y="0"/>
+                          <a:ext cx="456565" cy="724535"/>
+                        </a:xfrm>
+                        <a:prstGeom prst="straightConnector1">
+                          <a:avLst/>
+                        </a:prstGeom>
+                        <a:ln>
+                          <a:tailEnd type="triangle"/>
+                        </a:ln>
+                      </wps:spPr>
+                      <wps:style>
+                        <a:lnRef idx="1">
+                          <a:schemeClr val="accent1"/>
+                        </a:lnRef>
+                        <a:fillRef idx="0">
+                          <a:schemeClr val="accent1"/>
+                        </a:fillRef>
+                        <a:effectRef idx="0">
+                          <a:schemeClr val="accent1"/>
+                        </a:effectRef>
+                        <a:fontRef idx="minor">
+                          <a:schemeClr val="tx1"/>
+                        </a:fontRef>
+                      </wps:style>
+                      <wps:bodyPr/>
+                    </wps:wsp>
+                  </a:graphicData>
+                </a:graphic>
+                <wp14:sizeRelH relativeFrom="margin">
+                  <wp14:pctWidth>0</wp14:pctWidth>
+                </wp14:sizeRelH>
+                <wp14:sizeRelV relativeFrom="margin">
+                  <wp14:pctHeight>0</wp14:pctHeight>
+                </wp14:sizeRelV>
+              </wp:anchor>
+            </w:drawing>
+          </mc:Choice>
+          <mc:Fallback>
+            <w:pict>
+              <v:shape w14:anchorId="783C7D1E" id="Straight Arrow Connector 6" o:spid="_x0000_s1026" type="#_x0000_t32" style="position:absolute;margin-left:196.95pt;margin-top:68.75pt;width:35.95pt;height:57.05pt;z-index:251680768;visibility:visible;mso-wrap-style:square;mso-width-percent:0;mso-height-percent:0;mso-wrap-distance-left:9pt;mso-wrap-distance-top:0;mso-wrap-distance-right:9pt;mso-wrap-distance-bottom:0;mso-position-horizontal:absolute;mso-position-horizontal-relative:text;mso-position-vertical:absolute;mso-position-vertical-relative:text;mso-width-percent:0;mso-height-percent:0;mso-width-relative:margin;mso-height-relative:margin" o:gfxdata="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" strokecolor="#4472c4 [3204]" strokeweight=".5pt">
+                <v:stroke endarrow="block" joinstyle="miter"/>
+              </v:shape>
+            </w:pict>
+          </mc:Fallback>
+        </mc:AlternateContent>
+      </w:r>
+      <w:r>
+        <w:rPr>
+          <w:noProof/>
+        </w:rPr>
+        <mc:AlternateContent>
+          <mc:Choice Requires="wps">
+            <w:drawing>
+              <wp:anchor distT="0" distB="0" distL="114300" distR="114300" simplePos="0" relativeHeight="251684864" behindDoc="0" locked="0" layoutInCell="1" allowOverlap="1" wp14:anchorId="1343EBBA" wp14:editId="1A470EEC">
+                <wp:simplePos x="0" y="0"/>
+                <wp:positionH relativeFrom="column">
+                  <wp:posOffset>2501265</wp:posOffset>
+                </wp:positionH>
+                <wp:positionV relativeFrom="paragraph">
+                  <wp:posOffset>1767840</wp:posOffset>
+                </wp:positionV>
+                <wp:extent cx="353060" cy="45085"/>
+                <wp:effectExtent l="0" t="38100" r="27940" b="88265"/>
+                <wp:wrapNone/>
+                <wp:docPr id="334947408" name="Straight Arrow Connector 6"/>
+                <wp:cNvGraphicFramePr/>
+                <a:graphic xmlns:a="http://schemas.openxmlformats.org/drawingml/2006/main">
+                  <a:graphicData uri="http://schemas.microsoft.com/office/word/2010/wordprocessingShape">
+                    <wps:wsp>
+                      <wps:cNvCnPr/>
+                      <wps:spPr>
+                        <a:xfrm>
+                          <a:off x="0" y="0"/>
+                          <a:ext cx="353060" cy="45085"/>
+                        </a:xfrm>
+                        <a:prstGeom prst="straightConnector1">
+                          <a:avLst/>
+                        </a:prstGeom>
+                        <a:ln>
+                          <a:tailEnd type="triangle"/>
+                        </a:ln>
+                      </wps:spPr>
+                      <wps:style>
+                        <a:lnRef idx="1">
+                          <a:schemeClr val="accent1"/>
+                        </a:lnRef>
+                        <a:fillRef idx="0">
+                          <a:schemeClr val="accent1"/>
+                        </a:fillRef>
+                        <a:effectRef idx="0">
+                          <a:schemeClr val="accent1"/>
+                        </a:effectRef>
+                        <a:fontRef idx="minor">
+                          <a:schemeClr val="tx1"/>
+                        </a:fontRef>
+                      </wps:style>
+                      <wps:bodyPr/>
+                    </wps:wsp>
+                  </a:graphicData>
+                </a:graphic>
+                <wp14:sizeRelH relativeFrom="margin">
+                  <wp14:pctWidth>0</wp14:pctWidth>
+                </wp14:sizeRelH>
+                <wp14:sizeRelV relativeFrom="margin">
+                  <wp14:pctHeight>0</wp14:pctHeight>
+                </wp14:sizeRelV>
+              </wp:anchor>
+            </w:drawing>
+          </mc:Choice>
+          <mc:Fallback>
+            <w:pict>
+              <v:shape w14:anchorId="5804C5AC" id="Straight Arrow Connector 6" o:spid="_x0000_s1026" type="#_x0000_t32" style="position:absolute;margin-left:196.95pt;margin-top:139.2pt;width:27.8pt;height:3.55pt;z-index:251684864;visibility:visible;mso-wrap-style:square;mso-width-percent:0;mso-height-percent:0;mso-wrap-distance-left:9pt;mso-wrap-distance-top:0;mso-wrap-distance-right:9pt;mso-wrap-distance-bottom:0;mso-position-horizontal:absolute;mso-position-horizontal-relative:text;mso-position-vertical:absolute;mso-position-vertical-relative:text;mso-width-percent:0;mso-height-percent:0;mso-width-relative:margin;mso-height-relative:margin" o:gfxdata="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" strokecolor="#4472c4 [3204]" strokeweight=".5pt">
+                <v:stroke endarrow="block" joinstyle="miter"/>
+              </v:shape>
+            </w:pict>
+          </mc:Fallback>
+        </mc:AlternateContent>
+      </w:r>
+      <w:r>
+        <w:rPr>
+          <w:noProof/>
+        </w:rPr>
+        <mc:AlternateContent>
+          <mc:Choice Requires="wps">
+            <w:drawing>
+              <wp:anchor distT="0" distB="0" distL="114300" distR="114300" simplePos="0" relativeHeight="251673600" behindDoc="0" locked="0" layoutInCell="1" allowOverlap="1" wp14:anchorId="4F95EDE6" wp14:editId="3B85E24A">
+                <wp:simplePos x="0" y="0"/>
+                <wp:positionH relativeFrom="column">
+                  <wp:posOffset>5329555</wp:posOffset>
+                </wp:positionH>
+                <wp:positionV relativeFrom="paragraph">
+                  <wp:posOffset>268605</wp:posOffset>
+                </wp:positionV>
+                <wp:extent cx="1293495" cy="3165475"/>
+                <wp:effectExtent l="0" t="0" r="20955" b="15875"/>
+                <wp:wrapNone/>
+                <wp:docPr id="1882718516" name="Rectangle 5"/>
+                <wp:cNvGraphicFramePr/>
+                <a:graphic xmlns:a="http://schemas.openxmlformats.org/drawingml/2006/main">
+                  <a:graphicData uri="http://schemas.microsoft.com/office/word/2010/wordprocessingShape">
+                    <wps:wsp>
+                      <wps:cNvSpPr/>
+                      <wps:spPr>
+                        <a:xfrm>
+                          <a:off x="0" y="0"/>
+                          <a:ext cx="1293495" cy="3165475"/>
+                        </a:xfrm>
+                        <a:prstGeom prst="rect">
+                          <a:avLst/>
+                        </a:prstGeom>
+                      </wps:spPr>
+                      <wps:style>
+                        <a:lnRef idx="2">
+                          <a:schemeClr val="accent1">
+                            <a:shade val="15000"/>
+                          </a:schemeClr>
+                        </a:lnRef>
+                        <a:fillRef idx="1">
+                          <a:schemeClr val="accent1"/>
+                        </a:fillRef>
+                        <a:effectRef idx="0">
+                          <a:schemeClr val="accent1"/>
+                        </a:effectRef>
+                        <a:fontRef idx="minor">
+                          <a:schemeClr val="lt1"/>
+                        </a:fontRef>
+                      </wps:style>
+                      <wps:txbx>
+                        <w:txbxContent>
+                          <w:p>
+                            <w:pPr>
+                              <w:jc w:val="center"/>
+                            </w:pPr>
+                            <w:r>
+                              <w:t>MES</w:t>
+                            </w:r>
+                          </w:p>
+                        </w:txbxContent>
+                      </wps:txbx>
+                      <wps:bodyPr rot="0" spcFirstLastPara="0" vertOverflow="overflow" horzOverflow="overflow" vert="horz" wrap="square" lIns="91440" tIns="45720" rIns="91440" bIns="45720" numCol="1" spcCol="0" rtlCol="0" fromWordArt="0" anchor="ctr" anchorCtr="0" forceAA="0" compatLnSpc="1">
+                        <a:prstTxWarp prst="textNoShape">
+                          <a:avLst/>
+                        </a:prstTxWarp>
+                        <a:noAutofit/>
+                      </wps:bodyPr>
+                    </wps:wsp>
+                  </a:graphicData>
+                </a:graphic>
+              </wp:anchor>
+            </w:drawing>
+          </mc:Choice>
+          <mc:Fallback>
+            <w:pict>
+              <v:rect w14:anchorId="4F95EDE6" id="Rectangle 5" o:spid="_x0000_s1043" style="position:absolute;left:0;text-align:left;margin-left:419.65pt;margin-top:21.15pt;width:101.85pt;height:249.25pt;z-index:251673600;visibility:visible;mso-wrap-style:square;mso-wrap-distance-left:9pt;mso-wrap-distance-top:0;mso-wrap-distance-right:9pt;mso-wrap-distance-bottom:0;mso-position-horizontal:absolute;mso-position-horizontal-relative:text;mso-position-vertical:absolute;mso-position-vertical-relative:text;v-text-anchor:middle" o:gfxdata="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" fillcolor="#4472c4 [3204]" strokecolor="#09101d [484]" strokeweight="1pt">
+                <v:textbox>
+                  <w:txbxContent>
+                    <w:p>
+                      <w:pPr>
+                        <w:jc w:val="center"/>
+                      </w:pPr>
+                      <w:r>
+                        <w:t>MES</w:t>
+                      </w:r>
+                    </w:p>
+                  </w:txbxContent>
+                </v:textbox>
+              </v:rect>
+            </w:pict>
+          </mc:Fallback>
+        </mc:AlternateContent>
+      </w:r>
+      <w:r>
+        <w:rPr>
+          <w:noProof/>
+        </w:rPr>
+        <mc:AlternateContent>
+          <mc:Choice Requires="wps">
+            <w:drawing>
+              <wp:anchor distT="0" distB="0" distL="114300" distR="114300" simplePos="0" relativeHeight="251686912" behindDoc="0" locked="0" layoutInCell="1" allowOverlap="1" wp14:anchorId="4E144267" wp14:editId="703BA716">
+                <wp:simplePos x="0" y="0"/>
+                <wp:positionH relativeFrom="column">
+                  <wp:posOffset>4140200</wp:posOffset>
+                </wp:positionH>
+                <wp:positionV relativeFrom="paragraph">
+                  <wp:posOffset>622935</wp:posOffset>
+                </wp:positionV>
+                <wp:extent cx="1181735" cy="974725"/>
+                <wp:effectExtent l="0" t="38100" r="56515" b="34925"/>
+                <wp:wrapNone/>
+                <wp:docPr id="692932935" name="Straight Arrow Connector 6"/>
+                <wp:cNvGraphicFramePr/>
+                <a:graphic xmlns:a="http://schemas.openxmlformats.org/drawingml/2006/main">
+                  <a:graphicData uri="http://schemas.microsoft.com/office/word/2010/wordprocessingShape">
+                    <wps:wsp>
+                      <wps:cNvCnPr/>
+                      <wps:spPr>
+                        <a:xfrm flipV="1">
+                          <a:off x="0" y="0"/>
+                          <a:ext cx="1181735" cy="974725"/>
+                        </a:xfrm>
+                        <a:prstGeom prst="straightConnector1">
+                          <a:avLst/>
+                        </a:prstGeom>
+                        <a:ln>
+                          <a:tailEnd type="triangle"/>
+                        </a:ln>
+                      </wps:spPr>
+                      <wps:style>
+                        <a:lnRef idx="1">
+                          <a:schemeClr val="accent1"/>
+                        </a:lnRef>
+                        <a:fillRef idx="0">
+                          <a:schemeClr val="accent1"/>
+                        </a:fillRef>
+                        <a:effectRef idx="0">
+                          <a:schemeClr val="accent1"/>
+                        </a:effectRef>
+                        <a:fontRef idx="minor">
+                          <a:schemeClr val="tx1"/>
+                        </a:fontRef>
+                      </wps:style>
+                      <wps:bodyPr/>
+                    </wps:wsp>
+                  </a:graphicData>
+                </a:graphic>
+                <wp14:sizeRelH relativeFrom="margin">
+                  <wp14:pctWidth>0</wp14:pctWidth>
+                </wp14:sizeRelH>
+                <wp14:sizeRelV relativeFrom="margin">
+                  <wp14:pctHeight>0</wp14:pctHeight>
+                </wp14:sizeRelV>
+              </wp:anchor>
+            </w:drawing>
+          </mc:Choice>
+          <mc:Fallback>
+            <w:pict>
+              <v:shape w14:anchorId="40A32A21" id="Straight Arrow Connector 6" o:spid="_x0000_s1026" type="#_x0000_t32" style="position:absolute;margin-left:326pt;margin-top:49.05pt;width:93.05pt;height:76.75pt;flip:y;z-index:251686912;visibility:visible;mso-wrap-style:square;mso-width-percent:0;mso-height-percent:0;mso-wrap-distance-left:9pt;mso-wrap-distance-top:0;mso-wrap-distance-right:9pt;mso-wrap-distance-bottom:0;mso-position-horizontal:absolute;mso-position-horizontal-relative:text;mso-position-vertical:absolute;mso-position-vertical-relative:text;mso-width-percent:0;mso-height-percent:0;mso-width-relative:margin;mso-height-relative:margin" o:gfxdata="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" strokecolor="#4472c4 [3204]" strokeweight=".5pt">
+                <v:stroke endarrow="block" joinstyle="miter"/>
+              </v:shape>
+            </w:pict>
+          </mc:Fallback>
+        </mc:AlternateContent>
+      </w:r>
+      <w:r>
+        <w:rPr>
+          <w:noProof/>
+        </w:rPr>
+        <mc:AlternateContent>
+          <mc:Choice Requires="wps">
+            <w:drawing>
+              <wp:anchor distT="0" distB="0" distL="114300" distR="114300" simplePos="0" relativeHeight="251691008" behindDoc="0" locked="0" layoutInCell="1" allowOverlap="1" wp14:anchorId="62739E5D" wp14:editId="3860AF8E">
+                <wp:simplePos x="0" y="0"/>
+                <wp:positionH relativeFrom="column">
+                  <wp:posOffset>4131945</wp:posOffset>
+                </wp:positionH>
+                <wp:positionV relativeFrom="paragraph">
+                  <wp:posOffset>1946275</wp:posOffset>
+                </wp:positionV>
+                <wp:extent cx="1189990" cy="1186815"/>
+                <wp:effectExtent l="0" t="0" r="67310" b="51435"/>
+                <wp:wrapNone/>
+                <wp:docPr id="409466799" name="Straight Arrow Connector 6"/>
+                <wp:cNvGraphicFramePr/>
+                <a:graphic xmlns:a="http://schemas.openxmlformats.org/drawingml/2006/main">
+                  <a:graphicData uri="http://schemas.microsoft.com/office/word/2010/wordprocessingShape">
+                    <wps:wsp>
+                      <wps:cNvCnPr/>
+                      <wps:spPr>
+                        <a:xfrm>
+                          <a:off x="0" y="0"/>
+                          <a:ext cx="1189990" cy="1186815"/>
+                        </a:xfrm>
+                        <a:prstGeom prst="straightConnector1">
+                          <a:avLst/>
+                        </a:prstGeom>
+                        <a:ln>
+                          <a:tailEnd type="triangle"/>
+                        </a:ln>
+                      </wps:spPr>
+                      <wps:style>
+                        <a:lnRef idx="1">
+                          <a:schemeClr val="accent1"/>
+                        </a:lnRef>
+                        <a:fillRef idx="0">
+                          <a:schemeClr val="accent1"/>
+                        </a:fillRef>
+                        <a:effectRef idx="0">
+                          <a:schemeClr val="accent1"/>
+                        </a:effectRef>
+                        <a:fontRef idx="minor">
+                          <a:schemeClr val="tx1"/>
+                        </a:fontRef>
+                      </wps:style>
+                      <wps:bodyPr/>
+                    </wps:wsp>
+                  </a:graphicData>
+                </a:graphic>
+                <wp14:sizeRelH relativeFrom="margin">
+                  <wp14:pctWidth>0</wp14:pctWidth>
+                </wp14:sizeRelH>
+                <wp14:sizeRelV relativeFrom="margin">
+                  <wp14:pctHeight>0</wp14:pctHeight>
+                </wp14:sizeRelV>
+              </wp:anchor>
+            </w:drawing>
+          </mc:Choice>
+          <mc:Fallback>
+            <w:pict>
+              <v:shape w14:anchorId="3FB33051" id="Straight Arrow Connector 6" o:spid="_x0000_s1026" type="#_x0000_t32" style="position:absolute;margin-left:325.35pt;margin-top:153.25pt;width:93.7pt;height:93.45pt;z-index:251691008;visibility:visible;mso-wrap-style:square;mso-width-percent:0;mso-height-percent:0;mso-wrap-distance-left:9pt;mso-wrap-distance-top:0;mso-wrap-distance-right:9pt;mso-wrap-distance-bottom:0;mso-position-horizontal:absolute;mso-position-horizontal-relative:text;mso-position-vertical:absolute;mso-position-vertical-relative:text;mso-width-percent:0;mso-height-percent:0;mso-width-relative:margin;mso-height-relative:margin" o:gfxdata="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" strokecolor="#4472c4 [3204]" strokeweight=".5pt">
+                <v:stroke endarrow="block" joinstyle="miter"/>
+              </v:shape>
+            </w:pict>
+          </mc:Fallback>
+        </mc:AlternateContent>
+      </w:r>
+      <w:r>
+        <w:rPr>
+          <w:noProof/>
+        </w:rPr>
+        <mc:AlternateContent>
+          <mc:Choice Requires="wps">
+            <w:drawing>
+              <wp:anchor distT="45720" distB="45720" distL="114300" distR="114300" simplePos="0" relativeHeight="251688960" behindDoc="0" locked="0" layoutInCell="1" allowOverlap="1" wp14:anchorId="600B0730" wp14:editId="214392BA">
+                <wp:simplePos x="0" y="0"/>
+                <wp:positionH relativeFrom="column">
+                  <wp:posOffset>3449955</wp:posOffset>
+                </wp:positionH>
+                <wp:positionV relativeFrom="paragraph">
+                  <wp:posOffset>407035</wp:posOffset>
+                </wp:positionV>
+                <wp:extent cx="1630045" cy="301625"/>
+                <wp:effectExtent l="0" t="0" r="8255" b="3175"/>
+                <wp:wrapSquare wrapText="bothSides"/>
+                <wp:docPr id="1474890779" name="Text Box 2"/>
+                <wp:cNvGraphicFramePr>
+                  <a:graphicFrameLocks xmlns:a="http://schemas.openxmlformats.org/drawingml/2006/main"/>
+                </wp:cNvGraphicFramePr>
+                <a:graphic xmlns:a="http://schemas.openxmlformats.org/drawingml/2006/main">
+                  <a:graphicData uri="http://schemas.microsoft.com/office/word/2010/wordprocessingShape">
+                    <wps:wsp>
+                      <wps:cNvSpPr txBox="1">
+                        <a:spLocks noChangeArrowheads="1"/>
+                      </wps:cNvSpPr>
+                      <wps:spPr bwMode="auto">
+                        <a:xfrm>
+                          <a:off x="0" y="0"/>
+                          <a:ext cx="1630045" cy="301625"/>
+                        </a:xfrm>
+                        <a:prstGeom prst="rect">
+                          <a:avLst/>
+                        </a:prstGeom>
+                        <a:solidFill>
+                          <a:srgbClr val="FFFFFF"/>
+                        </a:solidFill>
+                        <a:ln w="9525">
+                          <a:noFill/>
+                          <a:miter lim="800000"/>
+                          <a:headEnd/>
+                          <a:tailEnd/>
+                        </a:ln>
+                      </wps:spPr>
+                      <wps:txbx>
+                        <w:txbxContent>
+                          <w:p>
+                            <w:pPr>
+                              <w:jc w:val="left"/>
+                            </w:pPr>
+                            <w:r>
+                              <w:t>Bản tin có điều kiện</w:t>
+                            </w:r>
+                          </w:p>
+                          <w:p>
+                            <w:pPr>
+                              <w:jc w:val="left"/>
+                            </w:pPr>
+                          </w:p>
+                        </w:txbxContent>
+                      </wps:txbx>
+                      <wps:bodyPr rot="0" vert="horz" wrap="square" lIns="91440" tIns="45720" rIns="91440" bIns="45720" anchor="t" anchorCtr="0">
+                        <a:noAutofit/>
+                      </wps:bodyPr>
+                    </wps:wsp>
+                  </a:graphicData>
+                </a:graphic>
+                <wp14:sizeRelH relativeFrom="margin">
+                  <wp14:pctWidth>0</wp14:pctWidth>
+                </wp14:sizeRelH>
+                <wp14:sizeRelV relativeFrom="margin">
+                  <wp14:pctHeight>0</wp14:pctHeight>
+                </wp14:sizeRelV>
+              </wp:anchor>
+            </w:drawing>
+          </mc:Choice>
+          <mc:Fallback>
+            <w:pict>
+              <v:shape w14:anchorId="600B0730" id="_x0000_s1044" type="#_x0000_t202" style="position:absolute;left:0;text-align:left;margin-left:271.65pt;margin-top:32.05pt;width:128.35pt;height:23.75pt;z-index:251688960;visibility:visible;mso-wrap-style:square;mso-width-percent:0;mso-height-percent:0;mso-wrap-distance-left:9pt;mso-wrap-distance-top:3.6pt;mso-wrap-distance-right:9pt;mso-wrap-distance-bottom:3.6pt;mso-position-horizontal:absolute;mso-position-horizontal-relative:text;mso-position-vertical:absolute;mso-position-vertical-relative:text;mso-width-percent:0;mso-height-percent:0;mso-width-relative:margin;mso-height-relative:margin;v-text-anchor:top" o:gfxdata="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" stroked="f">
+                <v:textbox>
+                  <w:txbxContent>
+                    <w:p>
+                      <w:pPr>
+                        <w:jc w:val="left"/>
+                      </w:pPr>
+                      <w:r>
+                        <w:t>Bản tin có điều kiện</w:t>
+                      </w:r>
+                    </w:p>
+                    <w:p>
+                      <w:pPr>
+                        <w:jc w:val="left"/>
+                      </w:pPr>
+                    </w:p>
+                  </w:txbxContent>
+                </v:textbox>
+                <w10:wrap type="square"/>
+              </v:shape>
+            </w:pict>
+          </mc:Fallback>
+        </mc:AlternateContent>
+      </w:r>
+      <w:r>
+        <w:rPr>
+          <w:noProof/>
+        </w:rPr>
+        <mc:AlternateContent>
+          <mc:Choice Requires="wps">
+            <w:drawing>
+              <wp:anchor distT="45720" distB="45720" distL="114300" distR="114300" simplePos="0" relativeHeight="251695104" behindDoc="0" locked="0" layoutInCell="1" allowOverlap="1" wp14:anchorId="501DD7F1" wp14:editId="5AEF169E">
+                <wp:simplePos x="0" y="0"/>
+                <wp:positionH relativeFrom="column">
+                  <wp:posOffset>3656965</wp:posOffset>
+                </wp:positionH>
+                <wp:positionV relativeFrom="paragraph">
+                  <wp:posOffset>681990</wp:posOffset>
+                </wp:positionV>
+                <wp:extent cx="1086485" cy="301625"/>
+                <wp:effectExtent l="0" t="0" r="0" b="3175"/>
+                <wp:wrapSquare wrapText="bothSides"/>
+                <wp:docPr id="1270899803" name="Text Box 2"/>
+                <wp:cNvGraphicFramePr>
+                  <a:graphicFrameLocks xmlns:a="http://schemas.openxmlformats.org/drawingml/2006/main"/>
+                </wp:cNvGraphicFramePr>
+                <a:graphic xmlns:a="http://schemas.openxmlformats.org/drawingml/2006/main">
+                  <a:graphicData uri="http://schemas.microsoft.com/office/word/2010/wordprocessingShape">
+                    <wps:wsp>
+                      <wps:cNvSpPr txBox="1">
+                        <a:spLocks noChangeArrowheads="1"/>
+                      </wps:cNvSpPr>
+                      <wps:spPr bwMode="auto">
+                        <a:xfrm>
+                          <a:off x="0" y="0"/>
+                          <a:ext cx="1086485" cy="301625"/>
+                        </a:xfrm>
+                        <a:prstGeom prst="rect">
+                          <a:avLst/>
+                        </a:prstGeom>
+                        <a:solidFill>
+                          <a:srgbClr val="FFFFFF"/>
+                        </a:solidFill>
+                        <a:ln w="9525">
+                          <a:noFill/>
+                          <a:miter lim="800000"/>
+                          <a:headEnd/>
+                          <a:tailEnd/>
+                        </a:ln>
+                      </wps:spPr>
+                      <wps:txbx>
+                        <w:txbxContent>
+                          <w:p>
+                            <w:pPr>
+                              <w:jc w:val="left"/>
+                            </w:pPr>
+                            <w:r>
+                              <w:t>(Start, Stop)</w:t>
+                            </w:r>
+                          </w:p>
+                        </w:txbxContent>
+                      </wps:txbx>
+                      <wps:bodyPr rot="0" vert="horz" wrap="square" lIns="91440" tIns="45720" rIns="91440" bIns="45720" anchor="t" anchorCtr="0">
+                        <a:noAutofit/>
+                      </wps:bodyPr>
+                    </wps:wsp>
+                  </a:graphicData>
+                </a:graphic>
+                <wp14:sizeRelH relativeFrom="margin">
+                  <wp14:pctWidth>0</wp14:pctWidth>
+                </wp14:sizeRelH>
+                <wp14:sizeRelV relativeFrom="margin">
+                  <wp14:pctHeight>0</wp14:pctHeight>
+                </wp14:sizeRelV>
+              </wp:anchor>
+            </w:drawing>
+          </mc:Choice>
+          <mc:Fallback>
+            <w:pict>
+              <v:shape w14:anchorId="501DD7F1" id="_x0000_s1045" type="#_x0000_t202" style="position:absolute;left:0;text-align:left;margin-left:287.95pt;margin-top:53.7pt;width:85.55pt;height:23.75pt;z-index:251695104;visibility:visible;mso-wrap-style:square;mso-width-percent:0;mso-height-percent:0;mso-wrap-distance-left:9pt;mso-wrap-distance-top:3.6pt;mso-wrap-distance-right:9pt;mso-wrap-distance-bottom:3.6pt;mso-position-horizontal:absolute;mso-position-horizontal-relative:text;mso-position-vertical:absolute;mso-position-vertical-relative:text;mso-width-percent:0;mso-height-percent:0;mso-width-relative:margin;mso-height-relative:margin;v-text-anchor:top" o:gfxdata="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" stroked="f">
+                <v:textbox>
+                  <w:txbxContent>
+                    <w:p>
+                      <w:pPr>
+                        <w:jc w:val="left"/>
+                      </w:pPr>
+                      <w:r>
+                        <w:t>(Start, Stop)</w:t>
+                      </w:r>
+                    </w:p>
+                  </w:txbxContent>
+                </v:textbox>
+                <w10:wrap type="square"/>
+              </v:shape>
+            </w:pict>
+          </mc:Fallback>
+        </mc:AlternateContent>
+      </w:r>
+      <w:r>
+        <w:rPr>
+          <w:noProof/>
+        </w:rPr>
+        <mc:AlternateContent>
+          <mc:Choice Requires="wps">
+            <w:drawing>
+              <wp:anchor distT="45720" distB="45720" distL="114300" distR="114300" simplePos="0" relativeHeight="251693056" behindDoc="0" locked="0" layoutInCell="1" allowOverlap="1" wp14:anchorId="0B68429D" wp14:editId="5A4FB67E">
+                <wp:simplePos x="0" y="0"/>
+                <wp:positionH relativeFrom="column">
+                  <wp:posOffset>3052445</wp:posOffset>
+                </wp:positionH>
+                <wp:positionV relativeFrom="paragraph">
+                  <wp:posOffset>2873375</wp:posOffset>
+                </wp:positionV>
+                <wp:extent cx="2009775" cy="327660"/>
+                <wp:effectExtent l="0" t="0" r="9525" b="0"/>
+                <wp:wrapSquare wrapText="bothSides"/>
+                <wp:docPr id="484813730" name="Text Box 2"/>
+                <wp:cNvGraphicFramePr>
+                  <a:graphicFrameLocks xmlns:a="http://schemas.openxmlformats.org/drawingml/2006/main"/>
+                </wp:cNvGraphicFramePr>
+                <a:graphic xmlns:a="http://schemas.openxmlformats.org/drawingml/2006/main">
+                  <a:graphicData uri="http://schemas.microsoft.com/office/word/2010/wordprocessingShape">
+                    <wps:wsp>
+                      <wps:cNvSpPr txBox="1">
+                        <a:spLocks noChangeArrowheads="1"/>
+                      </wps:cNvSpPr>
+                      <wps:spPr bwMode="auto">
+                        <a:xfrm>
+                          <a:off x="0" y="0"/>
+                          <a:ext cx="2009775" cy="327660"/>
+                        </a:xfrm>
+                        <a:prstGeom prst="rect">
+                          <a:avLst/>
+                        </a:prstGeom>
+                        <a:solidFill>
+                          <a:srgbClr val="FFFFFF"/>
+                        </a:solidFill>
+                        <a:ln w="9525">
+                          <a:noFill/>
+                          <a:miter lim="800000"/>
+                          <a:headEnd/>
+                          <a:tailEnd/>
+                        </a:ln>
+                      </wps:spPr>
+                      <wps:txbx>
+                        <w:txbxContent>
+                          <w:p>
+                            <w:pPr>
+                              <w:jc w:val="left"/>
+                            </w:pPr>
+                            <w:r>
+                              <w:t>Bản tin tự động gửi (60s)</w:t>
+                            </w:r>
+                          </w:p>
+                        </w:txbxContent>
+                      </wps:txbx>
+                      <wps:bodyPr rot="0" vert="horz" wrap="square" lIns="91440" tIns="45720" rIns="91440" bIns="45720" anchor="t" anchorCtr="0">
+                        <a:noAutofit/>
+                      </wps:bodyPr>
+                    </wps:wsp>
+                  </a:graphicData>
+                </a:graphic>
+                <wp14:sizeRelH relativeFrom="margin">
+                  <wp14:pctWidth>0</wp14:pctWidth>
+                </wp14:sizeRelH>
+                <wp14:sizeRelV relativeFrom="margin">
+                  <wp14:pctHeight>0</wp14:pctHeight>
+                </wp14:sizeRelV>
+              </wp:anchor>
+            </w:drawing>
+          </mc:Choice>
+          <mc:Fallback>
+            <w:pict>
+              <v:shape w14:anchorId="0B68429D" id="_x0000_s1046" type="#_x0000_t202" style="position:absolute;left:0;text-align:left;margin-left:240.35pt;margin-top:226.25pt;width:158.25pt;height:25.8pt;z-index:251693056;visibility:visible;mso-wrap-style:square;mso-width-percent:0;mso-height-percent:0;mso-wrap-distance-left:9pt;mso-wrap-distance-top:3.6pt;mso-wrap-distance-right:9pt;mso-wrap-distance-bottom:3.6pt;mso-position-horizontal:absolute;mso-position-horizontal-relative:text;mso-position-vertical:absolute;mso-position-vertical-relative:text;mso-width-percent:0;mso-height-percent:0;mso-width-relative:margin;mso-height-relative:margin;v-text-anchor:top" o:gfxdata="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" stroked="f">
+                <v:textbox>
+                  <w:txbxContent>
+                    <w:p>
+                      <w:pPr>
+                        <w:jc w:val="left"/>
+                      </w:pPr>
+                      <w:r>
+                        <w:t>Bản tin tự động gửi (60s)</w:t>
+                      </w:r>
+                    </w:p>
+                  </w:txbxContent>
+                </v:textbox>
+                <w10:wrap type="square"/>
+              </v:shape>
+            </w:pict>
+          </mc:Fallback>
+        </mc:AlternateContent>
+      </w:r>
+    </w:p>
+    <w:p/>
+    <w:p>
+      <w:r>
+        <w:t xml:space="preserve">   </w:t>
+      </w:r>
+    </w:p>
+    <w:p/>
+    <w:p/>
+    <w:p/>
+    <w:p/>
+    <w:p/>
+    <w:p>
+      <w:r>
+        <w:rPr>
+          <w:noProof/>
+        </w:rPr>
+        <mc:AlternateContent>
+          <mc:Choice Requires="wps">
+            <w:drawing>
+              <wp:anchor distT="45720" distB="45720" distL="114300" distR="114300" simplePos="0" relativeHeight="251697152" behindDoc="0" locked="0" layoutInCell="1" allowOverlap="1" wp14:anchorId="564E2D72" wp14:editId="362D5DF5">
+                <wp:simplePos x="0" y="0"/>
+                <wp:positionH relativeFrom="column">
+                  <wp:posOffset>3448050</wp:posOffset>
+                </wp:positionH>
+                <wp:positionV relativeFrom="paragraph">
+                  <wp:posOffset>107315</wp:posOffset>
+                </wp:positionV>
+                <wp:extent cx="1238250" cy="301625"/>
+                <wp:effectExtent l="0" t="0" r="0" b="3175"/>
+                <wp:wrapSquare wrapText="bothSides"/>
+                <wp:docPr id="340078470" name="Text Box 2"/>
+                <wp:cNvGraphicFramePr>
+                  <a:graphicFrameLocks xmlns:a="http://schemas.openxmlformats.org/drawingml/2006/main"/>
+                </wp:cNvGraphicFramePr>
+                <a:graphic xmlns:a="http://schemas.openxmlformats.org/drawingml/2006/main">
+                  <a:graphicData uri="http://schemas.microsoft.com/office/word/2010/wordprocessingShape">
+                    <wps:wsp>
+                      <wps:cNvSpPr txBox="1">
+                        <a:spLocks noChangeArrowheads="1"/>
+                      </wps:cNvSpPr>
+                      <wps:spPr bwMode="auto">
+                        <a:xfrm>
+                          <a:off x="0" y="0"/>
+                          <a:ext cx="1238250" cy="301625"/>
+                        </a:xfrm>
+                        <a:prstGeom prst="rect">
+                          <a:avLst/>
+                        </a:prstGeom>
+                        <a:solidFill>
+                          <a:srgbClr val="FFFFFF"/>
+                        </a:solidFill>
+                        <a:ln w="9525">
+                          <a:noFill/>
+                          <a:miter lim="800000"/>
+                          <a:headEnd/>
+                          <a:tailEnd/>
+                        </a:ln>
+                      </wps:spPr>
+                      <wps:txbx>
+                        <w:txbxContent>
+                          <w:p>
+                            <w:pPr>
+                              <w:jc w:val="left"/>
+                            </w:pPr>
+                            <w:r>
+                              <w:t>(Count, Alive)</w:t>
+                            </w:r>
+                          </w:p>
+                        </w:txbxContent>
+                      </wps:txbx>
+                      <wps:bodyPr rot="0" vert="horz" wrap="square" lIns="91440" tIns="45720" rIns="91440" bIns="45720" anchor="t" anchorCtr="0">
+                        <a:noAutofit/>
+                      </wps:bodyPr>
+                    </wps:wsp>
+                  </a:graphicData>
+                </a:graphic>
+                <wp14:sizeRelH relativeFrom="margin">
+                  <wp14:pctWidth>0</wp14:pctWidth>
+                </wp14:sizeRelH>
+                <wp14:sizeRelV relativeFrom="margin">
+                  <wp14:pctHeight>0</wp14:pctHeight>
+                </wp14:sizeRelV>
+              </wp:anchor>
+            </w:drawing>
+          </mc:Choice>
+          <mc:Fallback>
+            <w:pict>
+              <v:shape w14:anchorId="564E2D72" id="_x0000_s1047" type="#_x0000_t202" style="position:absolute;left:0;text-align:left;margin-left:271.5pt;margin-top:8.45pt;width:97.5pt;height:23.75pt;z-index:251697152;visibility:visible;mso-wrap-style:square;mso-width-percent:0;mso-height-percent:0;mso-wrap-distance-left:9pt;mso-wrap-distance-top:3.6pt;mso-wrap-distance-right:9pt;mso-wrap-distance-bottom:3.6pt;mso-position-horizontal:absolute;mso-position-horizontal-relative:text;mso-position-vertical:absolute;mso-position-vertical-relative:text;mso-width-percent:0;mso-height-percent:0;mso-width-relative:margin;mso-height-relative:margin;v-text-anchor:top" o:gfxdata="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" stroked="f">
+                <v:textbox>
+                  <w:txbxContent>
+                    <w:p>
+                      <w:pPr>
+                        <w:jc w:val="left"/>
+                      </w:pPr>
+                      <w:r>
+                        <w:t>(Count, Alive)</w:t>
+                      </w:r>
+                    </w:p>
+                  </w:txbxContent>
+                </v:textbox>
+                <w10:wrap type="square"/>
+              </v:shape>
+            </w:pict>
+          </mc:Fallback>
+        </mc:AlternateContent>
+      </w:r>
+    </w:p>
+    <w:p/>
     <w:sectPr>
       <w:pgSz w:w="12240" w:h="15840"/>
       <w:pgMar w:top="1440" w:right="1440" w:bottom="1440" w:left="1440" w:header="720" w:footer="720" w:gutter="0"/>
@@ -1960,7 +5410,7 @@
 </file>
 
 <file path=word/numbering.xml><?xml version="1.0" encoding="utf-8"?>
-<w:numbering xmlns:wpc="http://schemas.microsoft.com/office/word/2010/wordprocessingCanvas" xmlns:cx="http://schemas.microsoft.com/office/drawing/2014/chartex" xmlns:cx1="http://schemas.microsoft.com/office/drawing/2015/9/8/chartex" xmlns:cx2="http://schemas.microsoft.com/office/drawing/2015/10/21/chartex" xmlns:cx3="http://schemas.microsoft.com/office/drawing/2016/5/9/chartex" xmlns:cx4="http://schemas.microsoft.com/office/drawing/2016/5/10/chartex" xmlns:cx5="http://schemas.microsoft.com/office/drawing/2016/5/11/chartex" xmlns:cx6="http://schemas.microsoft.com/office/drawing/2016/5/12/chartex" xmlns:cx7="http://schemas.microsoft.com/office/drawing/2016/5/13/chartex" xmlns:cx8="http://schemas.microsoft.com/office/drawing/2016/5/14/chartex" xmlns:mc="http://schemas.openxmlformats.org/markup-compatibility/2006" xmlns:aink="http://schemas.microsoft.com/office/drawing/2016/ink" xmlns:am3d="http://schemas.microsoft.com/office/drawing/2017/model3d" xmlns:o="urn:schemas-microsoft-com:office:office" xmlns:r="http://schemas.openxmlformats.org/officeDocument/2006/relationships" xmlns:m="http://schemas.openxmlformats.org/officeDocument/2006/math" xmlns:v="urn:schemas-microsoft-com:vml" xmlns:wp14="http://schemas.microsoft.com/office/word/2010/wordprocessingDrawing" xmlns:wp="http://schemas.openxmlformats.org/drawingml/2006/wordprocessingDrawing" xmlns:w10="urn:schemas-microsoft-com:office:word" xmlns:w="http://schemas.openxmlformats.org/wordprocessingml/2006/main" xmlns:w14="http://schemas.microsoft.com/office/word/2010/wordml" xmlns:w15="http://schemas.microsoft.com/office/word/2012/wordml" xmlns:w16cex="http://schemas.microsoft.com/office/word/2018/wordml/cex" xmlns:w16cid="http://schemas.microsoft.com/office/word/2016/wordml/cid" xmlns:w16="http://schemas.microsoft.com/office/word/2018/wordml" xmlns:w16se="http://schemas.microsoft.com/office/word/2015/wordml/symex" xmlns:wpg="http://schemas.microsoft.com/office/word/2010/wordprocessingGroup" xmlns:wpi="http://schemas.microsoft.com/office/word/2010/wordprocessingInk" xmlns:wne="http://schemas.microsoft.com/office/word/2006/wordml" xmlns:wps="http://schemas.microsoft.com/office/word/2010/wordprocessingShape" mc:Ignorable="w14 w15 w16se w16cid w16 w16cex wp14">
+<w:numbering xmlns:wpc="http://schemas.microsoft.com/office/word/2010/wordprocessingCanvas" xmlns:cx="http://schemas.microsoft.com/office/drawing/2014/chartex" xmlns:cx1="http://schemas.microsoft.com/office/drawing/2015/9/8/chartex" xmlns:cx2="http://schemas.microsoft.com/office/drawing/2015/10/21/chartex" xmlns:cx3="http://schemas.microsoft.com/office/drawing/2016/5/9/chartex" xmlns:cx4="http://schemas.microsoft.com/office/drawing/2016/5/10/chartex" xmlns:cx5="http://schemas.microsoft.com/office/drawing/2016/5/11/chartex" xmlns:cx6="http://schemas.microsoft.com/office/drawing/2016/5/12/chartex" xmlns:cx7="http://schemas.microsoft.com/office/drawing/2016/5/13/chartex" xmlns:cx8="http://schemas.microsoft.com/office/drawing/2016/5/14/chartex" xmlns:mc="http://schemas.openxmlformats.org/markup-compatibility/2006" xmlns:aink="http://schemas.microsoft.com/office/drawing/2016/ink" xmlns:am3d="http://schemas.microsoft.com/office/drawing/2017/model3d" xmlns:o="urn:schemas-microsoft-com:office:office" xmlns:oel="http://schemas.microsoft.com/office/2019/extlst" xmlns:r="http://schemas.openxmlformats.org/officeDocument/2006/relationships" xmlns:m="http://schemas.openxmlformats.org/officeDocument/2006/math" xmlns:v="urn:schemas-microsoft-com:vml" xmlns:wp14="http://schemas.microsoft.com/office/word/2010/wordprocessingDrawing" xmlns:wp="http://schemas.openxmlformats.org/drawingml/2006/wordprocessingDrawing" xmlns:w10="urn:schemas-microsoft-com:office:word" xmlns:w="http://schemas.openxmlformats.org/wordprocessingml/2006/main" xmlns:w14="http://schemas.microsoft.com/office/word/2010/wordml" xmlns:w15="http://schemas.microsoft.com/office/word/2012/wordml" xmlns:w16cex="http://schemas.microsoft.com/office/word/2018/wordml/cex" xmlns:w16cid="http://schemas.microsoft.com/office/word/2016/wordml/cid" xmlns:w16="http://schemas.microsoft.com/office/word/2018/wordml" xmlns:w16sdtdh="http://schemas.microsoft.com/office/word/2020/wordml/sdtdatahash" xmlns:w16se="http://schemas.microsoft.com/office/word/2015/wordml/symex" xmlns:wpg="http://schemas.microsoft.com/office/word/2010/wordprocessingGroup" xmlns:wpi="http://schemas.microsoft.com/office/word/2010/wordprocessingInk" xmlns:wne="http://schemas.microsoft.com/office/word/2006/wordml" xmlns:wps="http://schemas.microsoft.com/office/word/2010/wordprocessingShape" mc:Ignorable="w14 w15 w16se w16cid w16 w16cex w16sdtdh wp14">
   <w:abstractNum w:abstractNumId="0" w15:restartNumberingAfterBreak="0">
     <w:nsid w:val="275E6D19"/>
     <w:multiLevelType w:val="hybridMultilevel"/>
@@ -2051,6 +5501,95 @@
     </w:lvl>
   </w:abstractNum>
   <w:abstractNum w:abstractNumId="1" w15:restartNumberingAfterBreak="0">
+    <w:nsid w:val="2E2F7B6C"/>
+    <w:multiLevelType w:val="hybridMultilevel"/>
+    <w:tmpl w:val="DFCACFCA"/>
+    <w:lvl w:ilvl="0" w:tplc="36CE08EE">
+      <w:start w:val="1"/>
+      <w:numFmt w:val="decimal"/>
+      <w:lvlText w:val="(%1)"/>
+      <w:lvlJc w:val="left"/>
+      <w:pPr>
+        <w:ind w:left="1935" w:hanging="360"/>
+      </w:pPr>
+      <w:rPr>
+        <w:rFonts w:hint="default"/>
+      </w:rPr>
+    </w:lvl>
+    <w:lvl w:ilvl="1" w:tplc="04090019" w:tentative="1">
+      <w:start w:val="1"/>
+      <w:numFmt w:val="lowerLetter"/>
+      <w:lvlText w:val="%2."/>
+      <w:lvlJc w:val="left"/>
+      <w:pPr>
+        <w:ind w:left="2655" w:hanging="360"/>
+      </w:pPr>
+    </w:lvl>
+    <w:lvl w:ilvl="2" w:tplc="0409001B" w:tentative="1">
+      <w:start w:val="1"/>
+      <w:numFmt w:val="lowerRoman"/>
+      <w:lvlText w:val="%3."/>
+      <w:lvlJc w:val="right"/>
+      <w:pPr>
+        <w:ind w:left="3375" w:hanging="180"/>
+      </w:pPr>
+    </w:lvl>
+    <w:lvl w:ilvl="3" w:tplc="0409000F" w:tentative="1">
+      <w:start w:val="1"/>
+      <w:numFmt w:val="decimal"/>
+      <w:lvlText w:val="%4."/>
+      <w:lvlJc w:val="left"/>
+      <w:pPr>
+        <w:ind w:left="4095" w:hanging="360"/>
+      </w:pPr>
+    </w:lvl>
+    <w:lvl w:ilvl="4" w:tplc="04090019" w:tentative="1">
+      <w:start w:val="1"/>
+      <w:numFmt w:val="lowerLetter"/>
+      <w:lvlText w:val="%5."/>
+      <w:lvlJc w:val="left"/>
+      <w:pPr>
+        <w:ind w:left="4815" w:hanging="360"/>
+      </w:pPr>
+    </w:lvl>
+    <w:lvl w:ilvl="5" w:tplc="0409001B" w:tentative="1">
+      <w:start w:val="1"/>
+      <w:numFmt w:val="lowerRoman"/>
+      <w:lvlText w:val="%6."/>
+      <w:lvlJc w:val="right"/>
+      <w:pPr>
+        <w:ind w:left="5535" w:hanging="180"/>
+      </w:pPr>
+    </w:lvl>
+    <w:lvl w:ilvl="6" w:tplc="0409000F" w:tentative="1">
+      <w:start w:val="1"/>
+      <w:numFmt w:val="decimal"/>
+      <w:lvlText w:val="%7."/>
+      <w:lvlJc w:val="left"/>
+      <w:pPr>
+        <w:ind w:left="6255" w:hanging="360"/>
+      </w:pPr>
+    </w:lvl>
+    <w:lvl w:ilvl="7" w:tplc="04090019" w:tentative="1">
+      <w:start w:val="1"/>
+      <w:numFmt w:val="lowerLetter"/>
+      <w:lvlText w:val="%8."/>
+      <w:lvlJc w:val="left"/>
+      <w:pPr>
+        <w:ind w:left="6975" w:hanging="360"/>
+      </w:pPr>
+    </w:lvl>
+    <w:lvl w:ilvl="8" w:tplc="0409001B" w:tentative="1">
+      <w:start w:val="1"/>
+      <w:numFmt w:val="lowerRoman"/>
+      <w:lvlText w:val="%9."/>
+      <w:lvlJc w:val="right"/>
+      <w:pPr>
+        <w:ind w:left="7695" w:hanging="180"/>
+      </w:pPr>
+    </w:lvl>
+  </w:abstractNum>
+  <w:abstractNum w:abstractNumId="2" w15:restartNumberingAfterBreak="0">
     <w:nsid w:val="30F55854"/>
     <w:multiLevelType w:val="hybridMultilevel"/>
     <w:tmpl w:val="C2DCF2C0"/>
@@ -2163,7 +5702,7 @@
       </w:rPr>
     </w:lvl>
   </w:abstractNum>
-  <w:abstractNum w:abstractNumId="2" w15:restartNumberingAfterBreak="0">
+  <w:abstractNum w:abstractNumId="3" w15:restartNumberingAfterBreak="0">
     <w:nsid w:val="34364696"/>
     <w:multiLevelType w:val="hybridMultilevel"/>
     <w:tmpl w:val="399435A8"/>
@@ -2252,7 +5791,96 @@
       </w:pPr>
     </w:lvl>
   </w:abstractNum>
-  <w:abstractNum w:abstractNumId="3" w15:restartNumberingAfterBreak="0">
+  <w:abstractNum w:abstractNumId="4" w15:restartNumberingAfterBreak="0">
+    <w:nsid w:val="3B9800D0"/>
+    <w:multiLevelType w:val="hybridMultilevel"/>
+    <w:tmpl w:val="9BBC1548"/>
+    <w:lvl w:ilvl="0" w:tplc="B2CE0734">
+      <w:start w:val="1"/>
+      <w:numFmt w:val="decimal"/>
+      <w:lvlText w:val="(%1)"/>
+      <w:lvlJc w:val="left"/>
+      <w:pPr>
+        <w:ind w:left="1800" w:hanging="360"/>
+      </w:pPr>
+      <w:rPr>
+        <w:rFonts w:hint="default"/>
+      </w:rPr>
+    </w:lvl>
+    <w:lvl w:ilvl="1" w:tplc="04090019" w:tentative="1">
+      <w:start w:val="1"/>
+      <w:numFmt w:val="lowerLetter"/>
+      <w:lvlText w:val="%2."/>
+      <w:lvlJc w:val="left"/>
+      <w:pPr>
+        <w:ind w:left="2520" w:hanging="360"/>
+      </w:pPr>
+    </w:lvl>
+    <w:lvl w:ilvl="2" w:tplc="0409001B" w:tentative="1">
+      <w:start w:val="1"/>
+      <w:numFmt w:val="lowerRoman"/>
+      <w:lvlText w:val="%3."/>
+      <w:lvlJc w:val="right"/>
+      <w:pPr>
+        <w:ind w:left="3240" w:hanging="180"/>
+      </w:pPr>
+    </w:lvl>
+    <w:lvl w:ilvl="3" w:tplc="0409000F" w:tentative="1">
+      <w:start w:val="1"/>
+      <w:numFmt w:val="decimal"/>
+      <w:lvlText w:val="%4."/>
+      <w:lvlJc w:val="left"/>
+      <w:pPr>
+        <w:ind w:left="3960" w:hanging="360"/>
+      </w:pPr>
+    </w:lvl>
+    <w:lvl w:ilvl="4" w:tplc="04090019" w:tentative="1">
+      <w:start w:val="1"/>
+      <w:numFmt w:val="lowerLetter"/>
+      <w:lvlText w:val="%5."/>
+      <w:lvlJc w:val="left"/>
+      <w:pPr>
+        <w:ind w:left="4680" w:hanging="360"/>
+      </w:pPr>
+    </w:lvl>
+    <w:lvl w:ilvl="5" w:tplc="0409001B" w:tentative="1">
+      <w:start w:val="1"/>
+      <w:numFmt w:val="lowerRoman"/>
+      <w:lvlText w:val="%6."/>
+      <w:lvlJc w:val="right"/>
+      <w:pPr>
+        <w:ind w:left="5400" w:hanging="180"/>
+      </w:pPr>
+    </w:lvl>
+    <w:lvl w:ilvl="6" w:tplc="0409000F" w:tentative="1">
+      <w:start w:val="1"/>
+      <w:numFmt w:val="decimal"/>
+      <w:lvlText w:val="%7."/>
+      <w:lvlJc w:val="left"/>
+      <w:pPr>
+        <w:ind w:left="6120" w:hanging="360"/>
+      </w:pPr>
+    </w:lvl>
+    <w:lvl w:ilvl="7" w:tplc="04090019" w:tentative="1">
+      <w:start w:val="1"/>
+      <w:numFmt w:val="lowerLetter"/>
+      <w:lvlText w:val="%8."/>
+      <w:lvlJc w:val="left"/>
+      <w:pPr>
+        <w:ind w:left="6840" w:hanging="360"/>
+      </w:pPr>
+    </w:lvl>
+    <w:lvl w:ilvl="8" w:tplc="0409001B" w:tentative="1">
+      <w:start w:val="1"/>
+      <w:numFmt w:val="lowerRoman"/>
+      <w:lvlText w:val="%9."/>
+      <w:lvlJc w:val="right"/>
+      <w:pPr>
+        <w:ind w:left="7560" w:hanging="180"/>
+      </w:pPr>
+    </w:lvl>
+  </w:abstractNum>
+  <w:abstractNum w:abstractNumId="5" w15:restartNumberingAfterBreak="0">
     <w:nsid w:val="3F58576B"/>
     <w:multiLevelType w:val="hybridMultilevel"/>
     <w:tmpl w:val="3488917E"/>
@@ -2341,7 +5969,7 @@
       </w:pPr>
     </w:lvl>
   </w:abstractNum>
-  <w:abstractNum w:abstractNumId="4" w15:restartNumberingAfterBreak="0">
+  <w:abstractNum w:abstractNumId="6" w15:restartNumberingAfterBreak="0">
     <w:nsid w:val="3F752619"/>
     <w:multiLevelType w:val="hybridMultilevel"/>
     <w:tmpl w:val="72AA883E"/>
@@ -2430,7 +6058,7 @@
       </w:pPr>
     </w:lvl>
   </w:abstractNum>
-  <w:abstractNum w:abstractNumId="5" w15:restartNumberingAfterBreak="0">
+  <w:abstractNum w:abstractNumId="7" w15:restartNumberingAfterBreak="0">
     <w:nsid w:val="448734FE"/>
     <w:multiLevelType w:val="hybridMultilevel"/>
     <w:tmpl w:val="F89C396E"/>
@@ -2519,7 +6147,7 @@
       </w:pPr>
     </w:lvl>
   </w:abstractNum>
-  <w:abstractNum w:abstractNumId="6" w15:restartNumberingAfterBreak="0">
+  <w:abstractNum w:abstractNumId="8" w15:restartNumberingAfterBreak="0">
     <w:nsid w:val="590C78C3"/>
     <w:multiLevelType w:val="hybridMultilevel"/>
     <w:tmpl w:val="22A8DDCC"/>
@@ -2632,7 +6260,7 @@
       </w:rPr>
     </w:lvl>
   </w:abstractNum>
-  <w:abstractNum w:abstractNumId="7" w15:restartNumberingAfterBreak="0">
+  <w:abstractNum w:abstractNumId="9" w15:restartNumberingAfterBreak="0">
     <w:nsid w:val="6DAA5EA0"/>
     <w:multiLevelType w:val="hybridMultilevel"/>
     <w:tmpl w:val="D56E905E"/>
@@ -2721,35 +6349,41 @@
       </w:pPr>
     </w:lvl>
   </w:abstractNum>
-  <w:num w:numId="1">
+  <w:num w:numId="1" w16cid:durableId="1316059152">
+    <w:abstractNumId w:val="9"/>
+  </w:num>
+  <w:num w:numId="2" w16cid:durableId="47151860">
+    <w:abstractNumId w:val="8"/>
+  </w:num>
+  <w:num w:numId="3" w16cid:durableId="1170604673">
+    <w:abstractNumId w:val="2"/>
+  </w:num>
+  <w:num w:numId="4" w16cid:durableId="759759335">
     <w:abstractNumId w:val="7"/>
   </w:num>
-  <w:num w:numId="2">
+  <w:num w:numId="5" w16cid:durableId="1137602385">
+    <w:abstractNumId w:val="3"/>
+  </w:num>
+  <w:num w:numId="6" w16cid:durableId="1210336675">
     <w:abstractNumId w:val="6"/>
   </w:num>
-  <w:num w:numId="3">
+  <w:num w:numId="7" w16cid:durableId="1365792136">
+    <w:abstractNumId w:val="5"/>
+  </w:num>
+  <w:num w:numId="8" w16cid:durableId="1876887011">
+    <w:abstractNumId w:val="0"/>
+  </w:num>
+  <w:num w:numId="9" w16cid:durableId="1405225511">
     <w:abstractNumId w:val="1"/>
   </w:num>
-  <w:num w:numId="4">
-    <w:abstractNumId w:val="5"/>
-  </w:num>
-  <w:num w:numId="5">
-    <w:abstractNumId w:val="2"/>
-  </w:num>
-  <w:num w:numId="6">
+  <w:num w:numId="10" w16cid:durableId="1039629709">
     <w:abstractNumId w:val="4"/>
-  </w:num>
-  <w:num w:numId="7">
-    <w:abstractNumId w:val="3"/>
-  </w:num>
-  <w:num w:numId="8">
-    <w:abstractNumId w:val="0"/>
   </w:num>
 </w:numbering>
 </file>
 
 <file path=word/styles.xml><?xml version="1.0" encoding="utf-8"?>
-<w:styles xmlns:mc="http://schemas.openxmlformats.org/markup-compatibility/2006" xmlns:r="http://schemas.openxmlformats.org/officeDocument/2006/relationships" xmlns:w="http://schemas.openxmlformats.org/wordprocessingml/2006/main" xmlns:w14="http://schemas.microsoft.com/office/word/2010/wordml" xmlns:w15="http://schemas.microsoft.com/office/word/2012/wordml" xmlns:w16cex="http://schemas.microsoft.com/office/word/2018/wordml/cex" xmlns:w16cid="http://schemas.microsoft.com/office/word/2016/wordml/cid" xmlns:w16="http://schemas.microsoft.com/office/word/2018/wordml" xmlns:w16se="http://schemas.microsoft.com/office/word/2015/wordml/symex" mc:Ignorable="w14 w15 w16se w16cid w16 w16cex">
+<w:styles xmlns:mc="http://schemas.openxmlformats.org/markup-compatibility/2006" xmlns:r="http://schemas.openxmlformats.org/officeDocument/2006/relationships" xmlns:w="http://schemas.openxmlformats.org/wordprocessingml/2006/main" xmlns:w14="http://schemas.microsoft.com/office/word/2010/wordml" xmlns:w15="http://schemas.microsoft.com/office/word/2012/wordml" xmlns:w16cex="http://schemas.microsoft.com/office/word/2018/wordml/cex" xmlns:w16cid="http://schemas.microsoft.com/office/word/2016/wordml/cid" xmlns:w16="http://schemas.microsoft.com/office/word/2018/wordml" xmlns:w16sdtdh="http://schemas.microsoft.com/office/word/2020/wordml/sdtdatahash" xmlns:w16se="http://schemas.microsoft.com/office/word/2015/wordml/symex" mc:Ignorable="w14 w15 w16se w16cid w16 w16cex w16sdtdh">
   <w:docDefaults>
     <w:rPrDefault>
       <w:rPr>

</xml_diff>